<commit_message>
Updated sections Purpose, Exec Summary, Project Description, scope and business drivers following Workshop 2 and Email
</commit_message>
<xml_diff>
--- a/docs/project-management/02_Business_Requirements/BRDv0.2-Northwind-Outdoors-03082026.docx
+++ b/docs/project-management/02_Business_Requirements/BRDv0.2-Northwind-Outdoors-03082026.docx
@@ -162,23 +162,7 @@
                 <w:bCs/>
                 <w:lang w:val="en-US"/>
               </w:rPr>
-              <w:t xml:space="preserve">IT Infrastructure </w:t>
-            </w:r>
-            <w:proofErr w:type="spellStart"/>
-            <w:r>
-              <w:rPr>
-                <w:bCs/>
-                <w:lang w:val="en-US"/>
-              </w:rPr>
-              <w:t>Modernisation</w:t>
-            </w:r>
-            <w:proofErr w:type="spellEnd"/>
-            <w:r>
-              <w:rPr>
-                <w:bCs/>
-                <w:lang w:val="en-US"/>
-              </w:rPr>
-              <w:t xml:space="preserve"> Project</w:t>
+              <w:t>IT Infrastructure Modernisation Project</w:t>
             </w:r>
           </w:p>
         </w:tc>
@@ -376,21 +360,7 @@
                 <w:bCs/>
                 <w:lang w:val="en-US"/>
               </w:rPr>
-              <w:t>0.</w:t>
-            </w:r>
-            <w:r>
-              <w:rPr>
-                <w:bCs/>
-                <w:lang w:val="en-US"/>
-              </w:rPr>
-              <w:t>2</w:t>
-            </w:r>
-            <w:r>
-              <w:rPr>
-                <w:bCs/>
-                <w:lang w:val="en-US"/>
-              </w:rPr>
-              <w:t>v</w:t>
+              <w:t>v1.0</w:t>
             </w:r>
           </w:p>
         </w:tc>
@@ -3614,6 +3584,12 @@
                 <w:lang w:val="en-US"/>
               </w:rPr>
             </w:pPr>
+            <w:r>
+              <w:rPr>
+                <w:lang w:val="en-US"/>
+              </w:rPr>
+              <w:t>1.0</w:t>
+            </w:r>
           </w:p>
         </w:tc>
         <w:tc>
@@ -3632,6 +3608,12 @@
                 <w:lang w:val="en-US"/>
               </w:rPr>
             </w:pPr>
+            <w:r>
+              <w:rPr>
+                <w:lang w:val="en-US"/>
+              </w:rPr>
+              <w:t>10.08.2026</w:t>
+            </w:r>
           </w:p>
         </w:tc>
         <w:tc>
@@ -3650,6 +3632,12 @@
                 <w:lang w:val="en-US"/>
               </w:rPr>
             </w:pPr>
+            <w:r>
+              <w:rPr>
+                <w:lang w:val="en-US"/>
+              </w:rPr>
+              <w:t>Jordan Hutchison</w:t>
+            </w:r>
           </w:p>
         </w:tc>
         <w:tc>
@@ -3668,6 +3656,18 @@
                 <w:lang w:val="en-US"/>
               </w:rPr>
             </w:pPr>
+            <w:r>
+              <w:rPr>
+                <w:lang w:val="en-US"/>
+              </w:rPr>
+              <w:t xml:space="preserve">Finalised BRD following </w:t>
+            </w:r>
+            <w:r>
+              <w:rPr>
+                <w:lang w:val="en-US"/>
+              </w:rPr>
+              <w:t>Workshop 2</w:t>
+            </w:r>
           </w:p>
         </w:tc>
       </w:tr>
@@ -3778,75 +3778,51 @@
     </w:p>
     <w:p>
       <w:r>
-        <w:t>This Business Requirements Document (BRD) has been produced by Redstone Consulting following the initial discovery workshops with Northwind Outdoor Ltd. It captures the agreed business objectives, current operational challenges, and the high-level requirements for modernising the company's IT infrastructure.</w:t>
-      </w:r>
-    </w:p>
-    <w:p>
-      <w:r>
-        <w:t>The purpose of this document is to establish a shared understanding between Northwind Outdoor Ltd. and Redstone Consulting of the business outcomes that the proposed solution must achieve. It provides the foundation for subsequent design, implementation, and project planning activities, ensuring that all future technical work remains aligned with the organisation's strategic objectives.</w:t>
-      </w:r>
-    </w:p>
-    <w:p>
-      <w:r>
-        <w:t>During the discovery phase, Redstone Consulting engaged with key business stakeholders to understand the organisation's current operating environment, identify existing pain points, and gather information regarding future growth, operational requirements, security expectations, and business continuity needs. The findings indicate that Northwind Outdoor Ltd. requires a secure, scalable, and centrally managed infrastructure capable of supporting business growth while improving operational efficiency, system resilience, and administrative consistency.</w:t>
-      </w:r>
-    </w:p>
-    <w:p>
-      <w:r>
-        <w:t>This document defines the business requirements only and does not prescribe specific technical solutions or implementation methods. Technical designs, implementation plans, and Statements of Work (SoWs) will be developed in subsequent phases following customer review and approval of this document.</w:t>
-      </w:r>
-    </w:p>
-    <w:p>
-      <w:r>
-        <w:t>The intended audience for this document includes project sponsors, business stakeholders, department managers, technical decision makers, and Redstone Consulting project personnel responsible for the successful planning, design, delivery, and governance of the project.</w:t>
-      </w:r>
-    </w:p>
-    <w:p/>
-    <w:p/>
-    <w:p/>
-    <w:p/>
-    <w:p/>
-    <w:p/>
-    <w:p/>
-    <w:p/>
-    <w:p/>
-    <w:p/>
-    <w:p/>
-    <w:p/>
-    <w:p>
-      <w:pPr>
-        <w:pStyle w:val="Heading2"/>
-      </w:pPr>
-      <w:bookmarkStart w:id="8" w:name="_Toc236778360"/>
+        <w:t>This Business Requirements Document (BRD) has been produced by Redstone Consulting following the discovery and requirements-gathering activities undertaken with Northwind Outdoor Ltd. It establishes the agreed business objectives, current operational challenges, and high-level requirements for the modernisation of Northwind's IT infrastructure.</w:t>
+      </w:r>
+    </w:p>
+    <w:p>
+      <w:r>
+        <w:t>The purpose of this document is to establish a clear and shared understanding of the business outcomes that the proposed infrastructure must achieve. It provides the baseline for subsequent solution design, implementation planning, testing, operational handover, and project governance, ensuring that future technical decisions remain aligned with Northwind Outdoor Ltd.'s business requirements and priorities.</w:t>
+      </w:r>
+    </w:p>
+    <w:p>
+      <w:r>
+        <w:t>During the discovery phase, Redstone Consulting engaged with Northwind stakeholders to understand the organisation's current operating environment, business-critical services, user and departmental requirements, operational processes, security expectations, business continuity objectives, and anticipated future growth. The resulting requirements identify opportunities to improve the standardisation, manageability, security, resilience, recoverability, and operational efficiency of the existing environment.</w:t>
+      </w:r>
+    </w:p>
+    <w:p>
+      <w:r>
+        <w:t>Northwind Outdoor Ltd. requires an infrastructure platform that can support its current business operations while providing a scalable foundation for future growth. The proposed environment is expected to provide centrally managed services, secure access to business information, appropriate monitoring and operational visibility, reliable backup and recovery capabilities, controlled system and software maintenance, and improved support for routine administration and automation. The infrastructure should also enable the IT team to manage and troubleshoot services effectively through documented operational procedures and appropriate administrative capabilities.</w:t>
+      </w:r>
+    </w:p>
+    <w:p>
+      <w:r>
+        <w:t>Business continuity and service recovery are key considerations within the requirements. Northwind has identified a current expectation for recovery of critical services within four hours; however, specific Recovery Time Objectives (RTOs) and Recovery Point Objectives (RPOs) will be assessed and confirmed on a service-by-service basis during the design phase. The design will consider the relationship between backup, recovery procedures, system resilience, documentation, automation, and operational processes when determining whether the agreed recovery objectives can be achieved.</w:t>
+      </w:r>
+    </w:p>
+    <w:p>
+      <w:r>
+        <w:t>The project will also establish a more controlled operational model for areas such as user lifecycle management, asset management, software and system updates, monitoring, capacity management, security, documentation, and operational recovery. Where practical, repetitive administrative activities should be capable of being standardised or automated to reduce manual effort, improve consistency, and minimise operational risk.</w:t>
+      </w:r>
+    </w:p>
+    <w:p>
+      <w:r>
+        <w:t>The project will be delivered through a phased and governed approach. Following approval of this BRD, the requirements will be recorded within a Requirements Traceability Matrix (RTM) and used to inform the subsequent High-Level Design (HLD), Statements of Work, detailed implementation planning, testing, and acceptance activities. High Availability remains a design-phase decision point and will be evaluated against its business benefits, operational requirements, risks, and associated costs before Northwind makes a final decision.</w:t>
+      </w:r>
+    </w:p>
+    <w:p>
+      <w:r>
+        <w:t xml:space="preserve">This document defines business requirements and desired capabilities rather than prescribing specific technologies or implementation methods. Technical solutions will be evaluated and </w:t>
+      </w:r>
       <w:r>
         <w:lastRenderedPageBreak/>
-        <w:t>3. Project Description</w:t>
-      </w:r>
-      <w:bookmarkEnd w:id="8"/>
-    </w:p>
-    <w:p>
-      <w:r>
-        <w:t>Northwind Outdoor Ltd. has engaged Redstone Consulting to assess its existing IT environment and develop a modern, secure, and scalable infrastructure that supports the organisation's current operations and future business growth.</w:t>
-      </w:r>
-    </w:p>
-    <w:p>
-      <w:r>
-        <w:t>During the discovery phase, Redstone Consulting worked with key business stakeholders to understand the organisation's operational processes, existing IT capabilities, business-critical services, security requirements, and strategic objectives. The findings identified several opportunities to improve the reliability, security, manageability, and resilience of the current environment while establishing a platform capable of supporting future expansion.</w:t>
-      </w:r>
-    </w:p>
-    <w:p>
-      <w:r>
-        <w:t>The existing environment has evolved over time to meet immediate business needs and, while it continues to support day-to-day operations, presents several operational challenges. These include increasing administrative overhead, inconsistent management practices, limited standardisation, and concerns regarding business continuity, scalability, and the protection of critical business data. As the organisation continues to grow, these challenges are expected to become more significant unless addressed through a structured programme of infrastructure improvement.</w:t>
-      </w:r>
-    </w:p>
-    <w:p>
-      <w:r>
-        <w:t>The purpose of this project is to define the business requirements necessary to support the implementation of a centrally managed infrastructure that improves operational efficiency, strengthens security, enhances system resilience, and provides a scalable foundation for future business services. The project will follow a phased delivery approach, allowing capabilities to be introduced incrementally while minimising operational risk and disruption to the business.</w:t>
-      </w:r>
-    </w:p>
-    <w:p>
-      <w:r>
-        <w:t>This Business Requirements Document represents the first stage of the engagement and will form the agreed baseline from which subsequent design activities, Statements of Work, implementation plans, and acceptance criteria will be developed.</w:t>
+        <w:t>documented during the subsequent design phases, with the final solution required to demonstrate clear traceability to the approved business requirements.</w:t>
+      </w:r>
+    </w:p>
+    <w:p>
+      <w:r>
+        <w:t>The intended audience for this document includes Northwind Outdoor Ltd. executive sponsors, business stakeholders, department managers, technical decision makers, and Redstone Consulting personnel responsible for the design, delivery, governance, and operational handover of the project.</w:t>
       </w:r>
     </w:p>
     <w:p/>
@@ -3862,226 +3838,6 @@
     <w:p/>
     <w:p/>
     <w:p/>
-    <w:p>
-      <w:pPr>
-        <w:pStyle w:val="Heading2"/>
-      </w:pPr>
-      <w:bookmarkStart w:id="9" w:name="_Toc236778361"/>
-      <w:r>
-        <w:lastRenderedPageBreak/>
-        <w:t>4</w:t>
-      </w:r>
-      <w:r>
-        <w:t>. Project Scope</w:t>
-      </w:r>
-      <w:bookmarkEnd w:id="9"/>
-    </w:p>
-    <w:p>
-      <w:pPr>
-        <w:pStyle w:val="Heading3"/>
-      </w:pPr>
-      <w:bookmarkStart w:id="10" w:name="_Toc236778362"/>
-      <w:r>
-        <w:t>4.1 In Scope</w:t>
-      </w:r>
-      <w:bookmarkEnd w:id="10"/>
-    </w:p>
-    <w:p>
-      <w:r>
-        <w:t>The scope of this engagement includes the assessment, design, and phased implementation of an improved IT infrastructure that supports the current and future operational requirements of Northwind Outdoor Ltd.</w:t>
-      </w:r>
-    </w:p>
-    <w:p>
-      <w:r>
-        <w:t>The project includes, but is not limited to:</w:t>
-      </w:r>
-    </w:p>
-    <w:p>
-      <w:pPr>
-        <w:pStyle w:val="ListParagraph"/>
-        <w:numPr>
-          <w:ilvl w:val="0"/>
-          <w:numId w:val="4"/>
-        </w:numPr>
-      </w:pPr>
-      <w:r>
-        <w:t>Assessment of the existing IT environment and supporting infrastructure.</w:t>
-      </w:r>
-    </w:p>
-    <w:p>
-      <w:pPr>
-        <w:pStyle w:val="ListParagraph"/>
-        <w:numPr>
-          <w:ilvl w:val="0"/>
-          <w:numId w:val="4"/>
-        </w:numPr>
-      </w:pPr>
-      <w:r>
-        <w:t>Definition of business and technical requirements.</w:t>
-      </w:r>
-    </w:p>
-    <w:p>
-      <w:pPr>
-        <w:pStyle w:val="ListParagraph"/>
-        <w:numPr>
-          <w:ilvl w:val="0"/>
-          <w:numId w:val="4"/>
-        </w:numPr>
-      </w:pPr>
-      <w:r>
-        <w:t>Design of a secure, scalable, and centrally managed infrastructure.</w:t>
-      </w:r>
-    </w:p>
-    <w:p>
-      <w:pPr>
-        <w:pStyle w:val="ListParagraph"/>
-        <w:numPr>
-          <w:ilvl w:val="0"/>
-          <w:numId w:val="4"/>
-        </w:numPr>
-      </w:pPr>
-      <w:r>
-        <w:t>Improvement of user identity and access management.</w:t>
-      </w:r>
-    </w:p>
-    <w:p>
-      <w:pPr>
-        <w:pStyle w:val="ListParagraph"/>
-        <w:numPr>
-          <w:ilvl w:val="0"/>
-          <w:numId w:val="4"/>
-        </w:numPr>
-      </w:pPr>
-      <w:r>
-        <w:t>Enhancement of business-critical data storage and sharing capabilities.</w:t>
-      </w:r>
-    </w:p>
-    <w:p>
-      <w:pPr>
-        <w:pStyle w:val="ListParagraph"/>
-        <w:numPr>
-          <w:ilvl w:val="0"/>
-          <w:numId w:val="4"/>
-        </w:numPr>
-      </w:pPr>
-      <w:r>
-        <w:t>Improvements to security, resilience, backup, and business continuity processes.</w:t>
-      </w:r>
-    </w:p>
-    <w:p>
-      <w:pPr>
-        <w:pStyle w:val="ListParagraph"/>
-        <w:numPr>
-          <w:ilvl w:val="0"/>
-          <w:numId w:val="4"/>
-        </w:numPr>
-      </w:pPr>
-      <w:r>
-        <w:t>Production of technical documentation, operational procedures, and implementation guidance.</w:t>
-      </w:r>
-    </w:p>
-    <w:p>
-      <w:pPr>
-        <w:pStyle w:val="ListParagraph"/>
-        <w:numPr>
-          <w:ilvl w:val="0"/>
-          <w:numId w:val="4"/>
-        </w:numPr>
-      </w:pPr>
-      <w:r>
-        <w:t>Knowledge transfer and operational handover to designated customer personnel.</w:t>
-      </w:r>
-    </w:p>
-    <w:p>
-      <w:pPr>
-        <w:pStyle w:val="Heading3"/>
-      </w:pPr>
-      <w:bookmarkStart w:id="11" w:name="_Toc236778363"/>
-      <w:r>
-        <w:t xml:space="preserve">4.2 </w:t>
-      </w:r>
-      <w:r>
-        <w:t>Out of Scope</w:t>
-      </w:r>
-      <w:bookmarkEnd w:id="11"/>
-    </w:p>
-    <w:p>
-      <w:r>
-        <w:t>The following activities are outside the scope of this engagement unless formally agreed through change control or a future Statement of Work:</w:t>
-      </w:r>
-    </w:p>
-    <w:p>
-      <w:pPr>
-        <w:pStyle w:val="ListParagraph"/>
-        <w:numPr>
-          <w:ilvl w:val="0"/>
-          <w:numId w:val="4"/>
-        </w:numPr>
-      </w:pPr>
-      <w:r>
-        <w:t>Replacement of end-user computing devices.</w:t>
-      </w:r>
-    </w:p>
-    <w:p>
-      <w:pPr>
-        <w:pStyle w:val="ListParagraph"/>
-        <w:numPr>
-          <w:ilvl w:val="0"/>
-          <w:numId w:val="4"/>
-        </w:numPr>
-      </w:pPr>
-      <w:r>
-        <w:t>Changes to third-party business applications.</w:t>
-      </w:r>
-    </w:p>
-    <w:p>
-      <w:pPr>
-        <w:pStyle w:val="ListParagraph"/>
-        <w:numPr>
-          <w:ilvl w:val="0"/>
-          <w:numId w:val="4"/>
-        </w:numPr>
-      </w:pPr>
-      <w:r>
-        <w:t>Office productivity software deployment or migration.</w:t>
-      </w:r>
-    </w:p>
-    <w:p>
-      <w:pPr>
-        <w:pStyle w:val="ListParagraph"/>
-        <w:numPr>
-          <w:ilvl w:val="0"/>
-          <w:numId w:val="4"/>
-        </w:numPr>
-      </w:pPr>
-      <w:r>
-        <w:t>Physical office cabling or telecommunications infrastructure.</w:t>
-      </w:r>
-    </w:p>
-    <w:p>
-      <w:pPr>
-        <w:pStyle w:val="ListParagraph"/>
-        <w:numPr>
-          <w:ilvl w:val="0"/>
-          <w:numId w:val="4"/>
-        </w:numPr>
-      </w:pPr>
-      <w:r>
-        <w:t>Development of bespoke software solutions.</w:t>
-      </w:r>
-    </w:p>
-    <w:p>
-      <w:pPr>
-        <w:pStyle w:val="ListParagraph"/>
-        <w:numPr>
-          <w:ilvl w:val="0"/>
-          <w:numId w:val="4"/>
-        </w:numPr>
-      </w:pPr>
-      <w:r>
-        <w:t>Support for systems not identified during the discovery phase.</w:t>
-      </w:r>
-    </w:p>
     <w:p/>
     <w:p/>
     <w:p/>
@@ -4092,555 +3848,76 @@
     <w:p/>
     <w:p/>
     <w:p/>
-    <w:p>
-      <w:pPr>
-        <w:pStyle w:val="Heading2"/>
-      </w:pPr>
-      <w:bookmarkStart w:id="12" w:name="_Toc236778364"/>
-      <w:r>
-        <w:lastRenderedPageBreak/>
-        <w:t>5. Business Drivers</w:t>
-      </w:r>
-      <w:bookmarkEnd w:id="12"/>
-    </w:p>
-    <w:p>
-      <w:pPr>
-        <w:pStyle w:val="Heading3"/>
-        <w:rPr>
-          <w:rFonts w:eastAsiaTheme="minorHAnsi"/>
-        </w:rPr>
-      </w:pPr>
-      <w:bookmarkStart w:id="13" w:name="_Toc236778365"/>
-      <w:r>
-        <w:rPr>
-          <w:rFonts w:eastAsiaTheme="minorHAnsi"/>
-        </w:rPr>
-        <w:t xml:space="preserve">5.1 </w:t>
-      </w:r>
-      <w:r>
-        <w:rPr>
-          <w:rFonts w:eastAsiaTheme="minorHAnsi"/>
-        </w:rPr>
-        <w:t>BD-001 – Improve Operational Efficiency</w:t>
-      </w:r>
-      <w:bookmarkEnd w:id="13"/>
-    </w:p>
-    <w:p>
-      <w:r>
-        <w:t>The existing environment has developed organically over time and requires increasing levels of manual administration. As the organisation grows, inconsistent management practices and operational inefficiencies increase the time required to administer systems and support users. Northwind Outdoor Ltd. requires a more standardised and centrally managed environment to improve operational efficiency, reduce administrative overhead, and provide a consistent experience for both users and IT personnel.</w:t>
-      </w:r>
-    </w:p>
-    <w:p>
-      <w:r>
-        <w:t>Expected Benefit:</w:t>
-      </w:r>
-    </w:p>
-    <w:p>
-      <w:pPr>
-        <w:pStyle w:val="ListParagraph"/>
-        <w:numPr>
-          <w:ilvl w:val="0"/>
-          <w:numId w:val="5"/>
-        </w:numPr>
-      </w:pPr>
-      <w:r>
-        <w:t>Reduced administration effort</w:t>
-      </w:r>
-    </w:p>
-    <w:p>
-      <w:pPr>
-        <w:pStyle w:val="ListParagraph"/>
-        <w:numPr>
-          <w:ilvl w:val="0"/>
-          <w:numId w:val="5"/>
-        </w:numPr>
-      </w:pPr>
-      <w:r>
-        <w:t>Faster onboarding</w:t>
-      </w:r>
-    </w:p>
-    <w:p>
-      <w:pPr>
-        <w:pStyle w:val="ListParagraph"/>
-        <w:numPr>
-          <w:ilvl w:val="0"/>
-          <w:numId w:val="5"/>
-        </w:numPr>
-      </w:pPr>
-      <w:r>
-        <w:t>Consistent management</w:t>
-      </w:r>
-    </w:p>
-    <w:p>
-      <w:pPr>
-        <w:pStyle w:val="ListParagraph"/>
-        <w:numPr>
-          <w:ilvl w:val="0"/>
-          <w:numId w:val="5"/>
-        </w:numPr>
-      </w:pPr>
-      <w:r>
-        <w:t>Improved productivity</w:t>
-      </w:r>
-    </w:p>
-    <w:p>
-      <w:pPr>
-        <w:pStyle w:val="Heading3"/>
-        <w:rPr>
-          <w:rFonts w:eastAsiaTheme="minorHAnsi"/>
-        </w:rPr>
-      </w:pPr>
-      <w:bookmarkStart w:id="14" w:name="_Toc236778366"/>
-      <w:r>
-        <w:rPr>
-          <w:rFonts w:eastAsiaTheme="minorHAnsi"/>
-        </w:rPr>
-        <w:t xml:space="preserve">5.2 </w:t>
-      </w:r>
-      <w:r>
-        <w:rPr>
-          <w:rFonts w:eastAsiaTheme="minorHAnsi"/>
-        </w:rPr>
-        <w:t>BD-002 – Improve Security, Resilience and Business Continuity</w:t>
-      </w:r>
-      <w:bookmarkEnd w:id="14"/>
-    </w:p>
-    <w:p>
-      <w:r>
-        <w:t>Business operations rely upon several critical IT services that support day-to-day activities. Protecting business data, maintaining service availability, and reducing operational risk are essential to the continued success of the organisation. The project seeks to strengthen security controls, improve resilience, and ensure that appropriate measures exist to support business continuity and disaster recovery.</w:t>
-      </w:r>
-    </w:p>
-    <w:p>
-      <w:r>
-        <w:t>Expected Benefit:</w:t>
-      </w:r>
-    </w:p>
-    <w:p>
-      <w:pPr>
-        <w:pStyle w:val="ListParagraph"/>
-        <w:numPr>
-          <w:ilvl w:val="0"/>
-          <w:numId w:val="7"/>
-        </w:numPr>
-      </w:pPr>
-      <w:r>
-        <w:t>Reduced business risk</w:t>
-      </w:r>
-    </w:p>
-    <w:p>
-      <w:pPr>
-        <w:pStyle w:val="ListParagraph"/>
-        <w:numPr>
-          <w:ilvl w:val="0"/>
-          <w:numId w:val="7"/>
-        </w:numPr>
-      </w:pPr>
-      <w:r>
-        <w:t>Improved security</w:t>
-      </w:r>
-    </w:p>
-    <w:p>
-      <w:pPr>
-        <w:pStyle w:val="ListParagraph"/>
-        <w:numPr>
-          <w:ilvl w:val="0"/>
-          <w:numId w:val="7"/>
-        </w:numPr>
-      </w:pPr>
-      <w:r>
-        <w:t>Better protection of customer and business information</w:t>
-      </w:r>
-    </w:p>
-    <w:p>
-      <w:pPr>
-        <w:pStyle w:val="ListParagraph"/>
-        <w:numPr>
-          <w:ilvl w:val="0"/>
-          <w:numId w:val="7"/>
-        </w:numPr>
-      </w:pPr>
-      <w:r>
-        <w:t>Increased resilience</w:t>
-      </w:r>
-    </w:p>
-    <w:p>
-      <w:pPr>
-        <w:pStyle w:val="Heading3"/>
-        <w:rPr>
-          <w:rFonts w:eastAsiaTheme="minorHAnsi"/>
-        </w:rPr>
-      </w:pPr>
-      <w:bookmarkStart w:id="15" w:name="_Toc236778367"/>
-      <w:r>
-        <w:rPr>
-          <w:rFonts w:eastAsiaTheme="minorHAnsi"/>
-        </w:rPr>
-        <w:t xml:space="preserve">5.3 </w:t>
-      </w:r>
-      <w:r>
-        <w:rPr>
-          <w:rFonts w:eastAsiaTheme="minorHAnsi"/>
-        </w:rPr>
-        <w:t>BD-003 – Support Future Growth</w:t>
-      </w:r>
-      <w:bookmarkEnd w:id="15"/>
-    </w:p>
-    <w:p>
-      <w:r>
-        <w:t>Northwind Outdoor Ltd. expects continued organisational growth over the coming years. The existing infrastructure was not designed with this level of expansion in mind and may become increasingly difficult to scale and manage. The project aims to establish a flexible and scalable foundation capable of supporting additional users, services, locations, and future business initiatives without requiring significant redesign.</w:t>
-      </w:r>
-    </w:p>
-    <w:p>
-      <w:r>
-        <w:t>Expected Benefit:</w:t>
-      </w:r>
-    </w:p>
-    <w:p>
-      <w:pPr>
-        <w:pStyle w:val="ListParagraph"/>
-        <w:numPr>
-          <w:ilvl w:val="0"/>
-          <w:numId w:val="8"/>
-        </w:numPr>
-      </w:pPr>
-      <w:r>
-        <w:t>Scalable infrastructure</w:t>
-      </w:r>
-    </w:p>
-    <w:p>
-      <w:pPr>
-        <w:pStyle w:val="ListParagraph"/>
-        <w:numPr>
-          <w:ilvl w:val="0"/>
-          <w:numId w:val="8"/>
-        </w:numPr>
-      </w:pPr>
-      <w:r>
-        <w:t>Easier future projects</w:t>
-      </w:r>
-    </w:p>
-    <w:p>
-      <w:pPr>
-        <w:pStyle w:val="ListParagraph"/>
-        <w:numPr>
-          <w:ilvl w:val="0"/>
-          <w:numId w:val="8"/>
-        </w:numPr>
-      </w:pPr>
-      <w:r>
-        <w:t>Lower long-term cost</w:t>
-      </w:r>
-    </w:p>
-    <w:p>
-      <w:pPr>
-        <w:pStyle w:val="ListParagraph"/>
-        <w:numPr>
-          <w:ilvl w:val="0"/>
-          <w:numId w:val="8"/>
-        </w:numPr>
-      </w:pPr>
-      <w:r>
-        <w:t>Support business expansion</w:t>
-      </w:r>
-    </w:p>
     <w:p/>
     <w:p/>
     <w:p>
       <w:pPr>
         <w:pStyle w:val="Heading2"/>
       </w:pPr>
-      <w:bookmarkStart w:id="16" w:name="_Toc236778368"/>
+      <w:bookmarkStart w:id="8" w:name="_Toc236778360"/>
       <w:r>
         <w:lastRenderedPageBreak/>
-        <w:t>6.</w:t>
-      </w:r>
-      <w:r>
-        <w:t xml:space="preserve"> Curren</w:t>
-      </w:r>
-      <w:r>
-        <w:t>t State Assessment</w:t>
-      </w:r>
-      <w:bookmarkEnd w:id="16"/>
-    </w:p>
-    <w:p>
-      <w:pPr>
-        <w:rPr>
-          <w:i/>
-          <w:iCs/>
-        </w:rPr>
-      </w:pPr>
-      <w:r>
-        <w:rPr>
-          <w:i/>
-          <w:iCs/>
-        </w:rPr>
-        <w:t>Provide details of your current process for addressing the primary issue your project attempts to solve. Feel free to include diagrams, flowcharts, or other visuals to illustrate the current process</w:t>
-      </w:r>
-    </w:p>
-    <w:p>
-      <w:pPr>
-        <w:pStyle w:val="Heading3"/>
-      </w:pPr>
-      <w:bookmarkStart w:id="17" w:name="_Toc236778369"/>
-      <w:r>
-        <w:t>6.1 Current Environment</w:t>
-      </w:r>
-      <w:bookmarkEnd w:id="17"/>
-    </w:p>
-    <w:p>
-      <w:r>
-        <w:t>During the discovery workshops, Redstone Consulting gathered information relating to Northwind Outdoor Ltd.'s current IT environment and supporting infrastructure.</w:t>
-      </w:r>
-    </w:p>
-    <w:p>
-      <w:r>
-        <w:t>Northwind Outdoor Ltd. currently operates from a single primary office location and employs approximately 50 members of staff across Sales, Finance, Human Resources, Operations, Warehouse, Customer Services, Marketing, and Information Technology departments.</w:t>
-      </w:r>
-    </w:p>
-    <w:p>
-      <w:r>
-        <w:t>The organisation's users primarily utilise Microsoft Windows desktop and laptop computers to access business applications, departmental file shares, email services, and internet-based resources. Microsoft 365 is used to provide corporate email, calendaring, and office productivity applications.</w:t>
-      </w:r>
-    </w:p>
-    <w:p>
-      <w:r>
-        <w:t>The existing server infrastructure is hosted on-premises and consists primarily of Microsoft Windows Server systems providing core business services, including Active Directory domain services, user authentication, DNS, DHCP, file sharing, and Group Policy management. Business data is stored centrally and accessed via departmental network shares.</w:t>
-      </w:r>
-    </w:p>
-    <w:p>
-      <w:r>
-        <w:t>The organisation also relies upon several line-of-business applications, including accounting software used by the Finance department and inventory management systems supporting warehouse operations. These applications are considered business critical and are dependent upon the continued availability of the supporting infrastructure.</w:t>
-      </w:r>
-    </w:p>
-    <w:p>
-      <w:r>
-        <w:t>Network services are delivered through an existing switched LAN with centrally managed internet connectivity, providing wired access throughout the office environment. Remote access capabilities are available for authorised users to support hybrid working arrangements.</w:t>
-      </w:r>
-    </w:p>
-    <w:p>
-      <w:r>
-        <w:t>Day-to-day administration of the environment is performed by a small internal IT team responsible for infrastructure management, user administration, endpoint support, software deployment, and routine maintenance activities.</w:t>
-      </w:r>
-    </w:p>
-    <w:p>
-      <w:pPr>
-        <w:pStyle w:val="Heading3"/>
-      </w:pPr>
-      <w:bookmarkStart w:id="18" w:name="_Toc236778370"/>
-      <w:r>
-        <w:t>6.2 Current Processes</w:t>
-      </w:r>
-      <w:bookmarkEnd w:id="18"/>
-    </w:p>
-    <w:p>
-      <w:r>
-        <w:t>The current IT operating model relies upon a combination of manual administrative procedures and established operational practices developed over time.</w:t>
-      </w:r>
-    </w:p>
-    <w:p>
-      <w:r>
-        <w:t>Key operational processes identified during the discovery phase include:</w:t>
-      </w:r>
-    </w:p>
-    <w:p>
-      <w:pPr>
-        <w:pStyle w:val="ListParagraph"/>
-        <w:numPr>
-          <w:ilvl w:val="0"/>
-          <w:numId w:val="9"/>
-        </w:numPr>
-      </w:pPr>
-      <w:r>
-        <w:t>User accounts are created, modified, and disabled manually by the IT team following requests from department managers.</w:t>
-      </w:r>
-    </w:p>
-    <w:p>
-      <w:pPr>
-        <w:pStyle w:val="ListParagraph"/>
-        <w:numPr>
-          <w:ilvl w:val="0"/>
-          <w:numId w:val="9"/>
-        </w:numPr>
-      </w:pPr>
-      <w:r>
-        <w:t>Departmental permissions are assigned individually based upon business requirements and maintained through existing directory services.</w:t>
-      </w:r>
-    </w:p>
-    <w:p>
-      <w:pPr>
-        <w:pStyle w:val="ListParagraph"/>
-        <w:numPr>
-          <w:ilvl w:val="0"/>
-          <w:numId w:val="9"/>
-        </w:numPr>
-      </w:pPr>
-      <w:r>
-        <w:t>Shared departmental data is stored centrally and accessed via network file shares.</w:t>
-      </w:r>
-    </w:p>
-    <w:p>
-      <w:pPr>
-        <w:pStyle w:val="ListParagraph"/>
-        <w:numPr>
-          <w:ilvl w:val="0"/>
-          <w:numId w:val="9"/>
-        </w:numPr>
-      </w:pPr>
-      <w:r>
-        <w:t>Software installation and workstation configuration are managed by the internal IT team.</w:t>
-      </w:r>
-    </w:p>
-    <w:p>
-      <w:pPr>
-        <w:pStyle w:val="ListParagraph"/>
-        <w:numPr>
-          <w:ilvl w:val="0"/>
-          <w:numId w:val="9"/>
-        </w:numPr>
-      </w:pPr>
-      <w:r>
-        <w:t>Routine maintenance activities, including operating system updates, server maintenance, and infrastructure monitoring, are performed during scheduled maintenance windows where possible.</w:t>
-      </w:r>
-    </w:p>
-    <w:p>
-      <w:pPr>
-        <w:pStyle w:val="ListParagraph"/>
-        <w:numPr>
-          <w:ilvl w:val="0"/>
-          <w:numId w:val="9"/>
-        </w:numPr>
-      </w:pPr>
+        <w:t>3. Project Description</w:t>
+      </w:r>
+      <w:bookmarkEnd w:id="8"/>
+    </w:p>
+    <w:p>
+      <w:r>
+        <w:t>Northwind Outdoor Ltd. has engaged Redstone Consulting to assess, design, and support the modernisation of its existing IT infrastructure to provide a secure, reliable, scalable, and centrally managed platform capable of supporting the organisation's current operations and anticipated future growth.</w:t>
+      </w:r>
+    </w:p>
+    <w:p>
+      <w:r>
+        <w:t xml:space="preserve">The discovery and requirements-gathering activities identified </w:t>
+      </w:r>
+      <w:proofErr w:type="gramStart"/>
+      <w:r>
+        <w:t>a number of</w:t>
+      </w:r>
+      <w:proofErr w:type="gramEnd"/>
+      <w:r>
+        <w:t xml:space="preserve"> opportunities to improve the consistency, manageability, security, resilience, and operational maturity of the existing environment. As Northwind continues to grow, the organisation requires an infrastructure platform that reduces reliance on manual administration, improves the consistency of operational processes, protects business-critical information, and provides the IT team with appropriate capabilities to monitor, maintain, troubleshoot, and recover supported services.</w:t>
+      </w:r>
+    </w:p>
+    <w:p>
+      <w:r>
+        <w:t>The project will address business requirements relating to user and access management, business data and file services, infrastructure security, monitoring and operational visibility, backup and recovery, asset management, software and system maintenance, remote administration, business continuity, documentation, and future scalability. The modernised environment should also support controlled automation of repetitive administrative activities where practical, helping to reduce administrative overhead and improve operational consistency.</w:t>
+      </w:r>
+    </w:p>
+    <w:p>
+      <w:proofErr w:type="gramStart"/>
+      <w:r>
+        <w:t>Particular emphasis</w:t>
+      </w:r>
+      <w:proofErr w:type="gramEnd"/>
+      <w:r>
+        <w:t xml:space="preserve"> will be placed on improving the organisation's ability to maintain and recover business-critical services. Northwind has identified a current expectation that critical services should be recoverable within four hours; however, specific recovery objectives will be assessed and confirmed for individual services during the design phase. The resulting design will consider appropriate backup, recovery, resilience, monitoring, documentation, and operational procedures required to support the agreed recovery objectives.</w:t>
+      </w:r>
+    </w:p>
+    <w:p>
+      <w:r>
+        <w:t>The project will also establish a more controlled approach to infrastructure operations. This includes formalising processes for user joiners, movers and leavers, IT asset management, software and system updates, pre-production testing, operational monitoring, capacity and performance management, scheduled administrative activities, troubleshooting, and technical recovery. Appropriate operational documentation, including Standard Operating Procedures (SOPs), technical runbooks, recovery procedures, and relevant user documentation, will form part of the project deliverables.</w:t>
+      </w:r>
+    </w:p>
+    <w:p>
+      <w:r>
+        <w:t>The solution must maintain compatibility with Northwind's existing business services and minimise disruption to normal business operations throughout implementation. Migration and deployment activities will therefore be planned and validated through controlled testing and agreed implementation approaches before changes are introduced into the production environment. Appropriate customer subject matter experts will participate in testing and User Acceptance Testing (UAT) to confirm that delivered capabilities meet the agreed business requirements.</w:t>
+      </w:r>
+    </w:p>
+    <w:p>
+      <w:r>
+        <w:t>The project will be delivered through a phased and governed approach. Following approval of this Business Requirements Document, the requirements will be prioritised and traced through the Requirements Traceability Matrix (RTM). Related requirements will subsequently be grouped into Statements of Work (SoWs), with detailed technical designs, implementation plans, testing activities, and acceptance criteria developed for each agreed delivery phase.</w:t>
+      </w:r>
+    </w:p>
+    <w:p>
       <w:r>
         <w:lastRenderedPageBreak/>
-        <w:t>Backup procedures are performed for business-critical systems; however, the current strategy and recovery procedures require further review as part of the design phase.</w:t>
-      </w:r>
-    </w:p>
-    <w:p>
-      <w:pPr>
-        <w:pStyle w:val="ListParagraph"/>
-        <w:numPr>
-          <w:ilvl w:val="0"/>
-          <w:numId w:val="9"/>
-        </w:numPr>
-      </w:pPr>
-      <w:r>
-        <w:t>Technical documentation exists for portions of the environment but is not comprehensive across all infrastructure components.</w:t>
-      </w:r>
-    </w:p>
-    <w:p>
-      <w:pPr>
-        <w:pStyle w:val="ListParagraph"/>
-        <w:numPr>
-          <w:ilvl w:val="0"/>
-          <w:numId w:val="9"/>
-        </w:numPr>
-      </w:pPr>
-      <w:r>
-        <w:t>Infrastructure changes are coordinated by the internal IT team using informal change management procedures appropriate to the current size of the organisation.</w:t>
-      </w:r>
-    </w:p>
-    <w:p>
-      <w:pPr>
-        <w:pStyle w:val="Heading3"/>
-      </w:pPr>
-      <w:bookmarkStart w:id="19" w:name="_Toc236778371"/>
-      <w:r>
-        <w:t>6.3 Current Challenges</w:t>
-      </w:r>
-      <w:bookmarkEnd w:id="19"/>
-    </w:p>
-    <w:p>
-      <w:r>
-        <w:t>Although the current environment continues to support day-to-day business operations, the discovery workshops identified several operational challenges that may affect the organisation's ability to support future growth and evolving business requirements.</w:t>
-      </w:r>
-    </w:p>
-    <w:p>
-      <w:r>
-        <w:t>The principal challenges identified include:</w:t>
-      </w:r>
-    </w:p>
-    <w:p>
-      <w:pPr>
-        <w:pStyle w:val="ListParagraph"/>
-        <w:numPr>
-          <w:ilvl w:val="0"/>
-          <w:numId w:val="10"/>
-        </w:numPr>
-      </w:pPr>
-      <w:r>
-        <w:t>Infrastructure has evolved organically over several years, resulting in inconsistent standards and administrative practices.</w:t>
-      </w:r>
-    </w:p>
-    <w:p>
-      <w:pPr>
-        <w:pStyle w:val="ListParagraph"/>
-        <w:numPr>
-          <w:ilvl w:val="0"/>
-          <w:numId w:val="10"/>
-        </w:numPr>
-      </w:pPr>
-      <w:r>
-        <w:t>Increasing administrative effort is required to manage users, permissions, and infrastructure as the organisation continues to grow.</w:t>
-      </w:r>
-    </w:p>
-    <w:p>
-      <w:pPr>
-        <w:pStyle w:val="ListParagraph"/>
-        <w:numPr>
-          <w:ilvl w:val="0"/>
-          <w:numId w:val="10"/>
-        </w:numPr>
-      </w:pPr>
-      <w:r>
-        <w:t>Existing infrastructure provides limited standardisation, making future expansion and ongoing support more complex.</w:t>
-      </w:r>
-    </w:p>
-    <w:p>
-      <w:pPr>
-        <w:pStyle w:val="ListParagraph"/>
-        <w:numPr>
-          <w:ilvl w:val="0"/>
-          <w:numId w:val="10"/>
-        </w:numPr>
-      </w:pPr>
-      <w:r>
-        <w:t>Business-critical services are highly dependent upon a small number of key systems, increasing operational risk in the event of service disruption.</w:t>
-      </w:r>
-    </w:p>
-    <w:p>
-      <w:pPr>
-        <w:pStyle w:val="ListParagraph"/>
-        <w:numPr>
-          <w:ilvl w:val="0"/>
-          <w:numId w:val="10"/>
-        </w:numPr>
-      </w:pPr>
-      <w:r>
-        <w:t>Existing documentation does not fully reflect the current environment, increasing reliance on internal knowledge for support and troubleshooting.</w:t>
-      </w:r>
-    </w:p>
-    <w:p>
-      <w:pPr>
-        <w:pStyle w:val="ListParagraph"/>
-        <w:numPr>
-          <w:ilvl w:val="0"/>
-          <w:numId w:val="10"/>
-        </w:numPr>
-      </w:pPr>
-      <w:r>
-        <w:t>Opportunities exist to improve infrastructure resilience, security controls, backup processes, and disaster recovery planning.</w:t>
-      </w:r>
-    </w:p>
-    <w:p>
-      <w:pPr>
-        <w:pStyle w:val="ListParagraph"/>
-        <w:numPr>
-          <w:ilvl w:val="0"/>
-          <w:numId w:val="10"/>
-        </w:numPr>
-      </w:pPr>
-      <w:r>
-        <w:t>Future business growth is expected to place additional demands upon the existing infrastructure, requiring a more scalable and centrally managed operating model.</w:t>
+        <w:t>High Availability remains a design-phase decision point. Redstone Consulting will evaluate appropriate availability options, including their expected business benefits, operational implications, risks, and costs, before Northwind makes a final decision regarding the level of availability required for individual services.</w:t>
+      </w:r>
+    </w:p>
+    <w:p>
+      <w:r>
+        <w:t>This Business Requirements Document establishes the agreed business requirements and desired capabilities for the project. It intentionally does not prescribe specific technologies, products, architectures, or implementation methods. These decisions will be evaluated during the subsequent design phases, with all proposed technical solutions required to demonstrate clear traceability to the approved business requirements.</w:t>
       </w:r>
     </w:p>
     <w:p/>
@@ -4653,57 +3930,6 @@
     <w:p/>
     <w:p/>
     <w:p/>
-    <w:p>
-      <w:pPr>
-        <w:pStyle w:val="Heading2"/>
-      </w:pPr>
-      <w:bookmarkStart w:id="20" w:name="_Toc236778372"/>
-      <w:r>
-        <w:lastRenderedPageBreak/>
-        <w:t>7. Proposed Process</w:t>
-      </w:r>
-      <w:bookmarkEnd w:id="20"/>
-    </w:p>
-    <w:p>
-      <w:pPr>
-        <w:pStyle w:val="Heading3"/>
-      </w:pPr>
-      <w:bookmarkStart w:id="21" w:name="_Toc236778373"/>
-      <w:r>
-        <w:t>7.1 Delivery Approach</w:t>
-      </w:r>
-      <w:bookmarkEnd w:id="21"/>
-    </w:p>
-    <w:p>
-      <w:r>
-        <w:t>Redstone Consulting proposes to deliver this engagement using a structured, iterative delivery methodology that enables Northwind Outdoor Ltd. to realise business value incrementally while maintaining appropriate project governance and minimising operational risk.</w:t>
-      </w:r>
-    </w:p>
-    <w:p>
-      <w:r>
-        <w:t>Following approval of this Business Requirements Document (BRD), the approved business requirements will be prioritised according to business value, operational dependencies, and implementation complexity. Related requirements will be grouped into discrete Statements of Work (SoWs), with each Statement of Work delivering one or more complete business capabilities.</w:t>
-      </w:r>
-    </w:p>
-    <w:p>
-      <w:r>
-        <w:t>Each Statement of Work will be delivered through a series of planned project sprints. During each sprint, Redstone Consulting will undertake solution design, implementation, testing, documentation, and internal quality assurance activities before presenting the completed deliverables for customer review and acceptance.</w:t>
-      </w:r>
-    </w:p>
-    <w:p>
-      <w:r>
-        <w:t>Implementation activities will initially be performed within an isolated pre-production environment to validate the proposed solution, verify functionality, produce supporting documentation, and reduce implementation risk prior to deployment into the live production environment.</w:t>
-      </w:r>
-    </w:p>
-    <w:p>
-      <w:r>
-        <w:t>Business requirements identified as Must Have priorities will be addressed within the initial Statements of Work, establishing the core infrastructure and foundational services upon which subsequent project phases will build. Lower-priority requirements will be scheduled into future Statements of Work following successful completion and acceptance of the foundational capabilities.</w:t>
-      </w:r>
-    </w:p>
-    <w:p>
-      <w:r>
-        <w:t>Each Statement of Work will conclude with formal customer review and acceptance before the next phase of delivery commences. This iterative approach ensures that progress is measurable, business priorities remain aligned throughout the engagement, and opportunities for feedback can be incorporated into future project activities through the agreed governance and change management processes.</w:t>
-      </w:r>
-    </w:p>
     <w:p/>
     <w:p/>
     <w:p/>
@@ -4712,6 +3938,1271 @@
     <w:p/>
     <w:p/>
     <w:p/>
+    <w:p/>
+    <w:p/>
+    <w:p/>
+    <w:p>
+      <w:pPr>
+        <w:pStyle w:val="Heading2"/>
+      </w:pPr>
+      <w:bookmarkStart w:id="9" w:name="_Toc236778361"/>
+      <w:r>
+        <w:lastRenderedPageBreak/>
+        <w:t>4</w:t>
+      </w:r>
+      <w:r>
+        <w:t>. Project Scope</w:t>
+      </w:r>
+      <w:bookmarkEnd w:id="9"/>
+    </w:p>
+    <w:p>
+      <w:pPr>
+        <w:pStyle w:val="Heading3"/>
+      </w:pPr>
+      <w:bookmarkStart w:id="10" w:name="_Toc236778362"/>
+      <w:r>
+        <w:t>4.1 In Scope</w:t>
+      </w:r>
+      <w:bookmarkEnd w:id="10"/>
+    </w:p>
+    <w:p>
+      <w:r>
+        <w:t>The scope of this engagement includes the assessment, design, and phased implementation of an improved IT infrastructure and associated operational processes that support the current and future business requirements of Northwind Outdoor Ltd.</w:t>
+      </w:r>
+    </w:p>
+    <w:p>
+      <w:r>
+        <w:t>The project includes, but is not limited to:</w:t>
+      </w:r>
+    </w:p>
+    <w:p>
+      <w:pPr>
+        <w:numPr>
+          <w:ilvl w:val="0"/>
+          <w:numId w:val="16"/>
+        </w:numPr>
+        <w:spacing w:after="0"/>
+      </w:pPr>
+      <w:r>
+        <w:t>Assessment and documentation of the existing IT environment, infrastructure, business services, and operational processes.</w:t>
+      </w:r>
+    </w:p>
+    <w:p>
+      <w:pPr>
+        <w:numPr>
+          <w:ilvl w:val="0"/>
+          <w:numId w:val="16"/>
+        </w:numPr>
+        <w:spacing w:after="0"/>
+      </w:pPr>
+      <w:r>
+        <w:t>Definition, prioritisation, and traceability of agreed business and technical requirements.</w:t>
+      </w:r>
+    </w:p>
+    <w:p>
+      <w:pPr>
+        <w:numPr>
+          <w:ilvl w:val="0"/>
+          <w:numId w:val="16"/>
+        </w:numPr>
+        <w:spacing w:after="0"/>
+      </w:pPr>
+      <w:r>
+        <w:t>Design and phased implementation of a secure, reliable, scalable, and centrally managed infrastructure.</w:t>
+      </w:r>
+    </w:p>
+    <w:p>
+      <w:pPr>
+        <w:numPr>
+          <w:ilvl w:val="0"/>
+          <w:numId w:val="16"/>
+        </w:numPr>
+        <w:spacing w:after="0"/>
+      </w:pPr>
+      <w:r>
+        <w:t>Improvement of user identity, access management, and joiner, mover, and leaver processes.</w:t>
+      </w:r>
+    </w:p>
+    <w:p>
+      <w:pPr>
+        <w:numPr>
+          <w:ilvl w:val="0"/>
+          <w:numId w:val="16"/>
+        </w:numPr>
+        <w:spacing w:after="0"/>
+      </w:pPr>
+      <w:r>
+        <w:t>Implementation of appropriate role-based access controls and protection of business information.</w:t>
+      </w:r>
+    </w:p>
+    <w:p>
+      <w:pPr>
+        <w:numPr>
+          <w:ilvl w:val="0"/>
+          <w:numId w:val="16"/>
+        </w:numPr>
+        <w:spacing w:after="0"/>
+      </w:pPr>
+      <w:r>
+        <w:t>Improvement of centralised business data storage, file sharing, data organisation, and departmental access controls.</w:t>
+      </w:r>
+    </w:p>
+    <w:p>
+      <w:pPr>
+        <w:numPr>
+          <w:ilvl w:val="0"/>
+          <w:numId w:val="16"/>
+        </w:numPr>
+        <w:spacing w:after="0"/>
+      </w:pPr>
+      <w:r>
+        <w:t>Improvement of infrastructure and host-level security controls.</w:t>
+      </w:r>
+    </w:p>
+    <w:p>
+      <w:pPr>
+        <w:numPr>
+          <w:ilvl w:val="0"/>
+          <w:numId w:val="16"/>
+        </w:numPr>
+        <w:spacing w:after="0"/>
+      </w:pPr>
+      <w:r>
+        <w:t>Implementation of appropriate monitoring, alerting, logging, operational visibility, and capacity/performance management capabilities.</w:t>
+      </w:r>
+    </w:p>
+    <w:p>
+      <w:pPr>
+        <w:numPr>
+          <w:ilvl w:val="0"/>
+          <w:numId w:val="16"/>
+        </w:numPr>
+        <w:spacing w:after="0"/>
+      </w:pPr>
+      <w:r>
+        <w:t>Improvement of backup, recovery, and business continuity capabilities for business-critical systems and data.</w:t>
+      </w:r>
+    </w:p>
+    <w:p>
+      <w:pPr>
+        <w:numPr>
+          <w:ilvl w:val="0"/>
+          <w:numId w:val="16"/>
+        </w:numPr>
+        <w:spacing w:after="0"/>
+      </w:pPr>
+      <w:r>
+        <w:t>Development of controlled processes for software and system updates, including pre-production or sandbox testing where appropriate.</w:t>
+      </w:r>
+    </w:p>
+    <w:p>
+      <w:pPr>
+        <w:numPr>
+          <w:ilvl w:val="0"/>
+          <w:numId w:val="16"/>
+        </w:numPr>
+        <w:spacing w:after="0"/>
+      </w:pPr>
+      <w:r>
+        <w:t>Introduction or improvement of IT asset management and associated operational processes.</w:t>
+      </w:r>
+    </w:p>
+    <w:p>
+      <w:pPr>
+        <w:numPr>
+          <w:ilvl w:val="0"/>
+          <w:numId w:val="16"/>
+        </w:numPr>
+        <w:spacing w:after="0"/>
+      </w:pPr>
+      <w:r>
+        <w:t>Identification and implementation of appropriate opportunities for administrative automation and scheduled operational activities.</w:t>
+      </w:r>
+    </w:p>
+    <w:p>
+      <w:pPr>
+        <w:numPr>
+          <w:ilvl w:val="0"/>
+          <w:numId w:val="16"/>
+        </w:numPr>
+        <w:spacing w:after="0"/>
+      </w:pPr>
+      <w:r>
+        <w:t>Provision of secure remote administration and appropriate secure remote access to business services.</w:t>
+      </w:r>
+    </w:p>
+    <w:p>
+      <w:pPr>
+        <w:numPr>
+          <w:ilvl w:val="0"/>
+          <w:numId w:val="16"/>
+        </w:numPr>
+        <w:spacing w:after="0"/>
+      </w:pPr>
+      <w:r>
+        <w:t>Support for the controlled migration and deployment of infrastructure and business services while minimising disruption to normal business operations.</w:t>
+      </w:r>
+    </w:p>
+    <w:p>
+      <w:pPr>
+        <w:numPr>
+          <w:ilvl w:val="0"/>
+          <w:numId w:val="16"/>
+        </w:numPr>
+        <w:spacing w:after="0"/>
+      </w:pPr>
+      <w:r>
+        <w:t>Testing and validation of proposed changes within controlled environments prior to production deployment where appropriate.</w:t>
+      </w:r>
+    </w:p>
+    <w:p>
+      <w:pPr>
+        <w:numPr>
+          <w:ilvl w:val="0"/>
+          <w:numId w:val="16"/>
+        </w:numPr>
+        <w:spacing w:after="0"/>
+      </w:pPr>
+      <w:r>
+        <w:t>Customer User Acceptance Testing (UAT), including participation by nominated Northwind subject matter experts.</w:t>
+      </w:r>
+    </w:p>
+    <w:p>
+      <w:pPr>
+        <w:numPr>
+          <w:ilvl w:val="0"/>
+          <w:numId w:val="16"/>
+        </w:numPr>
+        <w:spacing w:after="0"/>
+      </w:pPr>
+      <w:r>
+        <w:t>Evaluation of availability and resilience options, including High Availability where appropriate, with final implementation dependent upon the outcome of the design and associated business and cost considerations.</w:t>
+      </w:r>
+    </w:p>
+    <w:p>
+      <w:pPr>
+        <w:numPr>
+          <w:ilvl w:val="0"/>
+          <w:numId w:val="16"/>
+        </w:numPr>
+        <w:spacing w:after="0"/>
+      </w:pPr>
+      <w:r>
+        <w:t>Production of technical and operational documentation, including Standard Operating Procedures (SOPs), technical runbooks, recovery procedures, implementation documentation, and relevant user documentation.</w:t>
+      </w:r>
+    </w:p>
+    <w:p>
+      <w:pPr>
+        <w:numPr>
+          <w:ilvl w:val="0"/>
+          <w:numId w:val="16"/>
+        </w:numPr>
+        <w:spacing w:after="0"/>
+      </w:pPr>
+      <w:r>
+        <w:t>Knowledge transfer, operational training, and handover to designated Northwind personnel.</w:t>
+      </w:r>
+    </w:p>
+    <w:p>
+      <w:pPr>
+        <w:numPr>
+          <w:ilvl w:val="0"/>
+          <w:numId w:val="16"/>
+        </w:numPr>
+        <w:spacing w:after="0"/>
+      </w:pPr>
+      <w:r>
+        <w:lastRenderedPageBreak/>
+        <w:t>Development of appropriate operational and management reporting to provide visibility of infrastructure health, capacity, performance, security, and service status.</w:t>
+      </w:r>
+    </w:p>
+    <w:p>
+      <w:pPr>
+        <w:numPr>
+          <w:ilvl w:val="0"/>
+          <w:numId w:val="16"/>
+        </w:numPr>
+        <w:spacing w:after="0"/>
+      </w:pPr>
+      <w:r>
+        <w:t>Establishment of a scalable infrastructure foundation capable of supporting Northwind's anticipated future growth and future Statements of Work.</w:t>
+      </w:r>
+    </w:p>
+    <w:p/>
+    <w:p>
+      <w:pPr>
+        <w:pStyle w:val="Heading3"/>
+      </w:pPr>
+      <w:bookmarkStart w:id="11" w:name="_Toc236778363"/>
+      <w:r>
+        <w:t xml:space="preserve">4.2 </w:t>
+      </w:r>
+      <w:r>
+        <w:t>Out of Scope</w:t>
+      </w:r>
+      <w:bookmarkEnd w:id="11"/>
+    </w:p>
+    <w:p>
+      <w:r>
+        <w:t>The following activities are outside the scope of this engagement unless formally agreed through change control or included within a future Statement of Work:</w:t>
+      </w:r>
+    </w:p>
+    <w:p>
+      <w:pPr>
+        <w:numPr>
+          <w:ilvl w:val="0"/>
+          <w:numId w:val="17"/>
+        </w:numPr>
+        <w:spacing w:after="0"/>
+      </w:pPr>
+      <w:r>
+        <w:t>Replacement or refresh of end-user computing hardware, including desktop and laptop devices.</w:t>
+      </w:r>
+    </w:p>
+    <w:p>
+      <w:pPr>
+        <w:numPr>
+          <w:ilvl w:val="0"/>
+          <w:numId w:val="17"/>
+        </w:numPr>
+        <w:spacing w:after="0"/>
+      </w:pPr>
+      <w:r>
+        <w:t>Replacement, redevelopment, or major modification of third-party line-of-business applications.</w:t>
+      </w:r>
+    </w:p>
+    <w:p>
+      <w:pPr>
+        <w:numPr>
+          <w:ilvl w:val="0"/>
+          <w:numId w:val="17"/>
+        </w:numPr>
+        <w:spacing w:after="0"/>
+      </w:pPr>
+      <w:r>
+        <w:t>Development of bespoke business software or custom applications.</w:t>
+      </w:r>
+    </w:p>
+    <w:p>
+      <w:pPr>
+        <w:numPr>
+          <w:ilvl w:val="0"/>
+          <w:numId w:val="17"/>
+        </w:numPr>
+        <w:spacing w:after="0"/>
+      </w:pPr>
+      <w:r>
+        <w:t>Replacement or migration of Microsoft 365 services unless specifically required to support an approved infrastructure capability.</w:t>
+      </w:r>
+    </w:p>
+    <w:p>
+      <w:pPr>
+        <w:numPr>
+          <w:ilvl w:val="0"/>
+          <w:numId w:val="17"/>
+        </w:numPr>
+        <w:spacing w:after="0"/>
+      </w:pPr>
+      <w:r>
+        <w:t>Replacement of existing business applications solely for the purpose of infrastructure modernisation.</w:t>
+      </w:r>
+    </w:p>
+    <w:p>
+      <w:pPr>
+        <w:numPr>
+          <w:ilvl w:val="0"/>
+          <w:numId w:val="17"/>
+        </w:numPr>
+        <w:spacing w:after="0"/>
+      </w:pPr>
+      <w:r>
+        <w:t>Physical office cabling, structured cabling, telecommunications infrastructure, or building infrastructure changes.</w:t>
+      </w:r>
+    </w:p>
+    <w:p>
+      <w:pPr>
+        <w:numPr>
+          <w:ilvl w:val="0"/>
+          <w:numId w:val="17"/>
+        </w:numPr>
+        <w:spacing w:after="0"/>
+      </w:pPr>
+      <w:r>
+        <w:t>Major redesign or replacement of network infrastructure unless specifically required to deliver an approved business requirement.</w:t>
+      </w:r>
+    </w:p>
+    <w:p>
+      <w:pPr>
+        <w:numPr>
+          <w:ilvl w:val="0"/>
+          <w:numId w:val="17"/>
+        </w:numPr>
+        <w:spacing w:after="0"/>
+      </w:pPr>
+      <w:r>
+        <w:t>Changes to business processes that are unrelated to the IT infrastructure modernisation programme.</w:t>
+      </w:r>
+    </w:p>
+    <w:p>
+      <w:pPr>
+        <w:numPr>
+          <w:ilvl w:val="0"/>
+          <w:numId w:val="17"/>
+        </w:numPr>
+        <w:spacing w:after="0"/>
+      </w:pPr>
+      <w:r>
+        <w:t>Migration of data or services not identified as part of the agreed project scope.</w:t>
+      </w:r>
+    </w:p>
+    <w:p>
+      <w:pPr>
+        <w:numPr>
+          <w:ilvl w:val="0"/>
+          <w:numId w:val="17"/>
+        </w:numPr>
+        <w:spacing w:after="0"/>
+      </w:pPr>
+      <w:r>
+        <w:t>Support for legacy or third-party systems that are not identified during discovery or subsequently agreed through change control.</w:t>
+      </w:r>
+    </w:p>
+    <w:p>
+      <w:pPr>
+        <w:numPr>
+          <w:ilvl w:val="0"/>
+          <w:numId w:val="17"/>
+        </w:numPr>
+        <w:spacing w:after="0"/>
+      </w:pPr>
+      <w:r>
+        <w:t>Ongoing managed IT support or service desk operations following project handover unless separately agreed.</w:t>
+      </w:r>
+    </w:p>
+    <w:p>
+      <w:pPr>
+        <w:numPr>
+          <w:ilvl w:val="0"/>
+          <w:numId w:val="17"/>
+        </w:numPr>
+        <w:spacing w:after="0"/>
+      </w:pPr>
+      <w:r>
+        <w:t>Procurement or replacement of hardware, software licences, or third-party services unless explicitly included within an approved Statement of Work.</w:t>
+      </w:r>
+    </w:p>
+    <w:p>
+      <w:pPr>
+        <w:numPr>
+          <w:ilvl w:val="0"/>
+          <w:numId w:val="17"/>
+        </w:numPr>
+        <w:spacing w:after="0"/>
+      </w:pPr>
+      <w:r>
+        <w:t>Implementation of High Availability capabilities where Northwind does not approve the associated business case, cost, or operational requirements.</w:t>
+      </w:r>
+    </w:p>
+    <w:p>
+      <w:pPr>
+        <w:numPr>
+          <w:ilvl w:val="0"/>
+          <w:numId w:val="17"/>
+        </w:numPr>
+        <w:spacing w:after="0"/>
+      </w:pPr>
+      <w:r>
+        <w:t>Future infrastructure capabilities identified during the project but not prioritised for the current delivery scope.</w:t>
+      </w:r>
+    </w:p>
+    <w:p/>
+    <w:p/>
+    <w:p/>
+    <w:p/>
+    <w:p/>
+    <w:p/>
+    <w:p>
+      <w:pPr>
+        <w:pStyle w:val="Heading2"/>
+      </w:pPr>
+      <w:bookmarkStart w:id="12" w:name="_Toc236778364"/>
+      <w:r>
+        <w:lastRenderedPageBreak/>
+        <w:t>5. Business Drivers</w:t>
+      </w:r>
+      <w:bookmarkEnd w:id="12"/>
+    </w:p>
+    <w:p>
+      <w:pPr>
+        <w:pStyle w:val="Heading3"/>
+      </w:pPr>
+      <w:r>
+        <w:t>5.1 BD-001 – Improve Operational Efficiency and Management</w:t>
+      </w:r>
+    </w:p>
+    <w:p>
+      <w:r>
+        <w:t xml:space="preserve">Northwind Outdoor Ltd. requires an IT environment that can be managed consistently and efficiently as the organisation grows. The current environment relies on </w:t>
+      </w:r>
+      <w:proofErr w:type="gramStart"/>
+      <w:r>
+        <w:t>a number of</w:t>
+      </w:r>
+      <w:proofErr w:type="gramEnd"/>
+      <w:r>
+        <w:t xml:space="preserve"> manual administrative processes and practices that have developed over time, increasing administrative effort and creating opportunities for inconsistency.</w:t>
+      </w:r>
+    </w:p>
+    <w:p>
+      <w:r>
+        <w:t>The project will establish a more standardised and centrally managed operating model that improves the efficiency of routine IT administration and provides greater operational visibility. This includes improving processes for user lifecycle management, IT asset management, software and system maintenance, monitoring, documentation, scheduled administrative activities, and the controlled automation of repetitive tasks where practical.</w:t>
+      </w:r>
+    </w:p>
+    <w:p>
+      <w:r>
+        <w:t>The modernised environment should also provide the IT team with appropriate capabilities to administer, monitor, troubleshoot, and maintain supported services effectively, including where secure remote administration is required.</w:t>
+      </w:r>
+    </w:p>
+    <w:p>
+      <w:r>
+        <w:rPr>
+          <w:b/>
+          <w:bCs/>
+        </w:rPr>
+        <w:t>Expected Benefits:</w:t>
+      </w:r>
+    </w:p>
+    <w:p>
+      <w:pPr>
+        <w:numPr>
+          <w:ilvl w:val="0"/>
+          <w:numId w:val="18"/>
+        </w:numPr>
+      </w:pPr>
+      <w:r>
+        <w:t>Reduced manual administration and administrative overhead.</w:t>
+      </w:r>
+    </w:p>
+    <w:p>
+      <w:pPr>
+        <w:numPr>
+          <w:ilvl w:val="0"/>
+          <w:numId w:val="18"/>
+        </w:numPr>
+      </w:pPr>
+      <w:r>
+        <w:t>Faster and more consistent user onboarding, role changes, and offboarding.</w:t>
+      </w:r>
+    </w:p>
+    <w:p>
+      <w:pPr>
+        <w:numPr>
+          <w:ilvl w:val="0"/>
+          <w:numId w:val="18"/>
+        </w:numPr>
+      </w:pPr>
+      <w:r>
+        <w:t>Improved standardisation of infrastructure and operational processes.</w:t>
+      </w:r>
+    </w:p>
+    <w:p>
+      <w:pPr>
+        <w:numPr>
+          <w:ilvl w:val="0"/>
+          <w:numId w:val="18"/>
+        </w:numPr>
+      </w:pPr>
+      <w:r>
+        <w:t>Improved visibility of infrastructure health, capacity, performance, and operational issues.</w:t>
+      </w:r>
+    </w:p>
+    <w:p>
+      <w:pPr>
+        <w:numPr>
+          <w:ilvl w:val="0"/>
+          <w:numId w:val="18"/>
+        </w:numPr>
+      </w:pPr>
+      <w:r>
+        <w:t>More consistent software and system maintenance processes.</w:t>
+      </w:r>
+    </w:p>
+    <w:p>
+      <w:pPr>
+        <w:numPr>
+          <w:ilvl w:val="0"/>
+          <w:numId w:val="18"/>
+        </w:numPr>
+      </w:pPr>
+      <w:r>
+        <w:t>Improved IT asset visibility and management.</w:t>
+      </w:r>
+    </w:p>
+    <w:p>
+      <w:pPr>
+        <w:numPr>
+          <w:ilvl w:val="0"/>
+          <w:numId w:val="18"/>
+        </w:numPr>
+      </w:pPr>
+      <w:r>
+        <w:t>Greater use of appropriate automation for repetitive administrative activities.</w:t>
+      </w:r>
+    </w:p>
+    <w:p>
+      <w:pPr>
+        <w:numPr>
+          <w:ilvl w:val="0"/>
+          <w:numId w:val="18"/>
+        </w:numPr>
+      </w:pPr>
+      <w:r>
+        <w:t>Improved documentation and operational knowledge.</w:t>
+      </w:r>
+    </w:p>
+    <w:p>
+      <w:pPr>
+        <w:numPr>
+          <w:ilvl w:val="0"/>
+          <w:numId w:val="18"/>
+        </w:numPr>
+      </w:pPr>
+      <w:r>
+        <w:t>Improved efficiency of routine troubleshooting and system administration.</w:t>
+      </w:r>
+    </w:p>
+    <w:p>
+      <w:pPr>
+        <w:pStyle w:val="Heading3"/>
+      </w:pPr>
+      <w:r>
+        <w:t>5.2 BD-002 – Improve Security, Resilience and Business Continuity</w:t>
+      </w:r>
+    </w:p>
+    <w:p>
+      <w:r>
+        <w:t xml:space="preserve">Northwind Outdoor Ltd. relies upon </w:t>
+      </w:r>
+      <w:proofErr w:type="gramStart"/>
+      <w:r>
+        <w:t>a number of</w:t>
+      </w:r>
+      <w:proofErr w:type="gramEnd"/>
+      <w:r>
+        <w:t xml:space="preserve"> business-critical IT services and information systems to support its day-to-day operations. Protecting business information, controlling access to systems and data, maintaining service availability, and ensuring that critical services can be recovered following an incident are essential to the continued operation of the business.</w:t>
+      </w:r>
+    </w:p>
+    <w:p>
+      <w:r>
+        <w:t>The project will strengthen security controls, improve infrastructure resilience, and establish more robust backup, recovery, monitoring, logging, and operational procedures. The solution should provide appropriate protection against unauthorised access, data loss, service disruption, and operational failures while providing the IT team with sufficient information and procedures to investigate and respond to incidents.</w:t>
+      </w:r>
+    </w:p>
+    <w:p>
+      <w:r>
+        <w:t xml:space="preserve">Northwind has identified a current expectation that critical services should be recoverable within four hours. Specific Recovery Time Objectives (RTOs) and Recovery Point Objectives </w:t>
+      </w:r>
+      <w:r>
+        <w:lastRenderedPageBreak/>
+        <w:t>(RPOs) will be assessed and confirmed for individual business-critical services during the design phase.</w:t>
+      </w:r>
+    </w:p>
+    <w:p>
+      <w:r>
+        <w:t xml:space="preserve">The project will also evaluate appropriate availability and resilience options, including High Availability </w:t>
+      </w:r>
+      <w:proofErr w:type="gramStart"/>
+      <w:r>
+        <w:t>where</w:t>
+      </w:r>
+      <w:proofErr w:type="gramEnd"/>
+      <w:r>
+        <w:t xml:space="preserve"> justified by business requirements, operational considerations, risk, and cost.</w:t>
+      </w:r>
+    </w:p>
+    <w:p>
+      <w:r>
+        <w:rPr>
+          <w:b/>
+          <w:bCs/>
+        </w:rPr>
+        <w:t>Expected Benefits:</w:t>
+      </w:r>
+    </w:p>
+    <w:p>
+      <w:pPr>
+        <w:numPr>
+          <w:ilvl w:val="0"/>
+          <w:numId w:val="19"/>
+        </w:numPr>
+      </w:pPr>
+      <w:r>
+        <w:t>Reduced operational and business continuity risk.</w:t>
+      </w:r>
+    </w:p>
+    <w:p>
+      <w:pPr>
+        <w:numPr>
+          <w:ilvl w:val="0"/>
+          <w:numId w:val="19"/>
+        </w:numPr>
+      </w:pPr>
+      <w:r>
+        <w:t>Improved protection of business and customer information.</w:t>
+      </w:r>
+    </w:p>
+    <w:p>
+      <w:pPr>
+        <w:numPr>
+          <w:ilvl w:val="0"/>
+          <w:numId w:val="19"/>
+        </w:numPr>
+      </w:pPr>
+      <w:r>
+        <w:t>Improved control over user and administrative access.</w:t>
+      </w:r>
+    </w:p>
+    <w:p>
+      <w:pPr>
+        <w:numPr>
+          <w:ilvl w:val="0"/>
+          <w:numId w:val="19"/>
+        </w:numPr>
+      </w:pPr>
+      <w:r>
+        <w:t>Improved detection and investigation of security and operational events.</w:t>
+      </w:r>
+    </w:p>
+    <w:p>
+      <w:pPr>
+        <w:numPr>
+          <w:ilvl w:val="0"/>
+          <w:numId w:val="19"/>
+        </w:numPr>
+      </w:pPr>
+      <w:r>
+        <w:t>Improved backup and recovery capability.</w:t>
+      </w:r>
+    </w:p>
+    <w:p>
+      <w:pPr>
+        <w:numPr>
+          <w:ilvl w:val="0"/>
+          <w:numId w:val="19"/>
+        </w:numPr>
+      </w:pPr>
+      <w:r>
+        <w:t>Greater confidence that business-critical services can be recovered within agreed objectives.</w:t>
+      </w:r>
+    </w:p>
+    <w:p>
+      <w:pPr>
+        <w:numPr>
+          <w:ilvl w:val="0"/>
+          <w:numId w:val="19"/>
+        </w:numPr>
+      </w:pPr>
+      <w:r>
+        <w:t>Improved infrastructure resilience and service availability.</w:t>
+      </w:r>
+    </w:p>
+    <w:p>
+      <w:pPr>
+        <w:numPr>
+          <w:ilvl w:val="0"/>
+          <w:numId w:val="19"/>
+        </w:numPr>
+      </w:pPr>
+      <w:r>
+        <w:t>Reduced impact of infrastructure or service failures.</w:t>
+      </w:r>
+    </w:p>
+    <w:p>
+      <w:pPr>
+        <w:numPr>
+          <w:ilvl w:val="0"/>
+          <w:numId w:val="19"/>
+        </w:numPr>
+      </w:pPr>
+      <w:r>
+        <w:t>Improved ability to investigate, troubleshoot, and recover from operational incidents.</w:t>
+      </w:r>
+    </w:p>
+    <w:p>
+      <w:pPr>
+        <w:pStyle w:val="Heading3"/>
+      </w:pPr>
+      <w:r>
+        <w:t>5.3 BD-003 – Support Future Growth</w:t>
+      </w:r>
+    </w:p>
+    <w:p>
+      <w:r>
+        <w:t>Northwind Outdoor Ltd. expects continued organisational growth over the coming years. The infrastructure must therefore provide a scalable foundation capable of supporting additional users, departments, business services, and future operational requirements without requiring significant redesign or introducing disproportionate administrative overhead.</w:t>
+      </w:r>
+    </w:p>
+    <w:p>
+      <w:r>
+        <w:t>The project will establish consistent infrastructure and operational standards that allow the environment to grow in a controlled manner. Future expansion should be achievable through repeatable processes and established operational practices rather than requiring significant redesign or introducing unnecessary complexity.</w:t>
+      </w:r>
+    </w:p>
+    <w:p>
+      <w:r>
+        <w:t>The design should also provide sufficient flexibility to support future Statements of Work and additional business capabilities as Northwind's requirements evolve.</w:t>
+      </w:r>
+    </w:p>
+    <w:p>
+      <w:r>
+        <w:rPr>
+          <w:b/>
+          <w:bCs/>
+        </w:rPr>
+        <w:t>Expected Benefits:</w:t>
+      </w:r>
+    </w:p>
+    <w:p>
+      <w:pPr>
+        <w:numPr>
+          <w:ilvl w:val="0"/>
+          <w:numId w:val="20"/>
+        </w:numPr>
+      </w:pPr>
+      <w:r>
+        <w:t>Infrastructure capable of supporting projected organisational growth.</w:t>
+      </w:r>
+    </w:p>
+    <w:p>
+      <w:pPr>
+        <w:numPr>
+          <w:ilvl w:val="0"/>
+          <w:numId w:val="20"/>
+        </w:numPr>
+      </w:pPr>
+      <w:r>
+        <w:t>Efficient introduction of new users, departments, and services.</w:t>
+      </w:r>
+    </w:p>
+    <w:p>
+      <w:pPr>
+        <w:numPr>
+          <w:ilvl w:val="0"/>
+          <w:numId w:val="20"/>
+        </w:numPr>
+      </w:pPr>
+      <w:r>
+        <w:t>Reduced requirement for significant infrastructure redesign as the organisation expands.</w:t>
+      </w:r>
+    </w:p>
+    <w:p>
+      <w:pPr>
+        <w:numPr>
+          <w:ilvl w:val="0"/>
+          <w:numId w:val="20"/>
+        </w:numPr>
+      </w:pPr>
+      <w:r>
+        <w:t>Improved ability to scale operational processes alongside infrastructure.</w:t>
+      </w:r>
+    </w:p>
+    <w:p>
+      <w:pPr>
+        <w:numPr>
+          <w:ilvl w:val="0"/>
+          <w:numId w:val="20"/>
+        </w:numPr>
+      </w:pPr>
+      <w:r>
+        <w:t>Lower long-term administrative and infrastructure costs.</w:t>
+      </w:r>
+    </w:p>
+    <w:p>
+      <w:pPr>
+        <w:numPr>
+          <w:ilvl w:val="0"/>
+          <w:numId w:val="20"/>
+        </w:numPr>
+      </w:pPr>
+      <w:r>
+        <w:t>Greater flexibility to introduce future business capabilities.</w:t>
+      </w:r>
+    </w:p>
+    <w:p>
+      <w:pPr>
+        <w:numPr>
+          <w:ilvl w:val="0"/>
+          <w:numId w:val="20"/>
+        </w:numPr>
+      </w:pPr>
+      <w:r>
+        <w:t>A consistent foundation for future Statements of Work and infrastructure development.</w:t>
+      </w:r>
+    </w:p>
+    <w:p>
+      <w:pPr>
+        <w:pStyle w:val="Heading2"/>
+      </w:pPr>
+      <w:bookmarkStart w:id="13" w:name="_Toc236778368"/>
+      <w:r>
+        <w:lastRenderedPageBreak/>
+        <w:t>6.</w:t>
+      </w:r>
+      <w:r>
+        <w:t xml:space="preserve"> Curren</w:t>
+      </w:r>
+      <w:r>
+        <w:t>t State Assessment</w:t>
+      </w:r>
+      <w:bookmarkEnd w:id="13"/>
+    </w:p>
+    <w:p>
+      <w:pPr>
+        <w:rPr>
+          <w:i/>
+          <w:iCs/>
+        </w:rPr>
+      </w:pPr>
+      <w:r>
+        <w:rPr>
+          <w:i/>
+          <w:iCs/>
+        </w:rPr>
+        <w:t>Provide details of your current process for addressing the primary issue your project attempts to solve. Feel free to include diagrams, flowcharts, or other visuals to illustrate the current process</w:t>
+      </w:r>
+    </w:p>
+    <w:p>
+      <w:pPr>
+        <w:pStyle w:val="Heading3"/>
+      </w:pPr>
+      <w:bookmarkStart w:id="14" w:name="_Toc236778369"/>
+      <w:r>
+        <w:t>6.1 Current Environment</w:t>
+      </w:r>
+      <w:bookmarkEnd w:id="14"/>
+    </w:p>
+    <w:p>
+      <w:r>
+        <w:t>During the discovery workshops, Redstone Consulting gathered information relating to Northwind Outdoor Ltd.'s current IT environment and supporting infrastructure.</w:t>
+      </w:r>
+    </w:p>
+    <w:p>
+      <w:r>
+        <w:t>Northwind Outdoor Ltd. currently operates from a single primary office location and employs approximately 50 members of staff across Sales, Finance, Human Resources, Operations, Warehouse, Customer Services, Marketing, and Information Technology departments.</w:t>
+      </w:r>
+    </w:p>
+    <w:p>
+      <w:r>
+        <w:t>The organisation's users primarily utilise Microsoft Windows desktop and laptop computers to access business applications, departmental file shares, email services, and internet-based resources. Microsoft 365 is used to provide corporate email, calendaring, and office productivity applications.</w:t>
+      </w:r>
+    </w:p>
+    <w:p>
+      <w:r>
+        <w:t>The existing server infrastructure is hosted on-premises and consists primarily of Microsoft Windows Server systems providing core business services, including Active Directory domain services, user authentication, DNS, DHCP, file sharing, and Group Policy management. Business data is stored centrally and accessed via departmental network shares.</w:t>
+      </w:r>
+    </w:p>
+    <w:p>
+      <w:r>
+        <w:t>The organisation also relies upon several line-of-business applications, including accounting software used by the Finance department and inventory management systems supporting warehouse operations. These applications are considered business critical and are dependent upon the continued availability of the supporting infrastructure.</w:t>
+      </w:r>
+    </w:p>
+    <w:p>
+      <w:r>
+        <w:t>Network services are delivered through an existing switched LAN with centrally managed internet connectivity, providing wired access throughout the office environment. Remote access capabilities are available for authorised users to support hybrid working arrangements.</w:t>
+      </w:r>
+    </w:p>
+    <w:p>
+      <w:r>
+        <w:t>Day-to-day administration of the environment is performed by a small internal IT team responsible for infrastructure management, user administration, endpoint support, software deployment, and routine maintenance activities.</w:t>
+      </w:r>
+    </w:p>
+    <w:p>
+      <w:pPr>
+        <w:pStyle w:val="Heading3"/>
+      </w:pPr>
+      <w:bookmarkStart w:id="15" w:name="_Toc236778370"/>
+      <w:r>
+        <w:t>6.2 Current Processes</w:t>
+      </w:r>
+      <w:bookmarkEnd w:id="15"/>
+    </w:p>
+    <w:p>
+      <w:r>
+        <w:t>The current IT operating model relies upon a combination of manual administrative procedures and established operational practices developed over time.</w:t>
+      </w:r>
+    </w:p>
+    <w:p>
+      <w:r>
+        <w:t>Key operational processes identified during the discovery phase include:</w:t>
+      </w:r>
+    </w:p>
+    <w:p>
+      <w:pPr>
+        <w:pStyle w:val="ListParagraph"/>
+        <w:numPr>
+          <w:ilvl w:val="0"/>
+          <w:numId w:val="9"/>
+        </w:numPr>
+      </w:pPr>
+      <w:r>
+        <w:t>User accounts are created, modified, and disabled manually by the IT team following requests from department managers.</w:t>
+      </w:r>
+    </w:p>
+    <w:p>
+      <w:pPr>
+        <w:pStyle w:val="ListParagraph"/>
+        <w:numPr>
+          <w:ilvl w:val="0"/>
+          <w:numId w:val="9"/>
+        </w:numPr>
+      </w:pPr>
+      <w:r>
+        <w:t>Departmental permissions are assigned individually based upon business requirements and maintained through existing directory services.</w:t>
+      </w:r>
+    </w:p>
+    <w:p>
+      <w:pPr>
+        <w:pStyle w:val="ListParagraph"/>
+        <w:numPr>
+          <w:ilvl w:val="0"/>
+          <w:numId w:val="9"/>
+        </w:numPr>
+      </w:pPr>
+      <w:r>
+        <w:t>Shared departmental data is stored centrally and accessed via network file shares.</w:t>
+      </w:r>
+    </w:p>
+    <w:p>
+      <w:pPr>
+        <w:pStyle w:val="ListParagraph"/>
+        <w:numPr>
+          <w:ilvl w:val="0"/>
+          <w:numId w:val="9"/>
+        </w:numPr>
+      </w:pPr>
+      <w:r>
+        <w:t>Software installation and workstation configuration are managed by the internal IT team.</w:t>
+      </w:r>
+    </w:p>
+    <w:p>
+      <w:pPr>
+        <w:pStyle w:val="ListParagraph"/>
+        <w:numPr>
+          <w:ilvl w:val="0"/>
+          <w:numId w:val="9"/>
+        </w:numPr>
+      </w:pPr>
+      <w:r>
+        <w:t>Routine maintenance activities, including operating system updates, server maintenance, and infrastructure monitoring, are performed during scheduled maintenance windows where possible.</w:t>
+      </w:r>
+    </w:p>
+    <w:p>
+      <w:pPr>
+        <w:pStyle w:val="ListParagraph"/>
+        <w:numPr>
+          <w:ilvl w:val="0"/>
+          <w:numId w:val="9"/>
+        </w:numPr>
+      </w:pPr>
+      <w:r>
+        <w:lastRenderedPageBreak/>
+        <w:t>Backup procedures are performed for business-critical systems; however, the current strategy and recovery procedures require further review as part of the design phase.</w:t>
+      </w:r>
+    </w:p>
+    <w:p>
+      <w:pPr>
+        <w:pStyle w:val="ListParagraph"/>
+        <w:numPr>
+          <w:ilvl w:val="0"/>
+          <w:numId w:val="9"/>
+        </w:numPr>
+      </w:pPr>
+      <w:r>
+        <w:t>Technical documentation exists for portions of the environment but is not comprehensive across all infrastructure components.</w:t>
+      </w:r>
+    </w:p>
+    <w:p>
+      <w:pPr>
+        <w:pStyle w:val="ListParagraph"/>
+        <w:numPr>
+          <w:ilvl w:val="0"/>
+          <w:numId w:val="9"/>
+        </w:numPr>
+      </w:pPr>
+      <w:r>
+        <w:t>Infrastructure changes are coordinated by the internal IT team using informal change management procedures appropriate to the current size of the organisation.</w:t>
+      </w:r>
+    </w:p>
+    <w:p>
+      <w:pPr>
+        <w:pStyle w:val="Heading3"/>
+      </w:pPr>
+      <w:bookmarkStart w:id="16" w:name="_Toc236778371"/>
+      <w:r>
+        <w:t>6.3 Current Challenges</w:t>
+      </w:r>
+      <w:bookmarkEnd w:id="16"/>
+    </w:p>
+    <w:p>
+      <w:r>
+        <w:t>Although the current environment continues to support day-to-day business operations, the discovery workshops identified several operational challenges that may affect the organisation's ability to support future growth and evolving business requirements.</w:t>
+      </w:r>
+    </w:p>
+    <w:p>
+      <w:r>
+        <w:t>The principal challenges identified include:</w:t>
+      </w:r>
+    </w:p>
+    <w:p>
+      <w:pPr>
+        <w:pStyle w:val="ListParagraph"/>
+        <w:numPr>
+          <w:ilvl w:val="0"/>
+          <w:numId w:val="10"/>
+        </w:numPr>
+      </w:pPr>
+      <w:r>
+        <w:t>Infrastructure has evolved organically over several years, resulting in inconsistent standards and administrative practices.</w:t>
+      </w:r>
+    </w:p>
+    <w:p>
+      <w:pPr>
+        <w:pStyle w:val="ListParagraph"/>
+        <w:numPr>
+          <w:ilvl w:val="0"/>
+          <w:numId w:val="10"/>
+        </w:numPr>
+      </w:pPr>
+      <w:r>
+        <w:t>Increasing administrative effort is required to manage users, permissions, and infrastructure as the organisation continues to grow.</w:t>
+      </w:r>
+    </w:p>
+    <w:p>
+      <w:pPr>
+        <w:pStyle w:val="ListParagraph"/>
+        <w:numPr>
+          <w:ilvl w:val="0"/>
+          <w:numId w:val="10"/>
+        </w:numPr>
+      </w:pPr>
+      <w:r>
+        <w:t>Existing infrastructure provides limited standardisation, making future expansion and ongoing support more complex.</w:t>
+      </w:r>
+    </w:p>
+    <w:p>
+      <w:pPr>
+        <w:pStyle w:val="ListParagraph"/>
+        <w:numPr>
+          <w:ilvl w:val="0"/>
+          <w:numId w:val="10"/>
+        </w:numPr>
+      </w:pPr>
+      <w:r>
+        <w:t>Business-critical services are highly dependent upon a small number of key systems, increasing operational risk in the event of service disruption.</w:t>
+      </w:r>
+    </w:p>
+    <w:p>
+      <w:pPr>
+        <w:pStyle w:val="ListParagraph"/>
+        <w:numPr>
+          <w:ilvl w:val="0"/>
+          <w:numId w:val="10"/>
+        </w:numPr>
+      </w:pPr>
+      <w:r>
+        <w:t>Existing documentation does not fully reflect the current environment, increasing reliance on internal knowledge for support and troubleshooting.</w:t>
+      </w:r>
+    </w:p>
+    <w:p>
+      <w:pPr>
+        <w:pStyle w:val="ListParagraph"/>
+        <w:numPr>
+          <w:ilvl w:val="0"/>
+          <w:numId w:val="10"/>
+        </w:numPr>
+      </w:pPr>
+      <w:r>
+        <w:t>Opportunities exist to improve infrastructure resilience, security controls, backup processes, and disaster recovery planning.</w:t>
+      </w:r>
+    </w:p>
+    <w:p>
+      <w:pPr>
+        <w:pStyle w:val="ListParagraph"/>
+        <w:numPr>
+          <w:ilvl w:val="0"/>
+          <w:numId w:val="10"/>
+        </w:numPr>
+      </w:pPr>
+      <w:r>
+        <w:t>Future business growth is expected to place additional demands upon the existing infrastructure, requiring a more scalable and centrally managed operating model.</w:t>
+      </w:r>
+    </w:p>
+    <w:p/>
+    <w:p/>
+    <w:p/>
+    <w:p/>
+    <w:p/>
+    <w:p/>
+    <w:p/>
+    <w:p/>
+    <w:p/>
+    <w:p/>
+    <w:p>
+      <w:pPr>
+        <w:pStyle w:val="Heading2"/>
+      </w:pPr>
+      <w:bookmarkStart w:id="17" w:name="_Toc236778372"/>
+      <w:r>
+        <w:lastRenderedPageBreak/>
+        <w:t>7. Proposed Process</w:t>
+      </w:r>
+      <w:bookmarkEnd w:id="17"/>
+    </w:p>
+    <w:p>
+      <w:pPr>
+        <w:pStyle w:val="Heading3"/>
+      </w:pPr>
+      <w:bookmarkStart w:id="18" w:name="_Toc236778373"/>
+      <w:r>
+        <w:t>7.1 Delivery Approach</w:t>
+      </w:r>
+      <w:bookmarkEnd w:id="18"/>
+    </w:p>
+    <w:p>
+      <w:r>
+        <w:t>Redstone Consulting proposes to deliver this engagement using a structured, iterative delivery methodology that enables Northwind Outdoor Ltd. to realise business value incrementally while maintaining appropriate project governance and minimising operational risk.</w:t>
+      </w:r>
+    </w:p>
+    <w:p>
+      <w:r>
+        <w:t>Following approval of this Business Requirements Document (BRD), the approved business requirements will be prioritised according to business value, operational dependencies, and implementation complexity. Related requirements will be grouped into discrete Statements of Work (SoWs), with each Statement of Work delivering one or more complete business capabilities.</w:t>
+      </w:r>
+    </w:p>
+    <w:p>
+      <w:r>
+        <w:t>Each Statement of Work will be delivered through a series of planned project sprints. During each sprint, Redstone Consulting will undertake solution design, implementation, testing, documentation, and internal quality assurance activities before presenting the completed deliverables for customer review and acceptance.</w:t>
+      </w:r>
+    </w:p>
+    <w:p>
+      <w:r>
+        <w:t>Implementation activities will initially be performed within an isolated pre-production environment to validate the proposed solution, verify functionality, produce supporting documentation, and reduce implementation risk prior to deployment into the live production environment.</w:t>
+      </w:r>
+    </w:p>
+    <w:p>
+      <w:r>
+        <w:t>Business requirements identified as Must Have priorities will be addressed within the initial Statements of Work, establishing the core infrastructure and foundational services upon which subsequent project phases will build. Lower-priority requirements will be scheduled into future Statements of Work following successful completion and acceptance of the foundational capabilities.</w:t>
+      </w:r>
+    </w:p>
+    <w:p>
+      <w:r>
+        <w:t>Each Statement of Work will conclude with formal customer review and acceptance before the next phase of delivery commences. This iterative approach ensures that progress is measurable, business priorities remain aligned throughout the engagement, and opportunities for feedback can be incorporated into future project activities through the agreed governance and change management processes.</w:t>
+      </w:r>
+    </w:p>
+    <w:p/>
+    <w:p/>
+    <w:p/>
+    <w:p/>
+    <w:p/>
+    <w:p/>
+    <w:p/>
+    <w:p/>
     <w:p>
       <w:pPr>
         <w:pStyle w:val="Heading3"/>
@@ -4720,12 +5211,12 @@
           <w:numId w:val="10"/>
         </w:numPr>
       </w:pPr>
-      <w:bookmarkStart w:id="22" w:name="_Toc236778374"/>
+      <w:bookmarkStart w:id="19" w:name="_Toc236778374"/>
       <w:r>
         <w:lastRenderedPageBreak/>
         <w:t>Proposed project lifecycle</w:t>
       </w:r>
-      <w:bookmarkEnd w:id="22"/>
+      <w:bookmarkEnd w:id="19"/>
     </w:p>
     <w:p>
       <w:r>
@@ -4824,11 +5315,11 @@
       <w:pPr>
         <w:pStyle w:val="Heading3"/>
       </w:pPr>
-      <w:bookmarkStart w:id="23" w:name="_Toc236778375"/>
+      <w:bookmarkStart w:id="20" w:name="_Toc236778375"/>
       <w:r>
         <w:t>7.3 Governance</w:t>
       </w:r>
-      <w:bookmarkEnd w:id="23"/>
+      <w:bookmarkEnd w:id="20"/>
     </w:p>
     <w:p>
       <w:r>
@@ -4871,12 +5362,12 @@
       <w:pPr>
         <w:pStyle w:val="Heading2"/>
       </w:pPr>
-      <w:bookmarkStart w:id="24" w:name="_Toc236778376"/>
+      <w:bookmarkStart w:id="21" w:name="_Toc236778376"/>
       <w:r>
         <w:lastRenderedPageBreak/>
         <w:t>8. Functional Requirements</w:t>
       </w:r>
-      <w:bookmarkEnd w:id="24"/>
+      <w:bookmarkEnd w:id="21"/>
     </w:p>
     <w:p>
       <w:pPr>
@@ -7659,12 +8150,12 @@
       <w:pPr>
         <w:pStyle w:val="Heading2"/>
       </w:pPr>
-      <w:bookmarkStart w:id="25" w:name="_Toc236778377"/>
+      <w:bookmarkStart w:id="22" w:name="_Toc236778377"/>
       <w:r>
         <w:lastRenderedPageBreak/>
         <w:t>9. Non-Functional Requirements</w:t>
       </w:r>
-      <w:bookmarkEnd w:id="25"/>
+      <w:bookmarkEnd w:id="22"/>
     </w:p>
     <w:p>
       <w:pPr>
@@ -7678,23 +8169,7 @@
           <w:i/>
           <w:iCs/>
         </w:rPr>
-        <w:t xml:space="preserve">Detail all non-functional requirements (NFRs) of the project, including such things as features, system </w:t>
-      </w:r>
-      <w:proofErr w:type="spellStart"/>
-      <w:r>
-        <w:rPr>
-          <w:i/>
-          <w:iCs/>
-        </w:rPr>
-        <w:t>behavior</w:t>
-      </w:r>
-      <w:proofErr w:type="spellEnd"/>
-      <w:r>
-        <w:rPr>
-          <w:i/>
-          <w:iCs/>
-        </w:rPr>
-        <w:t>, and project characteristics that relate to user experience.</w:t>
+        <w:t>Detail all non-functional requirements (NFRs) of the project, including such things as features, system behavior, and project characteristics that relate to user experience.</w:t>
       </w:r>
     </w:p>
     <w:tbl>
@@ -9545,12 +10020,12 @@
           <w:numId w:val="12"/>
         </w:numPr>
       </w:pPr>
-      <w:bookmarkStart w:id="26" w:name="_Toc236778378"/>
+      <w:bookmarkStart w:id="23" w:name="_Toc236778378"/>
       <w:r>
         <w:lastRenderedPageBreak/>
         <w:t>Key Stakeholders</w:t>
       </w:r>
-      <w:bookmarkEnd w:id="26"/>
+      <w:bookmarkEnd w:id="23"/>
     </w:p>
     <w:tbl>
       <w:tblPr>
@@ -9843,11 +10318,11 @@
           <w:numId w:val="13"/>
         </w:numPr>
       </w:pPr>
-      <w:bookmarkStart w:id="27" w:name="_Toc236778379"/>
+      <w:bookmarkStart w:id="24" w:name="_Toc236778379"/>
       <w:r>
         <w:t>Assumptions</w:t>
       </w:r>
-      <w:bookmarkEnd w:id="27"/>
+      <w:bookmarkEnd w:id="24"/>
     </w:p>
     <w:tbl>
       <w:tblPr>
@@ -10085,12 +10560,12 @@
           <w:numId w:val="14"/>
         </w:numPr>
       </w:pPr>
-      <w:bookmarkStart w:id="28" w:name="_Toc236778380"/>
+      <w:bookmarkStart w:id="25" w:name="_Toc236778380"/>
       <w:r>
         <w:lastRenderedPageBreak/>
         <w:t>Constraints</w:t>
       </w:r>
-      <w:bookmarkEnd w:id="28"/>
+      <w:bookmarkEnd w:id="25"/>
     </w:p>
     <w:tbl>
       <w:tblPr>
@@ -10321,11 +10796,11 @@
           <w:numId w:val="15"/>
         </w:numPr>
       </w:pPr>
-      <w:bookmarkStart w:id="29" w:name="_Toc236778381"/>
+      <w:bookmarkStart w:id="26" w:name="_Toc236778381"/>
       <w:r>
         <w:t>Risks</w:t>
       </w:r>
-      <w:bookmarkEnd w:id="29"/>
+      <w:bookmarkEnd w:id="26"/>
     </w:p>
     <w:tbl>
       <w:tblPr>
@@ -10644,11 +11119,11 @@
           <w:numId w:val="14"/>
         </w:numPr>
       </w:pPr>
-      <w:bookmarkStart w:id="30" w:name="_Toc236778382"/>
+      <w:bookmarkStart w:id="27" w:name="_Toc236778382"/>
       <w:r>
         <w:t>Success Criteria</w:t>
       </w:r>
-      <w:bookmarkEnd w:id="30"/>
+      <w:bookmarkEnd w:id="27"/>
     </w:p>
     <w:p>
       <w:pPr>
@@ -10774,12 +11249,12 @@
       <w:pPr>
         <w:pStyle w:val="Heading2"/>
       </w:pPr>
-      <w:bookmarkStart w:id="31" w:name="_Toc236778383"/>
+      <w:bookmarkStart w:id="28" w:name="_Toc236778383"/>
       <w:r>
         <w:lastRenderedPageBreak/>
         <w:t>14. Approval</w:t>
       </w:r>
-      <w:bookmarkEnd w:id="31"/>
+      <w:bookmarkEnd w:id="28"/>
     </w:p>
     <w:tbl>
       <w:tblPr>
@@ -11073,14 +11548,14 @@
       <w:pPr>
         <w:pStyle w:val="Heading2"/>
       </w:pPr>
-      <w:bookmarkStart w:id="32" w:name="_Toc236778384"/>
+      <w:bookmarkStart w:id="29" w:name="_Toc236778384"/>
       <w:r>
         <w:t xml:space="preserve">Appendix 1 – </w:t>
       </w:r>
       <w:r>
         <w:t>Glossary</w:t>
       </w:r>
-      <w:bookmarkEnd w:id="32"/>
+      <w:bookmarkEnd w:id="29"/>
     </w:p>
     <w:tbl>
       <w:tblPr>
@@ -11391,11 +11866,9 @@
             <w:hideMark/>
           </w:tcPr>
           <w:p>
-            <w:proofErr w:type="spellStart"/>
             <w:r>
               <w:t>MoSCoW</w:t>
             </w:r>
-            <w:proofErr w:type="spellEnd"/>
           </w:p>
         </w:tc>
         <w:tc>
@@ -11417,14 +11890,14 @@
       <w:pPr>
         <w:pStyle w:val="Heading2"/>
       </w:pPr>
-      <w:bookmarkStart w:id="33" w:name="_Toc236778385"/>
+      <w:bookmarkStart w:id="30" w:name="_Toc236778385"/>
       <w:r>
         <w:t xml:space="preserve">Appendix 2 - </w:t>
       </w:r>
       <w:r>
         <w:t>Priority Table</w:t>
       </w:r>
-      <w:bookmarkEnd w:id="33"/>
+      <w:bookmarkEnd w:id="30"/>
     </w:p>
     <w:tbl>
       <w:tblPr>
@@ -11677,6 +12150,7 @@
         <w:docPartUnique/>
       </w:docPartObj>
     </w:sdtPr>
+    <w:sdtEndPr/>
     <w:sdtContent>
       <w:sdt>
         <w:sdtPr>
@@ -11686,6 +12160,7 @@
             <w:docPartUnique/>
           </w:docPartObj>
         </w:sdtPr>
+        <w:sdtEndPr/>
         <w:sdtContent>
           <w:p>
             <w:pPr>
@@ -12226,6 +12701,119 @@
     </w:lvl>
   </w:abstractNum>
   <w:abstractNum w:abstractNumId="4" w15:restartNumberingAfterBreak="0">
+    <w:nsid w:val="3120639C"/>
+    <w:multiLevelType w:val="multilevel"/>
+    <w:tmpl w:val="2F40248E"/>
+    <w:lvl w:ilvl="0">
+      <w:start w:val="1"/>
+      <w:numFmt w:val="decimal"/>
+      <w:lvlText w:val="%1."/>
+      <w:lvlJc w:val="left"/>
+      <w:pPr>
+        <w:tabs>
+          <w:tab w:val="num" w:pos="720"/>
+        </w:tabs>
+        <w:ind w:left="720" w:hanging="360"/>
+      </w:pPr>
+    </w:lvl>
+    <w:lvl w:ilvl="1" w:tentative="1">
+      <w:start w:val="1"/>
+      <w:numFmt w:val="decimal"/>
+      <w:lvlText w:val="%2."/>
+      <w:lvlJc w:val="left"/>
+      <w:pPr>
+        <w:tabs>
+          <w:tab w:val="num" w:pos="1440"/>
+        </w:tabs>
+        <w:ind w:left="1440" w:hanging="360"/>
+      </w:pPr>
+    </w:lvl>
+    <w:lvl w:ilvl="2" w:tentative="1">
+      <w:start w:val="1"/>
+      <w:numFmt w:val="decimal"/>
+      <w:lvlText w:val="%3."/>
+      <w:lvlJc w:val="left"/>
+      <w:pPr>
+        <w:tabs>
+          <w:tab w:val="num" w:pos="2160"/>
+        </w:tabs>
+        <w:ind w:left="2160" w:hanging="360"/>
+      </w:pPr>
+    </w:lvl>
+    <w:lvl w:ilvl="3" w:tentative="1">
+      <w:start w:val="1"/>
+      <w:numFmt w:val="decimal"/>
+      <w:lvlText w:val="%4."/>
+      <w:lvlJc w:val="left"/>
+      <w:pPr>
+        <w:tabs>
+          <w:tab w:val="num" w:pos="2880"/>
+        </w:tabs>
+        <w:ind w:left="2880" w:hanging="360"/>
+      </w:pPr>
+    </w:lvl>
+    <w:lvl w:ilvl="4" w:tentative="1">
+      <w:start w:val="1"/>
+      <w:numFmt w:val="decimal"/>
+      <w:lvlText w:val="%5."/>
+      <w:lvlJc w:val="left"/>
+      <w:pPr>
+        <w:tabs>
+          <w:tab w:val="num" w:pos="3600"/>
+        </w:tabs>
+        <w:ind w:left="3600" w:hanging="360"/>
+      </w:pPr>
+    </w:lvl>
+    <w:lvl w:ilvl="5" w:tentative="1">
+      <w:start w:val="1"/>
+      <w:numFmt w:val="decimal"/>
+      <w:lvlText w:val="%6."/>
+      <w:lvlJc w:val="left"/>
+      <w:pPr>
+        <w:tabs>
+          <w:tab w:val="num" w:pos="4320"/>
+        </w:tabs>
+        <w:ind w:left="4320" w:hanging="360"/>
+      </w:pPr>
+    </w:lvl>
+    <w:lvl w:ilvl="6" w:tentative="1">
+      <w:start w:val="1"/>
+      <w:numFmt w:val="decimal"/>
+      <w:lvlText w:val="%7."/>
+      <w:lvlJc w:val="left"/>
+      <w:pPr>
+        <w:tabs>
+          <w:tab w:val="num" w:pos="5040"/>
+        </w:tabs>
+        <w:ind w:left="5040" w:hanging="360"/>
+      </w:pPr>
+    </w:lvl>
+    <w:lvl w:ilvl="7" w:tentative="1">
+      <w:start w:val="1"/>
+      <w:numFmt w:val="decimal"/>
+      <w:lvlText w:val="%8."/>
+      <w:lvlJc w:val="left"/>
+      <w:pPr>
+        <w:tabs>
+          <w:tab w:val="num" w:pos="5760"/>
+        </w:tabs>
+        <w:ind w:left="5760" w:hanging="360"/>
+      </w:pPr>
+    </w:lvl>
+    <w:lvl w:ilvl="8" w:tentative="1">
+      <w:start w:val="1"/>
+      <w:numFmt w:val="decimal"/>
+      <w:lvlText w:val="%9."/>
+      <w:lvlJc w:val="left"/>
+      <w:pPr>
+        <w:tabs>
+          <w:tab w:val="num" w:pos="6480"/>
+        </w:tabs>
+        <w:ind w:left="6480" w:hanging="360"/>
+      </w:pPr>
+    </w:lvl>
+  </w:abstractNum>
+  <w:abstractNum w:abstractNumId="5" w15:restartNumberingAfterBreak="0">
     <w:nsid w:val="32494D17"/>
     <w:multiLevelType w:val="hybridMultilevel"/>
     <w:tmpl w:val="932EF798"/>
@@ -12314,7 +12902,156 @@
       </w:pPr>
     </w:lvl>
   </w:abstractNum>
-  <w:abstractNum w:abstractNumId="5" w15:restartNumberingAfterBreak="0">
+  <w:abstractNum w:abstractNumId="6" w15:restartNumberingAfterBreak="0">
+    <w:nsid w:val="38920456"/>
+    <w:multiLevelType w:val="multilevel"/>
+    <w:tmpl w:val="08424870"/>
+    <w:lvl w:ilvl="0">
+      <w:start w:val="1"/>
+      <w:numFmt w:val="bullet"/>
+      <w:lvlText w:val=""/>
+      <w:lvlJc w:val="left"/>
+      <w:pPr>
+        <w:tabs>
+          <w:tab w:val="num" w:pos="720"/>
+        </w:tabs>
+        <w:ind w:left="720" w:hanging="360"/>
+      </w:pPr>
+      <w:rPr>
+        <w:rFonts w:ascii="Symbol" w:hAnsi="Symbol" w:hint="default"/>
+        <w:sz w:val="20"/>
+      </w:rPr>
+    </w:lvl>
+    <w:lvl w:ilvl="1" w:tentative="1">
+      <w:start w:val="1"/>
+      <w:numFmt w:val="bullet"/>
+      <w:lvlText w:val="o"/>
+      <w:lvlJc w:val="left"/>
+      <w:pPr>
+        <w:tabs>
+          <w:tab w:val="num" w:pos="1440"/>
+        </w:tabs>
+        <w:ind w:left="1440" w:hanging="360"/>
+      </w:pPr>
+      <w:rPr>
+        <w:rFonts w:ascii="Courier New" w:hAnsi="Courier New" w:hint="default"/>
+        <w:sz w:val="20"/>
+      </w:rPr>
+    </w:lvl>
+    <w:lvl w:ilvl="2" w:tentative="1">
+      <w:start w:val="1"/>
+      <w:numFmt w:val="bullet"/>
+      <w:lvlText w:val=""/>
+      <w:lvlJc w:val="left"/>
+      <w:pPr>
+        <w:tabs>
+          <w:tab w:val="num" w:pos="2160"/>
+        </w:tabs>
+        <w:ind w:left="2160" w:hanging="360"/>
+      </w:pPr>
+      <w:rPr>
+        <w:rFonts w:ascii="Wingdings" w:hAnsi="Wingdings" w:hint="default"/>
+        <w:sz w:val="20"/>
+      </w:rPr>
+    </w:lvl>
+    <w:lvl w:ilvl="3" w:tentative="1">
+      <w:start w:val="1"/>
+      <w:numFmt w:val="bullet"/>
+      <w:lvlText w:val=""/>
+      <w:lvlJc w:val="left"/>
+      <w:pPr>
+        <w:tabs>
+          <w:tab w:val="num" w:pos="2880"/>
+        </w:tabs>
+        <w:ind w:left="2880" w:hanging="360"/>
+      </w:pPr>
+      <w:rPr>
+        <w:rFonts w:ascii="Wingdings" w:hAnsi="Wingdings" w:hint="default"/>
+        <w:sz w:val="20"/>
+      </w:rPr>
+    </w:lvl>
+    <w:lvl w:ilvl="4" w:tentative="1">
+      <w:start w:val="1"/>
+      <w:numFmt w:val="bullet"/>
+      <w:lvlText w:val=""/>
+      <w:lvlJc w:val="left"/>
+      <w:pPr>
+        <w:tabs>
+          <w:tab w:val="num" w:pos="3600"/>
+        </w:tabs>
+        <w:ind w:left="3600" w:hanging="360"/>
+      </w:pPr>
+      <w:rPr>
+        <w:rFonts w:ascii="Wingdings" w:hAnsi="Wingdings" w:hint="default"/>
+        <w:sz w:val="20"/>
+      </w:rPr>
+    </w:lvl>
+    <w:lvl w:ilvl="5" w:tentative="1">
+      <w:start w:val="1"/>
+      <w:numFmt w:val="bullet"/>
+      <w:lvlText w:val=""/>
+      <w:lvlJc w:val="left"/>
+      <w:pPr>
+        <w:tabs>
+          <w:tab w:val="num" w:pos="4320"/>
+        </w:tabs>
+        <w:ind w:left="4320" w:hanging="360"/>
+      </w:pPr>
+      <w:rPr>
+        <w:rFonts w:ascii="Wingdings" w:hAnsi="Wingdings" w:hint="default"/>
+        <w:sz w:val="20"/>
+      </w:rPr>
+    </w:lvl>
+    <w:lvl w:ilvl="6" w:tentative="1">
+      <w:start w:val="1"/>
+      <w:numFmt w:val="bullet"/>
+      <w:lvlText w:val=""/>
+      <w:lvlJc w:val="left"/>
+      <w:pPr>
+        <w:tabs>
+          <w:tab w:val="num" w:pos="5040"/>
+        </w:tabs>
+        <w:ind w:left="5040" w:hanging="360"/>
+      </w:pPr>
+      <w:rPr>
+        <w:rFonts w:ascii="Wingdings" w:hAnsi="Wingdings" w:hint="default"/>
+        <w:sz w:val="20"/>
+      </w:rPr>
+    </w:lvl>
+    <w:lvl w:ilvl="7" w:tentative="1">
+      <w:start w:val="1"/>
+      <w:numFmt w:val="bullet"/>
+      <w:lvlText w:val=""/>
+      <w:lvlJc w:val="left"/>
+      <w:pPr>
+        <w:tabs>
+          <w:tab w:val="num" w:pos="5760"/>
+        </w:tabs>
+        <w:ind w:left="5760" w:hanging="360"/>
+      </w:pPr>
+      <w:rPr>
+        <w:rFonts w:ascii="Wingdings" w:hAnsi="Wingdings" w:hint="default"/>
+        <w:sz w:val="20"/>
+      </w:rPr>
+    </w:lvl>
+    <w:lvl w:ilvl="8" w:tentative="1">
+      <w:start w:val="1"/>
+      <w:numFmt w:val="bullet"/>
+      <w:lvlText w:val=""/>
+      <w:lvlJc w:val="left"/>
+      <w:pPr>
+        <w:tabs>
+          <w:tab w:val="num" w:pos="6480"/>
+        </w:tabs>
+        <w:ind w:left="6480" w:hanging="360"/>
+      </w:pPr>
+      <w:rPr>
+        <w:rFonts w:ascii="Wingdings" w:hAnsi="Wingdings" w:hint="default"/>
+        <w:sz w:val="20"/>
+      </w:rPr>
+    </w:lvl>
+  </w:abstractNum>
+  <w:abstractNum w:abstractNumId="7" w15:restartNumberingAfterBreak="0">
     <w:nsid w:val="458423DE"/>
     <w:multiLevelType w:val="hybridMultilevel"/>
     <w:tmpl w:val="736C69E2"/>
@@ -12403,7 +13140,7 @@
       </w:pPr>
     </w:lvl>
   </w:abstractNum>
-  <w:abstractNum w:abstractNumId="6" w15:restartNumberingAfterBreak="0">
+  <w:abstractNum w:abstractNumId="8" w15:restartNumberingAfterBreak="0">
     <w:nsid w:val="4D852A8C"/>
     <w:multiLevelType w:val="hybridMultilevel"/>
     <w:tmpl w:val="1A849178"/>
@@ -12569,7 +13306,7 @@
       </w:rPr>
     </w:lvl>
   </w:abstractNum>
-  <w:abstractNum w:abstractNumId="7" w15:restartNumberingAfterBreak="0">
+  <w:abstractNum w:abstractNumId="9" w15:restartNumberingAfterBreak="0">
     <w:nsid w:val="52F13362"/>
     <w:multiLevelType w:val="hybridMultilevel"/>
     <w:tmpl w:val="0DF6F198"/>
@@ -12658,7 +13395,7 @@
       </w:pPr>
     </w:lvl>
   </w:abstractNum>
-  <w:abstractNum w:abstractNumId="8" w15:restartNumberingAfterBreak="0">
+  <w:abstractNum w:abstractNumId="10" w15:restartNumberingAfterBreak="0">
     <w:nsid w:val="53634B64"/>
     <w:multiLevelType w:val="hybridMultilevel"/>
     <w:tmpl w:val="186C26BA"/>
@@ -12771,7 +13508,120 @@
       </w:rPr>
     </w:lvl>
   </w:abstractNum>
-  <w:abstractNum w:abstractNumId="9" w15:restartNumberingAfterBreak="0">
+  <w:abstractNum w:abstractNumId="11" w15:restartNumberingAfterBreak="0">
+    <w:nsid w:val="56DE4305"/>
+    <w:multiLevelType w:val="multilevel"/>
+    <w:tmpl w:val="AD7E6758"/>
+    <w:lvl w:ilvl="0">
+      <w:start w:val="1"/>
+      <w:numFmt w:val="decimal"/>
+      <w:lvlText w:val="%1."/>
+      <w:lvlJc w:val="left"/>
+      <w:pPr>
+        <w:tabs>
+          <w:tab w:val="num" w:pos="720"/>
+        </w:tabs>
+        <w:ind w:left="720" w:hanging="360"/>
+      </w:pPr>
+    </w:lvl>
+    <w:lvl w:ilvl="1" w:tentative="1">
+      <w:start w:val="1"/>
+      <w:numFmt w:val="decimal"/>
+      <w:lvlText w:val="%2."/>
+      <w:lvlJc w:val="left"/>
+      <w:pPr>
+        <w:tabs>
+          <w:tab w:val="num" w:pos="1440"/>
+        </w:tabs>
+        <w:ind w:left="1440" w:hanging="360"/>
+      </w:pPr>
+    </w:lvl>
+    <w:lvl w:ilvl="2" w:tentative="1">
+      <w:start w:val="1"/>
+      <w:numFmt w:val="decimal"/>
+      <w:lvlText w:val="%3."/>
+      <w:lvlJc w:val="left"/>
+      <w:pPr>
+        <w:tabs>
+          <w:tab w:val="num" w:pos="2160"/>
+        </w:tabs>
+        <w:ind w:left="2160" w:hanging="360"/>
+      </w:pPr>
+    </w:lvl>
+    <w:lvl w:ilvl="3" w:tentative="1">
+      <w:start w:val="1"/>
+      <w:numFmt w:val="decimal"/>
+      <w:lvlText w:val="%4."/>
+      <w:lvlJc w:val="left"/>
+      <w:pPr>
+        <w:tabs>
+          <w:tab w:val="num" w:pos="2880"/>
+        </w:tabs>
+        <w:ind w:left="2880" w:hanging="360"/>
+      </w:pPr>
+    </w:lvl>
+    <w:lvl w:ilvl="4" w:tentative="1">
+      <w:start w:val="1"/>
+      <w:numFmt w:val="decimal"/>
+      <w:lvlText w:val="%5."/>
+      <w:lvlJc w:val="left"/>
+      <w:pPr>
+        <w:tabs>
+          <w:tab w:val="num" w:pos="3600"/>
+        </w:tabs>
+        <w:ind w:left="3600" w:hanging="360"/>
+      </w:pPr>
+    </w:lvl>
+    <w:lvl w:ilvl="5" w:tentative="1">
+      <w:start w:val="1"/>
+      <w:numFmt w:val="decimal"/>
+      <w:lvlText w:val="%6."/>
+      <w:lvlJc w:val="left"/>
+      <w:pPr>
+        <w:tabs>
+          <w:tab w:val="num" w:pos="4320"/>
+        </w:tabs>
+        <w:ind w:left="4320" w:hanging="360"/>
+      </w:pPr>
+    </w:lvl>
+    <w:lvl w:ilvl="6" w:tentative="1">
+      <w:start w:val="1"/>
+      <w:numFmt w:val="decimal"/>
+      <w:lvlText w:val="%7."/>
+      <w:lvlJc w:val="left"/>
+      <w:pPr>
+        <w:tabs>
+          <w:tab w:val="num" w:pos="5040"/>
+        </w:tabs>
+        <w:ind w:left="5040" w:hanging="360"/>
+      </w:pPr>
+    </w:lvl>
+    <w:lvl w:ilvl="7" w:tentative="1">
+      <w:start w:val="1"/>
+      <w:numFmt w:val="decimal"/>
+      <w:lvlText w:val="%8."/>
+      <w:lvlJc w:val="left"/>
+      <w:pPr>
+        <w:tabs>
+          <w:tab w:val="num" w:pos="5760"/>
+        </w:tabs>
+        <w:ind w:left="5760" w:hanging="360"/>
+      </w:pPr>
+    </w:lvl>
+    <w:lvl w:ilvl="8" w:tentative="1">
+      <w:start w:val="1"/>
+      <w:numFmt w:val="decimal"/>
+      <w:lvlText w:val="%9."/>
+      <w:lvlJc w:val="left"/>
+      <w:pPr>
+        <w:tabs>
+          <w:tab w:val="num" w:pos="6480"/>
+        </w:tabs>
+        <w:ind w:left="6480" w:hanging="360"/>
+      </w:pPr>
+    </w:lvl>
+  </w:abstractNum>
+  <w:abstractNum w:abstractNumId="12" w15:restartNumberingAfterBreak="0">
     <w:nsid w:val="58B6073C"/>
     <w:multiLevelType w:val="hybridMultilevel"/>
     <w:tmpl w:val="76D2B1E8"/>
@@ -12860,7 +13710,156 @@
       </w:pPr>
     </w:lvl>
   </w:abstractNum>
-  <w:abstractNum w:abstractNumId="10" w15:restartNumberingAfterBreak="0">
+  <w:abstractNum w:abstractNumId="13" w15:restartNumberingAfterBreak="0">
+    <w:nsid w:val="5A3A352A"/>
+    <w:multiLevelType w:val="multilevel"/>
+    <w:tmpl w:val="866C41F0"/>
+    <w:lvl w:ilvl="0">
+      <w:start w:val="1"/>
+      <w:numFmt w:val="bullet"/>
+      <w:lvlText w:val=""/>
+      <w:lvlJc w:val="left"/>
+      <w:pPr>
+        <w:tabs>
+          <w:tab w:val="num" w:pos="720"/>
+        </w:tabs>
+        <w:ind w:left="720" w:hanging="360"/>
+      </w:pPr>
+      <w:rPr>
+        <w:rFonts w:ascii="Symbol" w:hAnsi="Symbol" w:hint="default"/>
+        <w:sz w:val="20"/>
+      </w:rPr>
+    </w:lvl>
+    <w:lvl w:ilvl="1" w:tentative="1">
+      <w:start w:val="1"/>
+      <w:numFmt w:val="bullet"/>
+      <w:lvlText w:val="o"/>
+      <w:lvlJc w:val="left"/>
+      <w:pPr>
+        <w:tabs>
+          <w:tab w:val="num" w:pos="1440"/>
+        </w:tabs>
+        <w:ind w:left="1440" w:hanging="360"/>
+      </w:pPr>
+      <w:rPr>
+        <w:rFonts w:ascii="Courier New" w:hAnsi="Courier New" w:hint="default"/>
+        <w:sz w:val="20"/>
+      </w:rPr>
+    </w:lvl>
+    <w:lvl w:ilvl="2" w:tentative="1">
+      <w:start w:val="1"/>
+      <w:numFmt w:val="bullet"/>
+      <w:lvlText w:val=""/>
+      <w:lvlJc w:val="left"/>
+      <w:pPr>
+        <w:tabs>
+          <w:tab w:val="num" w:pos="2160"/>
+        </w:tabs>
+        <w:ind w:left="2160" w:hanging="360"/>
+      </w:pPr>
+      <w:rPr>
+        <w:rFonts w:ascii="Wingdings" w:hAnsi="Wingdings" w:hint="default"/>
+        <w:sz w:val="20"/>
+      </w:rPr>
+    </w:lvl>
+    <w:lvl w:ilvl="3" w:tentative="1">
+      <w:start w:val="1"/>
+      <w:numFmt w:val="bullet"/>
+      <w:lvlText w:val=""/>
+      <w:lvlJc w:val="left"/>
+      <w:pPr>
+        <w:tabs>
+          <w:tab w:val="num" w:pos="2880"/>
+        </w:tabs>
+        <w:ind w:left="2880" w:hanging="360"/>
+      </w:pPr>
+      <w:rPr>
+        <w:rFonts w:ascii="Wingdings" w:hAnsi="Wingdings" w:hint="default"/>
+        <w:sz w:val="20"/>
+      </w:rPr>
+    </w:lvl>
+    <w:lvl w:ilvl="4" w:tentative="1">
+      <w:start w:val="1"/>
+      <w:numFmt w:val="bullet"/>
+      <w:lvlText w:val=""/>
+      <w:lvlJc w:val="left"/>
+      <w:pPr>
+        <w:tabs>
+          <w:tab w:val="num" w:pos="3600"/>
+        </w:tabs>
+        <w:ind w:left="3600" w:hanging="360"/>
+      </w:pPr>
+      <w:rPr>
+        <w:rFonts w:ascii="Wingdings" w:hAnsi="Wingdings" w:hint="default"/>
+        <w:sz w:val="20"/>
+      </w:rPr>
+    </w:lvl>
+    <w:lvl w:ilvl="5" w:tentative="1">
+      <w:start w:val="1"/>
+      <w:numFmt w:val="bullet"/>
+      <w:lvlText w:val=""/>
+      <w:lvlJc w:val="left"/>
+      <w:pPr>
+        <w:tabs>
+          <w:tab w:val="num" w:pos="4320"/>
+        </w:tabs>
+        <w:ind w:left="4320" w:hanging="360"/>
+      </w:pPr>
+      <w:rPr>
+        <w:rFonts w:ascii="Wingdings" w:hAnsi="Wingdings" w:hint="default"/>
+        <w:sz w:val="20"/>
+      </w:rPr>
+    </w:lvl>
+    <w:lvl w:ilvl="6" w:tentative="1">
+      <w:start w:val="1"/>
+      <w:numFmt w:val="bullet"/>
+      <w:lvlText w:val=""/>
+      <w:lvlJc w:val="left"/>
+      <w:pPr>
+        <w:tabs>
+          <w:tab w:val="num" w:pos="5040"/>
+        </w:tabs>
+        <w:ind w:left="5040" w:hanging="360"/>
+      </w:pPr>
+      <w:rPr>
+        <w:rFonts w:ascii="Wingdings" w:hAnsi="Wingdings" w:hint="default"/>
+        <w:sz w:val="20"/>
+      </w:rPr>
+    </w:lvl>
+    <w:lvl w:ilvl="7" w:tentative="1">
+      <w:start w:val="1"/>
+      <w:numFmt w:val="bullet"/>
+      <w:lvlText w:val=""/>
+      <w:lvlJc w:val="left"/>
+      <w:pPr>
+        <w:tabs>
+          <w:tab w:val="num" w:pos="5760"/>
+        </w:tabs>
+        <w:ind w:left="5760" w:hanging="360"/>
+      </w:pPr>
+      <w:rPr>
+        <w:rFonts w:ascii="Wingdings" w:hAnsi="Wingdings" w:hint="default"/>
+        <w:sz w:val="20"/>
+      </w:rPr>
+    </w:lvl>
+    <w:lvl w:ilvl="8" w:tentative="1">
+      <w:start w:val="1"/>
+      <w:numFmt w:val="bullet"/>
+      <w:lvlText w:val=""/>
+      <w:lvlJc w:val="left"/>
+      <w:pPr>
+        <w:tabs>
+          <w:tab w:val="num" w:pos="6480"/>
+        </w:tabs>
+        <w:ind w:left="6480" w:hanging="360"/>
+      </w:pPr>
+      <w:rPr>
+        <w:rFonts w:ascii="Wingdings" w:hAnsi="Wingdings" w:hint="default"/>
+        <w:sz w:val="20"/>
+      </w:rPr>
+    </w:lvl>
+  </w:abstractNum>
+  <w:abstractNum w:abstractNumId="14" w15:restartNumberingAfterBreak="0">
     <w:nsid w:val="5A72021A"/>
     <w:multiLevelType w:val="hybridMultilevel"/>
     <w:tmpl w:val="950A3152"/>
@@ -12949,7 +13948,7 @@
       </w:pPr>
     </w:lvl>
   </w:abstractNum>
-  <w:abstractNum w:abstractNumId="11" w15:restartNumberingAfterBreak="0">
+  <w:abstractNum w:abstractNumId="15" w15:restartNumberingAfterBreak="0">
     <w:nsid w:val="645C6F59"/>
     <w:multiLevelType w:val="multilevel"/>
     <w:tmpl w:val="0409001F"/>
@@ -13062,7 +14061,7 @@
       </w:pPr>
     </w:lvl>
   </w:abstractNum>
-  <w:abstractNum w:abstractNumId="12" w15:restartNumberingAfterBreak="0">
+  <w:abstractNum w:abstractNumId="16" w15:restartNumberingAfterBreak="0">
     <w:nsid w:val="702B612E"/>
     <w:multiLevelType w:val="hybridMultilevel"/>
     <w:tmpl w:val="55B6B25C"/>
@@ -13175,7 +14174,7 @@
       </w:pPr>
     </w:lvl>
   </w:abstractNum>
-  <w:abstractNum w:abstractNumId="13" w15:restartNumberingAfterBreak="0">
+  <w:abstractNum w:abstractNumId="17" w15:restartNumberingAfterBreak="0">
     <w:nsid w:val="75354ADD"/>
     <w:multiLevelType w:val="hybridMultilevel"/>
     <w:tmpl w:val="3B78D3BE"/>
@@ -13264,7 +14263,120 @@
       </w:pPr>
     </w:lvl>
   </w:abstractNum>
-  <w:abstractNum w:abstractNumId="14" w15:restartNumberingAfterBreak="0">
+  <w:abstractNum w:abstractNumId="18" w15:restartNumberingAfterBreak="0">
+    <w:nsid w:val="77F07DC3"/>
+    <w:multiLevelType w:val="multilevel"/>
+    <w:tmpl w:val="E4563290"/>
+    <w:lvl w:ilvl="0">
+      <w:start w:val="1"/>
+      <w:numFmt w:val="decimal"/>
+      <w:lvlText w:val="%1."/>
+      <w:lvlJc w:val="left"/>
+      <w:pPr>
+        <w:tabs>
+          <w:tab w:val="num" w:pos="720"/>
+        </w:tabs>
+        <w:ind w:left="720" w:hanging="360"/>
+      </w:pPr>
+    </w:lvl>
+    <w:lvl w:ilvl="1" w:tentative="1">
+      <w:start w:val="1"/>
+      <w:numFmt w:val="decimal"/>
+      <w:lvlText w:val="%2."/>
+      <w:lvlJc w:val="left"/>
+      <w:pPr>
+        <w:tabs>
+          <w:tab w:val="num" w:pos="1440"/>
+        </w:tabs>
+        <w:ind w:left="1440" w:hanging="360"/>
+      </w:pPr>
+    </w:lvl>
+    <w:lvl w:ilvl="2" w:tentative="1">
+      <w:start w:val="1"/>
+      <w:numFmt w:val="decimal"/>
+      <w:lvlText w:val="%3."/>
+      <w:lvlJc w:val="left"/>
+      <w:pPr>
+        <w:tabs>
+          <w:tab w:val="num" w:pos="2160"/>
+        </w:tabs>
+        <w:ind w:left="2160" w:hanging="360"/>
+      </w:pPr>
+    </w:lvl>
+    <w:lvl w:ilvl="3" w:tentative="1">
+      <w:start w:val="1"/>
+      <w:numFmt w:val="decimal"/>
+      <w:lvlText w:val="%4."/>
+      <w:lvlJc w:val="left"/>
+      <w:pPr>
+        <w:tabs>
+          <w:tab w:val="num" w:pos="2880"/>
+        </w:tabs>
+        <w:ind w:left="2880" w:hanging="360"/>
+      </w:pPr>
+    </w:lvl>
+    <w:lvl w:ilvl="4" w:tentative="1">
+      <w:start w:val="1"/>
+      <w:numFmt w:val="decimal"/>
+      <w:lvlText w:val="%5."/>
+      <w:lvlJc w:val="left"/>
+      <w:pPr>
+        <w:tabs>
+          <w:tab w:val="num" w:pos="3600"/>
+        </w:tabs>
+        <w:ind w:left="3600" w:hanging="360"/>
+      </w:pPr>
+    </w:lvl>
+    <w:lvl w:ilvl="5" w:tentative="1">
+      <w:start w:val="1"/>
+      <w:numFmt w:val="decimal"/>
+      <w:lvlText w:val="%6."/>
+      <w:lvlJc w:val="left"/>
+      <w:pPr>
+        <w:tabs>
+          <w:tab w:val="num" w:pos="4320"/>
+        </w:tabs>
+        <w:ind w:left="4320" w:hanging="360"/>
+      </w:pPr>
+    </w:lvl>
+    <w:lvl w:ilvl="6" w:tentative="1">
+      <w:start w:val="1"/>
+      <w:numFmt w:val="decimal"/>
+      <w:lvlText w:val="%7."/>
+      <w:lvlJc w:val="left"/>
+      <w:pPr>
+        <w:tabs>
+          <w:tab w:val="num" w:pos="5040"/>
+        </w:tabs>
+        <w:ind w:left="5040" w:hanging="360"/>
+      </w:pPr>
+    </w:lvl>
+    <w:lvl w:ilvl="7" w:tentative="1">
+      <w:start w:val="1"/>
+      <w:numFmt w:val="decimal"/>
+      <w:lvlText w:val="%8."/>
+      <w:lvlJc w:val="left"/>
+      <w:pPr>
+        <w:tabs>
+          <w:tab w:val="num" w:pos="5760"/>
+        </w:tabs>
+        <w:ind w:left="5760" w:hanging="360"/>
+      </w:pPr>
+    </w:lvl>
+    <w:lvl w:ilvl="8" w:tentative="1">
+      <w:start w:val="1"/>
+      <w:numFmt w:val="decimal"/>
+      <w:lvlText w:val="%9."/>
+      <w:lvlJc w:val="left"/>
+      <w:pPr>
+        <w:tabs>
+          <w:tab w:val="num" w:pos="6480"/>
+        </w:tabs>
+        <w:ind w:left="6480" w:hanging="360"/>
+      </w:pPr>
+    </w:lvl>
+  </w:abstractNum>
+  <w:abstractNum w:abstractNumId="19" w15:restartNumberingAfterBreak="0">
     <w:nsid w:val="7EC525C6"/>
     <w:multiLevelType w:val="hybridMultilevel"/>
     <w:tmpl w:val="C3288FE2"/>
@@ -13354,10 +14466,10 @@
     </w:lvl>
   </w:abstractNum>
   <w:num w:numId="1" w16cid:durableId="248541676">
-    <w:abstractNumId w:val="6"/>
+    <w:abstractNumId w:val="8"/>
   </w:num>
   <w:num w:numId="2" w16cid:durableId="2059939091">
-    <w:abstractNumId w:val="12"/>
+    <w:abstractNumId w:val="16"/>
     <w:lvlOverride w:ilvl="0">
       <w:startOverride w:val="1"/>
     </w:lvlOverride>
@@ -13387,7 +14499,7 @@
     </w:lvlOverride>
   </w:num>
   <w:num w:numId="3" w16cid:durableId="1198275604">
-    <w:abstractNumId w:val="11"/>
+    <w:abstractNumId w:val="15"/>
     <w:lvlOverride w:ilvl="0">
       <w:startOverride w:val="1"/>
     </w:lvlOverride>
@@ -13417,19 +14529,19 @@
     </w:lvlOverride>
   </w:num>
   <w:num w:numId="4" w16cid:durableId="1050543667">
-    <w:abstractNumId w:val="8"/>
+    <w:abstractNumId w:val="10"/>
   </w:num>
   <w:num w:numId="5" w16cid:durableId="1710840646">
-    <w:abstractNumId w:val="4"/>
+    <w:abstractNumId w:val="5"/>
   </w:num>
   <w:num w:numId="6" w16cid:durableId="1272662920">
-    <w:abstractNumId w:val="13"/>
+    <w:abstractNumId w:val="17"/>
   </w:num>
   <w:num w:numId="7" w16cid:durableId="154223238">
     <w:abstractNumId w:val="0"/>
   </w:num>
   <w:num w:numId="8" w16cid:durableId="383867020">
-    <w:abstractNumId w:val="9"/>
+    <w:abstractNumId w:val="12"/>
   </w:num>
   <w:num w:numId="9" w16cid:durableId="1112747623">
     <w:abstractNumId w:val="1"/>
@@ -13438,19 +14550,34 @@
     <w:abstractNumId w:val="3"/>
   </w:num>
   <w:num w:numId="11" w16cid:durableId="1497575434">
-    <w:abstractNumId w:val="5"/>
+    <w:abstractNumId w:val="7"/>
   </w:num>
   <w:num w:numId="12" w16cid:durableId="470252826">
     <w:abstractNumId w:val="2"/>
   </w:num>
   <w:num w:numId="13" w16cid:durableId="668674593">
+    <w:abstractNumId w:val="19"/>
+  </w:num>
+  <w:num w:numId="14" w16cid:durableId="837234272">
+    <w:abstractNumId w:val="9"/>
+  </w:num>
+  <w:num w:numId="15" w16cid:durableId="77486461">
     <w:abstractNumId w:val="14"/>
   </w:num>
-  <w:num w:numId="14" w16cid:durableId="837234272">
-    <w:abstractNumId w:val="7"/>
+  <w:num w:numId="16" w16cid:durableId="2118333712">
+    <w:abstractNumId w:val="13"/>
   </w:num>
-  <w:num w:numId="15" w16cid:durableId="77486461">
-    <w:abstractNumId w:val="10"/>
+  <w:num w:numId="17" w16cid:durableId="1056049655">
+    <w:abstractNumId w:val="6"/>
+  </w:num>
+  <w:num w:numId="18" w16cid:durableId="1447851014">
+    <w:abstractNumId w:val="4"/>
+  </w:num>
+  <w:num w:numId="19" w16cid:durableId="379213098">
+    <w:abstractNumId w:val="11"/>
+  </w:num>
+  <w:num w:numId="20" w16cid:durableId="357052288">
+    <w:abstractNumId w:val="18"/>
   </w:num>
 </w:numbering>
 </file>
@@ -14054,7 +15181,6 @@
   <w:style w:type="character" w:default="1" w:styleId="DefaultParagraphFont">
     <w:name w:val="Default Paragraph Font"/>
     <w:uiPriority w:val="1"/>
-    <w:semiHidden/>
     <w:unhideWhenUsed/>
   </w:style>
   <w:style w:type="table" w:default="1" w:styleId="TableNormal">

</xml_diff>

<commit_message>
Final changes to BRD, v1 complete
</commit_message>
<xml_diff>
--- a/docs/project-management/02_Business_Requirements/BRDv0.2-Northwind-Outdoors-03082026.docx
+++ b/docs/project-management/02_Business_Requirements/BRDv0.2-Northwind-Outdoors-03082026.docx
@@ -15118,9 +15118,1171 @@
       <w:bookmarkStart w:id="26" w:name="_Toc236778381"/>
       <w:r>
         <w:lastRenderedPageBreak/>
-        <w:t>Risks</w:t>
+        <w:t>Risk</w:t>
       </w:r>
       <w:bookmarkEnd w:id="26"/>
+      <w:r>
+        <w:t>s</w:t>
+      </w:r>
+    </w:p>
+    <w:p>
+      <w:r>
+        <w:t>The following risks have been identified during the discovery and requirements-gathering activities. Risks will be reviewed throughout the project and may be added, amended, or closed as the project progresses.</w:t>
+      </w:r>
+    </w:p>
+    <w:tbl>
+      <w:tblPr>
+        <w:tblStyle w:val="TableGrid"/>
+        <w:tblW w:w="10774" w:type="dxa"/>
+        <w:tblInd w:w="-998" w:type="dxa"/>
+        <w:tblLayout w:type="fixed"/>
+        <w:tblLook w:val="04A0" w:firstRow="1" w:lastRow="0" w:firstColumn="1" w:lastColumn="0" w:noHBand="0" w:noVBand="1"/>
+      </w:tblPr>
+      <w:tblGrid>
+        <w:gridCol w:w="783"/>
+        <w:gridCol w:w="2762"/>
+        <w:gridCol w:w="1004"/>
+        <w:gridCol w:w="1261"/>
+        <w:gridCol w:w="3405"/>
+        <w:gridCol w:w="1559"/>
+      </w:tblGrid>
+      <w:tr>
+        <w:trPr>
+          <w:trHeight w:val="289"/>
+        </w:trPr>
+        <w:tc>
+          <w:tcPr>
+            <w:tcW w:w="783" w:type="dxa"/>
+            <w:hideMark/>
+          </w:tcPr>
+          <w:p>
+            <w:pPr>
+              <w:rPr>
+                <w:b/>
+                <w:bCs/>
+              </w:rPr>
+            </w:pPr>
+            <w:r>
+              <w:rPr>
+                <w:b/>
+                <w:bCs/>
+              </w:rPr>
+              <w:t>ID</w:t>
+            </w:r>
+          </w:p>
+        </w:tc>
+        <w:tc>
+          <w:tcPr>
+            <w:tcW w:w="2762" w:type="dxa"/>
+            <w:hideMark/>
+          </w:tcPr>
+          <w:p>
+            <w:pPr>
+              <w:rPr>
+                <w:b/>
+                <w:bCs/>
+              </w:rPr>
+            </w:pPr>
+            <w:r>
+              <w:rPr>
+                <w:b/>
+                <w:bCs/>
+              </w:rPr>
+              <w:t>Risk</w:t>
+            </w:r>
+          </w:p>
+        </w:tc>
+        <w:tc>
+          <w:tcPr>
+            <w:tcW w:w="1004" w:type="dxa"/>
+            <w:hideMark/>
+          </w:tcPr>
+          <w:p>
+            <w:pPr>
+              <w:rPr>
+                <w:b/>
+                <w:bCs/>
+              </w:rPr>
+            </w:pPr>
+            <w:r>
+              <w:rPr>
+                <w:b/>
+                <w:bCs/>
+              </w:rPr>
+              <w:t>Impact</w:t>
+            </w:r>
+          </w:p>
+        </w:tc>
+        <w:tc>
+          <w:tcPr>
+            <w:tcW w:w="1261" w:type="dxa"/>
+            <w:hideMark/>
+          </w:tcPr>
+          <w:p>
+            <w:pPr>
+              <w:rPr>
+                <w:b/>
+                <w:bCs/>
+              </w:rPr>
+            </w:pPr>
+            <w:r>
+              <w:rPr>
+                <w:b/>
+                <w:bCs/>
+              </w:rPr>
+              <w:t>Likelihood</w:t>
+            </w:r>
+          </w:p>
+        </w:tc>
+        <w:tc>
+          <w:tcPr>
+            <w:tcW w:w="3405" w:type="dxa"/>
+            <w:hideMark/>
+          </w:tcPr>
+          <w:p>
+            <w:pPr>
+              <w:rPr>
+                <w:b/>
+                <w:bCs/>
+              </w:rPr>
+            </w:pPr>
+            <w:r>
+              <w:rPr>
+                <w:b/>
+                <w:bCs/>
+              </w:rPr>
+              <w:t>Mitigation / Response</w:t>
+            </w:r>
+          </w:p>
+        </w:tc>
+        <w:tc>
+          <w:tcPr>
+            <w:tcW w:w="1559" w:type="dxa"/>
+            <w:hideMark/>
+          </w:tcPr>
+          <w:p>
+            <w:pPr>
+              <w:rPr>
+                <w:b/>
+                <w:bCs/>
+              </w:rPr>
+            </w:pPr>
+            <w:r>
+              <w:rPr>
+                <w:b/>
+                <w:bCs/>
+              </w:rPr>
+              <w:t>Owner</w:t>
+            </w:r>
+          </w:p>
+        </w:tc>
+      </w:tr>
+      <w:tr>
+        <w:trPr>
+          <w:trHeight w:val="900"/>
+        </w:trPr>
+        <w:tc>
+          <w:tcPr>
+            <w:tcW w:w="783" w:type="dxa"/>
+            <w:hideMark/>
+          </w:tcPr>
+          <w:p>
+            <w:pPr>
+              <w:rPr>
+                <w:b/>
+                <w:bCs/>
+              </w:rPr>
+            </w:pPr>
+            <w:r>
+              <w:rPr>
+                <w:b/>
+                <w:bCs/>
+              </w:rPr>
+              <w:t>R-001</w:t>
+            </w:r>
+          </w:p>
+        </w:tc>
+        <w:tc>
+          <w:tcPr>
+            <w:tcW w:w="2762" w:type="dxa"/>
+            <w:hideMark/>
+          </w:tcPr>
+          <w:p>
+            <w:r>
+              <w:t>Incomplete or inaccurate information about the existing IT environment may result in inappropriate design decisions.</w:t>
+            </w:r>
+          </w:p>
+        </w:tc>
+        <w:tc>
+          <w:tcPr>
+            <w:tcW w:w="1004" w:type="dxa"/>
+            <w:hideMark/>
+          </w:tcPr>
+          <w:p>
+            <w:r>
+              <w:t>High</w:t>
+            </w:r>
+          </w:p>
+        </w:tc>
+        <w:tc>
+          <w:tcPr>
+            <w:tcW w:w="1261" w:type="dxa"/>
+            <w:hideMark/>
+          </w:tcPr>
+          <w:p>
+            <w:r>
+              <w:t>Medium</w:t>
+            </w:r>
+          </w:p>
+        </w:tc>
+        <w:tc>
+          <w:tcPr>
+            <w:tcW w:w="3405" w:type="dxa"/>
+            <w:hideMark/>
+          </w:tcPr>
+          <w:p>
+            <w:r>
+              <w:t>Obtain and validate the Northwind asset and infrastructure baseline before detailed design. Record identified information gaps and assumptions.</w:t>
+            </w:r>
+          </w:p>
+        </w:tc>
+        <w:tc>
+          <w:tcPr>
+            <w:tcW w:w="1559" w:type="dxa"/>
+            <w:hideMark/>
+          </w:tcPr>
+          <w:p>
+            <w:r>
+              <w:t>IT Manager</w:t>
+            </w:r>
+          </w:p>
+        </w:tc>
+      </w:tr>
+      <w:tr>
+        <w:trPr>
+          <w:trHeight w:val="900"/>
+        </w:trPr>
+        <w:tc>
+          <w:tcPr>
+            <w:tcW w:w="783" w:type="dxa"/>
+            <w:hideMark/>
+          </w:tcPr>
+          <w:p>
+            <w:pPr>
+              <w:rPr>
+                <w:b/>
+                <w:bCs/>
+              </w:rPr>
+            </w:pPr>
+            <w:r>
+              <w:rPr>
+                <w:b/>
+                <w:bCs/>
+              </w:rPr>
+              <w:t>R-002</w:t>
+            </w:r>
+          </w:p>
+        </w:tc>
+        <w:tc>
+          <w:tcPr>
+            <w:tcW w:w="2762" w:type="dxa"/>
+            <w:hideMark/>
+          </w:tcPr>
+          <w:p>
+            <w:r>
+              <w:t>Implementation activities may disrupt business-critical services or employee productivity.</w:t>
+            </w:r>
+          </w:p>
+        </w:tc>
+        <w:tc>
+          <w:tcPr>
+            <w:tcW w:w="1004" w:type="dxa"/>
+            <w:hideMark/>
+          </w:tcPr>
+          <w:p>
+            <w:r>
+              <w:t>High</w:t>
+            </w:r>
+          </w:p>
+        </w:tc>
+        <w:tc>
+          <w:tcPr>
+            <w:tcW w:w="1261" w:type="dxa"/>
+            <w:hideMark/>
+          </w:tcPr>
+          <w:p>
+            <w:r>
+              <w:t>Medium</w:t>
+            </w:r>
+          </w:p>
+        </w:tc>
+        <w:tc>
+          <w:tcPr>
+            <w:tcW w:w="3405" w:type="dxa"/>
+            <w:hideMark/>
+          </w:tcPr>
+          <w:p>
+            <w:r>
+              <w:t>Use controlled implementation plans, testing, maintenance windows, migration planning and appropriate rollback procedures.</w:t>
+            </w:r>
+          </w:p>
+        </w:tc>
+        <w:tc>
+          <w:tcPr>
+            <w:tcW w:w="1559" w:type="dxa"/>
+            <w:hideMark/>
+          </w:tcPr>
+          <w:p>
+            <w:r>
+              <w:t>Redstone / IT Manager</w:t>
+            </w:r>
+          </w:p>
+        </w:tc>
+      </w:tr>
+      <w:tr>
+        <w:trPr>
+          <w:trHeight w:val="900"/>
+        </w:trPr>
+        <w:tc>
+          <w:tcPr>
+            <w:tcW w:w="783" w:type="dxa"/>
+            <w:hideMark/>
+          </w:tcPr>
+          <w:p>
+            <w:pPr>
+              <w:rPr>
+                <w:b/>
+                <w:bCs/>
+              </w:rPr>
+            </w:pPr>
+            <w:r>
+              <w:rPr>
+                <w:b/>
+                <w:bCs/>
+              </w:rPr>
+              <w:t>R-003</w:t>
+            </w:r>
+          </w:p>
+        </w:tc>
+        <w:tc>
+          <w:tcPr>
+            <w:tcW w:w="2762" w:type="dxa"/>
+            <w:hideMark/>
+          </w:tcPr>
+          <w:p>
+            <w:r>
+              <w:t>Insufficient availability of Northwind personnel may delay requirements validation, UAT, approvals or implementation.</w:t>
+            </w:r>
+          </w:p>
+        </w:tc>
+        <w:tc>
+          <w:tcPr>
+            <w:tcW w:w="1004" w:type="dxa"/>
+            <w:hideMark/>
+          </w:tcPr>
+          <w:p>
+            <w:r>
+              <w:t>Medium</w:t>
+            </w:r>
+          </w:p>
+        </w:tc>
+        <w:tc>
+          <w:tcPr>
+            <w:tcW w:w="1261" w:type="dxa"/>
+            <w:hideMark/>
+          </w:tcPr>
+          <w:p>
+            <w:r>
+              <w:t>Medium</w:t>
+            </w:r>
+          </w:p>
+        </w:tc>
+        <w:tc>
+          <w:tcPr>
+            <w:tcW w:w="3405" w:type="dxa"/>
+            <w:hideMark/>
+          </w:tcPr>
+          <w:p>
+            <w:r>
+              <w:t>Identify nominated stakeholders and SMEs early and agree availability as part of project planning.</w:t>
+            </w:r>
+          </w:p>
+        </w:tc>
+        <w:tc>
+          <w:tcPr>
+            <w:tcW w:w="1559" w:type="dxa"/>
+            <w:hideMark/>
+          </w:tcPr>
+          <w:p>
+            <w:r>
+              <w:t>Operations Director</w:t>
+            </w:r>
+          </w:p>
+        </w:tc>
+      </w:tr>
+      <w:tr>
+        <w:trPr>
+          <w:trHeight w:val="600"/>
+        </w:trPr>
+        <w:tc>
+          <w:tcPr>
+            <w:tcW w:w="783" w:type="dxa"/>
+            <w:hideMark/>
+          </w:tcPr>
+          <w:p>
+            <w:pPr>
+              <w:rPr>
+                <w:b/>
+                <w:bCs/>
+              </w:rPr>
+            </w:pPr>
+            <w:r>
+              <w:rPr>
+                <w:b/>
+                <w:bCs/>
+              </w:rPr>
+              <w:t>R-004</w:t>
+            </w:r>
+          </w:p>
+        </w:tc>
+        <w:tc>
+          <w:tcPr>
+            <w:tcW w:w="2762" w:type="dxa"/>
+            <w:hideMark/>
+          </w:tcPr>
+          <w:p>
+            <w:r>
+              <w:t>Budget constraints may prevent all identified requirements from being delivered within the initial scope.</w:t>
+            </w:r>
+          </w:p>
+        </w:tc>
+        <w:tc>
+          <w:tcPr>
+            <w:tcW w:w="1004" w:type="dxa"/>
+            <w:hideMark/>
+          </w:tcPr>
+          <w:p>
+            <w:r>
+              <w:t>High</w:t>
+            </w:r>
+          </w:p>
+        </w:tc>
+        <w:tc>
+          <w:tcPr>
+            <w:tcW w:w="1261" w:type="dxa"/>
+            <w:hideMark/>
+          </w:tcPr>
+          <w:p>
+            <w:r>
+              <w:t>Medium</w:t>
+            </w:r>
+          </w:p>
+        </w:tc>
+        <w:tc>
+          <w:tcPr>
+            <w:tcW w:w="3405" w:type="dxa"/>
+            <w:hideMark/>
+          </w:tcPr>
+          <w:p>
+            <w:r>
+              <w:t xml:space="preserve">Apply </w:t>
+            </w:r>
+            <w:proofErr w:type="spellStart"/>
+            <w:r>
+              <w:t>MoSCoW</w:t>
+            </w:r>
+            <w:proofErr w:type="spellEnd"/>
+            <w:r>
+              <w:t xml:space="preserve"> prioritisation and evaluate solution options and costs during design.</w:t>
+            </w:r>
+          </w:p>
+        </w:tc>
+        <w:tc>
+          <w:tcPr>
+            <w:tcW w:w="1559" w:type="dxa"/>
+            <w:hideMark/>
+          </w:tcPr>
+          <w:p>
+            <w:r>
+              <w:t>Executive Sponsor</w:t>
+            </w:r>
+          </w:p>
+        </w:tc>
+      </w:tr>
+      <w:tr>
+        <w:trPr>
+          <w:trHeight w:val="600"/>
+        </w:trPr>
+        <w:tc>
+          <w:tcPr>
+            <w:tcW w:w="783" w:type="dxa"/>
+            <w:hideMark/>
+          </w:tcPr>
+          <w:p>
+            <w:pPr>
+              <w:rPr>
+                <w:b/>
+                <w:bCs/>
+              </w:rPr>
+            </w:pPr>
+            <w:r>
+              <w:rPr>
+                <w:b/>
+                <w:bCs/>
+              </w:rPr>
+              <w:t>R-005</w:t>
+            </w:r>
+          </w:p>
+        </w:tc>
+        <w:tc>
+          <w:tcPr>
+            <w:tcW w:w="2762" w:type="dxa"/>
+            <w:hideMark/>
+          </w:tcPr>
+          <w:p>
+            <w:r>
+              <w:t>Existing applications or infrastructure may introduce compatibility or integration limitations.</w:t>
+            </w:r>
+          </w:p>
+        </w:tc>
+        <w:tc>
+          <w:tcPr>
+            <w:tcW w:w="1004" w:type="dxa"/>
+            <w:hideMark/>
+          </w:tcPr>
+          <w:p>
+            <w:r>
+              <w:t>High</w:t>
+            </w:r>
+          </w:p>
+        </w:tc>
+        <w:tc>
+          <w:tcPr>
+            <w:tcW w:w="1261" w:type="dxa"/>
+            <w:hideMark/>
+          </w:tcPr>
+          <w:p>
+            <w:r>
+              <w:t>Medium</w:t>
+            </w:r>
+          </w:p>
+        </w:tc>
+        <w:tc>
+          <w:tcPr>
+            <w:tcW w:w="3405" w:type="dxa"/>
+            <w:hideMark/>
+          </w:tcPr>
+          <w:p>
+            <w:r>
+              <w:t>Assess dependencies during HLD and detailed design and validate integration requirements before implementation.</w:t>
+            </w:r>
+          </w:p>
+        </w:tc>
+        <w:tc>
+          <w:tcPr>
+            <w:tcW w:w="1559" w:type="dxa"/>
+            <w:hideMark/>
+          </w:tcPr>
+          <w:p>
+            <w:r>
+              <w:t>IT Manager</w:t>
+            </w:r>
+          </w:p>
+        </w:tc>
+      </w:tr>
+      <w:tr>
+        <w:trPr>
+          <w:trHeight w:val="900"/>
+        </w:trPr>
+        <w:tc>
+          <w:tcPr>
+            <w:tcW w:w="783" w:type="dxa"/>
+            <w:hideMark/>
+          </w:tcPr>
+          <w:p>
+            <w:pPr>
+              <w:rPr>
+                <w:b/>
+                <w:bCs/>
+              </w:rPr>
+            </w:pPr>
+            <w:r>
+              <w:rPr>
+                <w:b/>
+                <w:bCs/>
+              </w:rPr>
+              <w:t>R-006</w:t>
+            </w:r>
+          </w:p>
+        </w:tc>
+        <w:tc>
+          <w:tcPr>
+            <w:tcW w:w="2762" w:type="dxa"/>
+            <w:hideMark/>
+          </w:tcPr>
+          <w:p>
+            <w:r>
+              <w:t>Recovery objectives may not be achievable with the existing or proposed architecture without additional investment.</w:t>
+            </w:r>
+          </w:p>
+        </w:tc>
+        <w:tc>
+          <w:tcPr>
+            <w:tcW w:w="1004" w:type="dxa"/>
+            <w:hideMark/>
+          </w:tcPr>
+          <w:p>
+            <w:r>
+              <w:t>High</w:t>
+            </w:r>
+          </w:p>
+        </w:tc>
+        <w:tc>
+          <w:tcPr>
+            <w:tcW w:w="1261" w:type="dxa"/>
+            <w:hideMark/>
+          </w:tcPr>
+          <w:p>
+            <w:r>
+              <w:t>Medium</w:t>
+            </w:r>
+          </w:p>
+        </w:tc>
+        <w:tc>
+          <w:tcPr>
+            <w:tcW w:w="3405" w:type="dxa"/>
+            <w:hideMark/>
+          </w:tcPr>
+          <w:p>
+            <w:r>
+              <w:t>Confirm service-specific RTO/RPO requirements and evaluate appropriate backup, recovery and resilience options during design.</w:t>
+            </w:r>
+          </w:p>
+        </w:tc>
+        <w:tc>
+          <w:tcPr>
+            <w:tcW w:w="1559" w:type="dxa"/>
+            <w:hideMark/>
+          </w:tcPr>
+          <w:p>
+            <w:r>
+              <w:t>IT Manager</w:t>
+            </w:r>
+          </w:p>
+        </w:tc>
+      </w:tr>
+      <w:tr>
+        <w:trPr>
+          <w:trHeight w:val="900"/>
+        </w:trPr>
+        <w:tc>
+          <w:tcPr>
+            <w:tcW w:w="783" w:type="dxa"/>
+            <w:hideMark/>
+          </w:tcPr>
+          <w:p>
+            <w:pPr>
+              <w:rPr>
+                <w:b/>
+                <w:bCs/>
+              </w:rPr>
+            </w:pPr>
+            <w:r>
+              <w:rPr>
+                <w:b/>
+                <w:bCs/>
+              </w:rPr>
+              <w:t>R-007</w:t>
+            </w:r>
+          </w:p>
+        </w:tc>
+        <w:tc>
+          <w:tcPr>
+            <w:tcW w:w="2762" w:type="dxa"/>
+            <w:hideMark/>
+          </w:tcPr>
+          <w:p>
+            <w:r>
+              <w:t>Introduction of High Availability or other resilience capabilities may introduce disproportionate cost or operational complexity.</w:t>
+            </w:r>
+          </w:p>
+        </w:tc>
+        <w:tc>
+          <w:tcPr>
+            <w:tcW w:w="1004" w:type="dxa"/>
+            <w:hideMark/>
+          </w:tcPr>
+          <w:p>
+            <w:r>
+              <w:t>Medium</w:t>
+            </w:r>
+          </w:p>
+        </w:tc>
+        <w:tc>
+          <w:tcPr>
+            <w:tcW w:w="1261" w:type="dxa"/>
+            <w:hideMark/>
+          </w:tcPr>
+          <w:p>
+            <w:r>
+              <w:t>Medium</w:t>
+            </w:r>
+          </w:p>
+        </w:tc>
+        <w:tc>
+          <w:tcPr>
+            <w:tcW w:w="3405" w:type="dxa"/>
+            <w:hideMark/>
+          </w:tcPr>
+          <w:p>
+            <w:r>
+              <w:t>Evaluate resilience options against business criticality, risk, cost and operational capability before making a recommendation.</w:t>
+            </w:r>
+          </w:p>
+        </w:tc>
+        <w:tc>
+          <w:tcPr>
+            <w:tcW w:w="1559" w:type="dxa"/>
+            <w:hideMark/>
+          </w:tcPr>
+          <w:p>
+            <w:r>
+              <w:t>Operations Director</w:t>
+            </w:r>
+          </w:p>
+        </w:tc>
+      </w:tr>
+      <w:tr>
+        <w:trPr>
+          <w:trHeight w:val="600"/>
+        </w:trPr>
+        <w:tc>
+          <w:tcPr>
+            <w:tcW w:w="783" w:type="dxa"/>
+            <w:hideMark/>
+          </w:tcPr>
+          <w:p>
+            <w:pPr>
+              <w:rPr>
+                <w:b/>
+                <w:bCs/>
+              </w:rPr>
+            </w:pPr>
+            <w:r>
+              <w:rPr>
+                <w:b/>
+                <w:bCs/>
+              </w:rPr>
+              <w:t>R-008</w:t>
+            </w:r>
+          </w:p>
+        </w:tc>
+        <w:tc>
+          <w:tcPr>
+            <w:tcW w:w="2762" w:type="dxa"/>
+            <w:hideMark/>
+          </w:tcPr>
+          <w:p>
+            <w:r>
+              <w:t>Changes may be implemented without sufficient testing, increasing the risk of service failure.</w:t>
+            </w:r>
+          </w:p>
+        </w:tc>
+        <w:tc>
+          <w:tcPr>
+            <w:tcW w:w="1004" w:type="dxa"/>
+            <w:hideMark/>
+          </w:tcPr>
+          <w:p>
+            <w:r>
+              <w:t>High</w:t>
+            </w:r>
+          </w:p>
+        </w:tc>
+        <w:tc>
+          <w:tcPr>
+            <w:tcW w:w="1261" w:type="dxa"/>
+            <w:hideMark/>
+          </w:tcPr>
+          <w:p>
+            <w:r>
+              <w:t>Medium</w:t>
+            </w:r>
+          </w:p>
+        </w:tc>
+        <w:tc>
+          <w:tcPr>
+            <w:tcW w:w="3405" w:type="dxa"/>
+            <w:hideMark/>
+          </w:tcPr>
+          <w:p>
+            <w:r>
+              <w:t>Establish controlled testing and, where practical, sandbox validation before production deployment.</w:t>
+            </w:r>
+          </w:p>
+        </w:tc>
+        <w:tc>
+          <w:tcPr>
+            <w:tcW w:w="1559" w:type="dxa"/>
+            <w:hideMark/>
+          </w:tcPr>
+          <w:p>
+            <w:r>
+              <w:t>IT Manager</w:t>
+            </w:r>
+          </w:p>
+        </w:tc>
+      </w:tr>
+      <w:tr>
+        <w:trPr>
+          <w:trHeight w:val="900"/>
+        </w:trPr>
+        <w:tc>
+          <w:tcPr>
+            <w:tcW w:w="783" w:type="dxa"/>
+            <w:hideMark/>
+          </w:tcPr>
+          <w:p>
+            <w:pPr>
+              <w:rPr>
+                <w:b/>
+                <w:bCs/>
+              </w:rPr>
+            </w:pPr>
+            <w:r>
+              <w:rPr>
+                <w:b/>
+                <w:bCs/>
+              </w:rPr>
+              <w:t>R-009</w:t>
+            </w:r>
+          </w:p>
+        </w:tc>
+        <w:tc>
+          <w:tcPr>
+            <w:tcW w:w="2762" w:type="dxa"/>
+            <w:hideMark/>
+          </w:tcPr>
+          <w:p>
+            <w:r>
+              <w:t xml:space="preserve">Insufficient operational documentation or knowledge transfer may result in Northwind being unable to effectively </w:t>
+            </w:r>
+            <w:r>
+              <w:lastRenderedPageBreak/>
+              <w:t>operate or recover the resulting environment.</w:t>
+            </w:r>
+          </w:p>
+        </w:tc>
+        <w:tc>
+          <w:tcPr>
+            <w:tcW w:w="1004" w:type="dxa"/>
+            <w:hideMark/>
+          </w:tcPr>
+          <w:p>
+            <w:r>
+              <w:lastRenderedPageBreak/>
+              <w:t>High</w:t>
+            </w:r>
+          </w:p>
+        </w:tc>
+        <w:tc>
+          <w:tcPr>
+            <w:tcW w:w="1261" w:type="dxa"/>
+            <w:hideMark/>
+          </w:tcPr>
+          <w:p>
+            <w:r>
+              <w:t>Low</w:t>
+            </w:r>
+          </w:p>
+        </w:tc>
+        <w:tc>
+          <w:tcPr>
+            <w:tcW w:w="3405" w:type="dxa"/>
+            <w:hideMark/>
+          </w:tcPr>
+          <w:p>
+            <w:r>
+              <w:t>Include SOPs, technical runbooks, recovery procedures and knowledge transfer within delivery and handover activities.</w:t>
+            </w:r>
+          </w:p>
+        </w:tc>
+        <w:tc>
+          <w:tcPr>
+            <w:tcW w:w="1559" w:type="dxa"/>
+            <w:hideMark/>
+          </w:tcPr>
+          <w:p>
+            <w:r>
+              <w:t>Redstone / IT Manager</w:t>
+            </w:r>
+          </w:p>
+        </w:tc>
+      </w:tr>
+      <w:tr>
+        <w:trPr>
+          <w:trHeight w:val="900"/>
+        </w:trPr>
+        <w:tc>
+          <w:tcPr>
+            <w:tcW w:w="783" w:type="dxa"/>
+            <w:hideMark/>
+          </w:tcPr>
+          <w:p>
+            <w:pPr>
+              <w:rPr>
+                <w:b/>
+                <w:bCs/>
+              </w:rPr>
+            </w:pPr>
+            <w:r>
+              <w:rPr>
+                <w:b/>
+                <w:bCs/>
+              </w:rPr>
+              <w:t>R-010</w:t>
+            </w:r>
+          </w:p>
+        </w:tc>
+        <w:tc>
+          <w:tcPr>
+            <w:tcW w:w="2762" w:type="dxa"/>
+            <w:hideMark/>
+          </w:tcPr>
+          <w:p>
+            <w:r>
+              <w:t>Increased infrastructure complexity may create additional administrative overhead if solutions are not appropriately standardised.</w:t>
+            </w:r>
+          </w:p>
+        </w:tc>
+        <w:tc>
+          <w:tcPr>
+            <w:tcW w:w="1004" w:type="dxa"/>
+            <w:hideMark/>
+          </w:tcPr>
+          <w:p>
+            <w:r>
+              <w:t>Medium</w:t>
+            </w:r>
+          </w:p>
+        </w:tc>
+        <w:tc>
+          <w:tcPr>
+            <w:tcW w:w="1261" w:type="dxa"/>
+            <w:hideMark/>
+          </w:tcPr>
+          <w:p>
+            <w:r>
+              <w:t>Medium</w:t>
+            </w:r>
+          </w:p>
+        </w:tc>
+        <w:tc>
+          <w:tcPr>
+            <w:tcW w:w="3405" w:type="dxa"/>
+            <w:hideMark/>
+          </w:tcPr>
+          <w:p>
+            <w:r>
+              <w:t>Evaluate maintainability and operational impact as part of design decisions and favour appropriate standardisation.</w:t>
+            </w:r>
+          </w:p>
+        </w:tc>
+        <w:tc>
+          <w:tcPr>
+            <w:tcW w:w="1559" w:type="dxa"/>
+            <w:hideMark/>
+          </w:tcPr>
+          <w:p>
+            <w:r>
+              <w:t>IT Manager</w:t>
+            </w:r>
+          </w:p>
+        </w:tc>
+      </w:tr>
+      <w:tr>
+        <w:trPr>
+          <w:trHeight w:val="900"/>
+        </w:trPr>
+        <w:tc>
+          <w:tcPr>
+            <w:tcW w:w="783" w:type="dxa"/>
+            <w:hideMark/>
+          </w:tcPr>
+          <w:p>
+            <w:pPr>
+              <w:rPr>
+                <w:b/>
+                <w:bCs/>
+              </w:rPr>
+            </w:pPr>
+            <w:r>
+              <w:rPr>
+                <w:b/>
+                <w:bCs/>
+              </w:rPr>
+              <w:t>R-011</w:t>
+            </w:r>
+          </w:p>
+        </w:tc>
+        <w:tc>
+          <w:tcPr>
+            <w:tcW w:w="2762" w:type="dxa"/>
+            <w:hideMark/>
+          </w:tcPr>
+          <w:p>
+            <w:r>
+              <w:t>Future organisational growth may exceed the capacity of the initial solution.</w:t>
+            </w:r>
+          </w:p>
+        </w:tc>
+        <w:tc>
+          <w:tcPr>
+            <w:tcW w:w="1004" w:type="dxa"/>
+            <w:hideMark/>
+          </w:tcPr>
+          <w:p>
+            <w:r>
+              <w:t>Medium</w:t>
+            </w:r>
+          </w:p>
+        </w:tc>
+        <w:tc>
+          <w:tcPr>
+            <w:tcW w:w="1261" w:type="dxa"/>
+            <w:hideMark/>
+          </w:tcPr>
+          <w:p>
+            <w:r>
+              <w:t>Low</w:t>
+            </w:r>
+          </w:p>
+        </w:tc>
+        <w:tc>
+          <w:tcPr>
+            <w:tcW w:w="3405" w:type="dxa"/>
+            <w:hideMark/>
+          </w:tcPr>
+          <w:p>
+            <w:r>
+              <w:t>Incorporate current and anticipated growth into capacity and scalability decisions and establish ongoing capacity management.</w:t>
+            </w:r>
+          </w:p>
+        </w:tc>
+        <w:tc>
+          <w:tcPr>
+            <w:tcW w:w="1559" w:type="dxa"/>
+            <w:hideMark/>
+          </w:tcPr>
+          <w:p>
+            <w:r>
+              <w:t>Operations Director</w:t>
+            </w:r>
+          </w:p>
+        </w:tc>
+      </w:tr>
+      <w:tr>
+        <w:trPr>
+          <w:trHeight w:val="600"/>
+        </w:trPr>
+        <w:tc>
+          <w:tcPr>
+            <w:tcW w:w="783" w:type="dxa"/>
+            <w:hideMark/>
+          </w:tcPr>
+          <w:p>
+            <w:pPr>
+              <w:rPr>
+                <w:b/>
+                <w:bCs/>
+              </w:rPr>
+            </w:pPr>
+            <w:r>
+              <w:rPr>
+                <w:b/>
+                <w:bCs/>
+              </w:rPr>
+              <w:t>R-012</w:t>
+            </w:r>
+          </w:p>
+        </w:tc>
+        <w:tc>
+          <w:tcPr>
+            <w:tcW w:w="2762" w:type="dxa"/>
+            <w:hideMark/>
+          </w:tcPr>
+          <w:p>
+            <w:r>
+              <w:t>Security weaknesses may remain undetected if monitoring, logging and operational processes are insufficient.</w:t>
+            </w:r>
+          </w:p>
+        </w:tc>
+        <w:tc>
+          <w:tcPr>
+            <w:tcW w:w="1004" w:type="dxa"/>
+            <w:hideMark/>
+          </w:tcPr>
+          <w:p>
+            <w:r>
+              <w:t>High</w:t>
+            </w:r>
+          </w:p>
+        </w:tc>
+        <w:tc>
+          <w:tcPr>
+            <w:tcW w:w="1261" w:type="dxa"/>
+            <w:hideMark/>
+          </w:tcPr>
+          <w:p>
+            <w:r>
+              <w:t>Medium</w:t>
+            </w:r>
+          </w:p>
+        </w:tc>
+        <w:tc>
+          <w:tcPr>
+            <w:tcW w:w="3405" w:type="dxa"/>
+            <w:hideMark/>
+          </w:tcPr>
+          <w:p>
+            <w:r>
+              <w:t>Implement appropriate security monitoring, centralised logging, access controls and operational review processes.</w:t>
+            </w:r>
+          </w:p>
+        </w:tc>
+        <w:tc>
+          <w:tcPr>
+            <w:tcW w:w="1559" w:type="dxa"/>
+            <w:hideMark/>
+          </w:tcPr>
+          <w:p>
+            <w:r>
+              <w:t>IT Manager</w:t>
+            </w:r>
+          </w:p>
+        </w:tc>
+      </w:tr>
+    </w:tbl>
+    <w:p/>
+    <w:p/>
+    <w:p>
+      <w:pPr>
+        <w:pStyle w:val="Heading2"/>
+        <w:numPr>
+          <w:ilvl w:val="0"/>
+          <w:numId w:val="14"/>
+        </w:numPr>
+      </w:pPr>
+      <w:bookmarkStart w:id="27" w:name="_Toc236778382"/>
+      <w:r>
+        <w:t>Success Criteria</w:t>
+      </w:r>
+      <w:bookmarkEnd w:id="27"/>
+    </w:p>
+    <w:p>
+      <w:r>
+        <w:t>The project will be considered successful when the following outcomes have been achieved and formally accepted by Northwind Outdoor Ltd.</w:t>
+      </w:r>
     </w:p>
     <w:tbl>
       <w:tblPr>
@@ -15129,9 +16291,9 @@
         <w:tblLook w:val="04A0" w:firstRow="1" w:lastRow="0" w:firstColumn="1" w:lastColumn="0" w:noHBand="0" w:noVBand="1"/>
       </w:tblPr>
       <w:tblGrid>
-        <w:gridCol w:w="601"/>
-        <w:gridCol w:w="4568"/>
-        <w:gridCol w:w="3891"/>
+        <w:gridCol w:w="723"/>
+        <w:gridCol w:w="4176"/>
+        <w:gridCol w:w="4161"/>
       </w:tblGrid>
       <w:tr>
         <w:trPr>
@@ -15139,7 +16301,7 @@
         </w:trPr>
         <w:tc>
           <w:tcPr>
-            <w:tcW w:w="620" w:type="dxa"/>
+            <w:tcW w:w="760" w:type="dxa"/>
             <w:hideMark/>
           </w:tcPr>
           <w:p>
@@ -15160,7 +16322,7 @@
         </w:tc>
         <w:tc>
           <w:tcPr>
-            <w:tcW w:w="6200" w:type="dxa"/>
+            <w:tcW w:w="4780" w:type="dxa"/>
             <w:hideMark/>
           </w:tcPr>
           <w:p>
@@ -15175,13 +16337,13 @@
                 <w:b/>
                 <w:bCs/>
               </w:rPr>
-              <w:t>Risk</w:t>
-            </w:r>
-          </w:p>
-        </w:tc>
-        <w:tc>
-          <w:tcPr>
-            <w:tcW w:w="5160" w:type="dxa"/>
+              <w:t>Success Criterion</w:t>
+            </w:r>
+          </w:p>
+        </w:tc>
+        <w:tc>
+          <w:tcPr>
+            <w:tcW w:w="4780" w:type="dxa"/>
             <w:hideMark/>
           </w:tcPr>
           <w:p>
@@ -15196,240 +16358,693 @@
                 <w:b/>
                 <w:bCs/>
               </w:rPr>
-              <w:t>Mitigation</w:t>
+              <w:t>Measurement / Evidence</w:t>
             </w:r>
           </w:p>
         </w:tc>
       </w:tr>
       <w:tr>
         <w:trPr>
-          <w:trHeight w:val="300"/>
+          <w:trHeight w:val="900"/>
         </w:trPr>
         <w:tc>
           <w:tcPr>
-            <w:tcW w:w="620" w:type="dxa"/>
-            <w:hideMark/>
-          </w:tcPr>
-          <w:p>
-            <w:r>
-              <w:t>R-001</w:t>
-            </w:r>
-          </w:p>
-        </w:tc>
-        <w:tc>
-          <w:tcPr>
-            <w:tcW w:w="6200" w:type="dxa"/>
-            <w:hideMark/>
-          </w:tcPr>
-          <w:p>
-            <w:r>
-              <w:t>Incomplete requirements identified after project commencement</w:t>
-            </w:r>
-          </w:p>
-        </w:tc>
-        <w:tc>
-          <w:tcPr>
-            <w:tcW w:w="5160" w:type="dxa"/>
-            <w:hideMark/>
-          </w:tcPr>
-          <w:p>
-            <w:r>
-              <w:t>Customer review and approval of BRD prior to design.</w:t>
+            <w:tcW w:w="760" w:type="dxa"/>
+            <w:hideMark/>
+          </w:tcPr>
+          <w:p>
+            <w:pPr>
+              <w:rPr>
+                <w:b/>
+                <w:bCs/>
+              </w:rPr>
+            </w:pPr>
+            <w:r>
+              <w:rPr>
+                <w:b/>
+                <w:bCs/>
+              </w:rPr>
+              <w:t>SC-001</w:t>
+            </w:r>
+          </w:p>
+        </w:tc>
+        <w:tc>
+          <w:tcPr>
+            <w:tcW w:w="4780" w:type="dxa"/>
+            <w:hideMark/>
+          </w:tcPr>
+          <w:p>
+            <w:r>
+              <w:t>The approved business requirements have been translated into an agreed future-state solution design.</w:t>
+            </w:r>
+          </w:p>
+        </w:tc>
+        <w:tc>
+          <w:tcPr>
+            <w:tcW w:w="4780" w:type="dxa"/>
+            <w:hideMark/>
+          </w:tcPr>
+          <w:p>
+            <w:r>
+              <w:t>Approved HLD and supporting design documentation demonstrate traceability to the approved requirements.</w:t>
             </w:r>
           </w:p>
         </w:tc>
       </w:tr>
       <w:tr>
         <w:trPr>
-          <w:trHeight w:val="300"/>
+          <w:trHeight w:val="1200"/>
         </w:trPr>
         <w:tc>
           <w:tcPr>
-            <w:tcW w:w="620" w:type="dxa"/>
-            <w:hideMark/>
-          </w:tcPr>
-          <w:p>
-            <w:r>
-              <w:t>R-002</w:t>
-            </w:r>
-          </w:p>
-        </w:tc>
-        <w:tc>
-          <w:tcPr>
-            <w:tcW w:w="6200" w:type="dxa"/>
-            <w:hideMark/>
-          </w:tcPr>
-          <w:p>
-            <w:r>
-              <w:t>Business disruption during implementation</w:t>
-            </w:r>
-          </w:p>
-        </w:tc>
-        <w:tc>
-          <w:tcPr>
-            <w:tcW w:w="5160" w:type="dxa"/>
-            <w:hideMark/>
-          </w:tcPr>
-          <w:p>
-            <w:r>
-              <w:t>Phased implementation and pre-production testing.</w:t>
+            <w:tcW w:w="760" w:type="dxa"/>
+            <w:hideMark/>
+          </w:tcPr>
+          <w:p>
+            <w:pPr>
+              <w:rPr>
+                <w:b/>
+                <w:bCs/>
+              </w:rPr>
+            </w:pPr>
+            <w:r>
+              <w:rPr>
+                <w:b/>
+                <w:bCs/>
+              </w:rPr>
+              <w:t>SC-002</w:t>
+            </w:r>
+          </w:p>
+        </w:tc>
+        <w:tc>
+          <w:tcPr>
+            <w:tcW w:w="4780" w:type="dxa"/>
+            <w:hideMark/>
+          </w:tcPr>
+          <w:p>
+            <w:r>
+              <w:t>Business-critical services remain operational throughout implementation or are restored within agreed recovery objectives where planned disruption is unavoidable.</w:t>
+            </w:r>
+          </w:p>
+        </w:tc>
+        <w:tc>
+          <w:tcPr>
+            <w:tcW w:w="4780" w:type="dxa"/>
+            <w:hideMark/>
+          </w:tcPr>
+          <w:p>
+            <w:r>
+              <w:t>Implementation records, test evidence and service acceptance records.</w:t>
             </w:r>
           </w:p>
         </w:tc>
       </w:tr>
       <w:tr>
         <w:trPr>
-          <w:trHeight w:val="300"/>
+          <w:trHeight w:val="900"/>
         </w:trPr>
         <w:tc>
           <w:tcPr>
-            <w:tcW w:w="620" w:type="dxa"/>
-            <w:hideMark/>
-          </w:tcPr>
-          <w:p>
-            <w:r>
-              <w:t>R-003</w:t>
-            </w:r>
-          </w:p>
-        </w:tc>
-        <w:tc>
-          <w:tcPr>
-            <w:tcW w:w="6200" w:type="dxa"/>
-            <w:hideMark/>
-          </w:tcPr>
-          <w:p>
-            <w:r>
-              <w:t>Insufficient stakeholder availability</w:t>
-            </w:r>
-          </w:p>
-        </w:tc>
-        <w:tc>
-          <w:tcPr>
-            <w:tcW w:w="5160" w:type="dxa"/>
-            <w:hideMark/>
-          </w:tcPr>
-          <w:p>
-            <w:r>
-              <w:t>Early scheduling of workshops and reviews.</w:t>
+            <w:tcW w:w="760" w:type="dxa"/>
+            <w:hideMark/>
+          </w:tcPr>
+          <w:p>
+            <w:pPr>
+              <w:rPr>
+                <w:b/>
+                <w:bCs/>
+              </w:rPr>
+            </w:pPr>
+            <w:r>
+              <w:rPr>
+                <w:b/>
+                <w:bCs/>
+              </w:rPr>
+              <w:t>SC-003</w:t>
+            </w:r>
+          </w:p>
+        </w:tc>
+        <w:tc>
+          <w:tcPr>
+            <w:tcW w:w="4780" w:type="dxa"/>
+            <w:hideMark/>
+          </w:tcPr>
+          <w:p>
+            <w:r>
+              <w:t>User administration and lifecycle processes are more consistent and efficient than the current state.</w:t>
+            </w:r>
+          </w:p>
+        </w:tc>
+        <w:tc>
+          <w:tcPr>
+            <w:tcW w:w="4780" w:type="dxa"/>
+            <w:hideMark/>
+          </w:tcPr>
+          <w:p>
+            <w:r>
+              <w:t>Documented joiner, mover and leaver processes, with appropriate automation implemented where agreed.</w:t>
             </w:r>
           </w:p>
         </w:tc>
       </w:tr>
       <w:tr>
         <w:trPr>
-          <w:trHeight w:val="300"/>
+          <w:trHeight w:val="1200"/>
         </w:trPr>
         <w:tc>
           <w:tcPr>
-            <w:tcW w:w="620" w:type="dxa"/>
-            <w:hideMark/>
-          </w:tcPr>
-          <w:p>
-            <w:r>
-              <w:t>R-004</w:t>
-            </w:r>
-          </w:p>
-        </w:tc>
-        <w:tc>
-          <w:tcPr>
-            <w:tcW w:w="6200" w:type="dxa"/>
-            <w:hideMark/>
-          </w:tcPr>
-          <w:p>
-            <w:r>
-              <w:t>Legacy systems introduce unforeseen technical limitations</w:t>
-            </w:r>
-          </w:p>
-        </w:tc>
-        <w:tc>
-          <w:tcPr>
-            <w:tcW w:w="5160" w:type="dxa"/>
-            <w:hideMark/>
-          </w:tcPr>
-          <w:p>
-            <w:r>
-              <w:t>Technical discovery during design phase.</w:t>
+            <w:tcW w:w="760" w:type="dxa"/>
+            <w:hideMark/>
+          </w:tcPr>
+          <w:p>
+            <w:pPr>
+              <w:rPr>
+                <w:b/>
+                <w:bCs/>
+              </w:rPr>
+            </w:pPr>
+            <w:r>
+              <w:rPr>
+                <w:b/>
+                <w:bCs/>
+              </w:rPr>
+              <w:t>SC-004</w:t>
+            </w:r>
+          </w:p>
+        </w:tc>
+        <w:tc>
+          <w:tcPr>
+            <w:tcW w:w="4780" w:type="dxa"/>
+            <w:hideMark/>
+          </w:tcPr>
+          <w:p>
+            <w:r>
+              <w:t>Business data is organised and protected according to agreed departmental and role-based access requirements.</w:t>
+            </w:r>
+          </w:p>
+        </w:tc>
+        <w:tc>
+          <w:tcPr>
+            <w:tcW w:w="4780" w:type="dxa"/>
+            <w:hideMark/>
+          </w:tcPr>
+          <w:p>
+            <w:r>
+              <w:t>Access-control testing and UAT demonstrate that authorised users can access required information and unauthorised access is prevented.</w:t>
             </w:r>
           </w:p>
         </w:tc>
       </w:tr>
       <w:tr>
         <w:trPr>
-          <w:trHeight w:val="300"/>
+          <w:trHeight w:val="1200"/>
         </w:trPr>
         <w:tc>
           <w:tcPr>
-            <w:tcW w:w="620" w:type="dxa"/>
-            <w:hideMark/>
-          </w:tcPr>
-          <w:p>
-            <w:r>
-              <w:t>R-005</w:t>
-            </w:r>
-          </w:p>
-        </w:tc>
-        <w:tc>
-          <w:tcPr>
-            <w:tcW w:w="6200" w:type="dxa"/>
-            <w:hideMark/>
-          </w:tcPr>
-          <w:p>
-            <w:r>
-              <w:t>Scope growth throughout the project</w:t>
-            </w:r>
-          </w:p>
-        </w:tc>
-        <w:tc>
-          <w:tcPr>
-            <w:tcW w:w="5160" w:type="dxa"/>
-            <w:hideMark/>
-          </w:tcPr>
-          <w:p>
-            <w:r>
-              <w:t>Formal change management and Statements of Work.</w:t>
+            <w:tcW w:w="760" w:type="dxa"/>
+            <w:hideMark/>
+          </w:tcPr>
+          <w:p>
+            <w:pPr>
+              <w:rPr>
+                <w:b/>
+                <w:bCs/>
+              </w:rPr>
+            </w:pPr>
+            <w:r>
+              <w:rPr>
+                <w:b/>
+                <w:bCs/>
+              </w:rPr>
+              <w:t>SC-005</w:t>
+            </w:r>
+          </w:p>
+        </w:tc>
+        <w:tc>
+          <w:tcPr>
+            <w:tcW w:w="4780" w:type="dxa"/>
+            <w:hideMark/>
+          </w:tcPr>
+          <w:p>
+            <w:r>
+              <w:t>Backup and recovery capabilities provide confidence that business-critical services and information can be recovered within agreed service-specific RTO/RPO objectives.</w:t>
+            </w:r>
+          </w:p>
+        </w:tc>
+        <w:tc>
+          <w:tcPr>
+            <w:tcW w:w="4780" w:type="dxa"/>
+            <w:hideMark/>
+          </w:tcPr>
+          <w:p>
+            <w:r>
+              <w:t>Successful backup validation and documented recovery test results.</w:t>
             </w:r>
           </w:p>
         </w:tc>
       </w:tr>
       <w:tr>
         <w:trPr>
-          <w:trHeight w:val="300"/>
+          <w:trHeight w:val="900"/>
         </w:trPr>
         <w:tc>
           <w:tcPr>
-            <w:tcW w:w="620" w:type="dxa"/>
-            <w:hideMark/>
-          </w:tcPr>
-          <w:p>
-            <w:r>
-              <w:t>R-006</w:t>
-            </w:r>
-          </w:p>
-        </w:tc>
-        <w:tc>
-          <w:tcPr>
-            <w:tcW w:w="6200" w:type="dxa"/>
-            <w:hideMark/>
-          </w:tcPr>
-          <w:p>
-            <w:r>
-              <w:t>Single points of failure identified within the current environment</w:t>
-            </w:r>
-          </w:p>
-        </w:tc>
-        <w:tc>
-          <w:tcPr>
-            <w:tcW w:w="5160" w:type="dxa"/>
-            <w:hideMark/>
-          </w:tcPr>
-          <w:p>
-            <w:r>
-              <w:t>Address through future design activities.</w:t>
+            <w:tcW w:w="760" w:type="dxa"/>
+            <w:hideMark/>
+          </w:tcPr>
+          <w:p>
+            <w:pPr>
+              <w:rPr>
+                <w:b/>
+                <w:bCs/>
+              </w:rPr>
+            </w:pPr>
+            <w:r>
+              <w:rPr>
+                <w:b/>
+                <w:bCs/>
+              </w:rPr>
+              <w:lastRenderedPageBreak/>
+              <w:t>SC-006</w:t>
+            </w:r>
+          </w:p>
+        </w:tc>
+        <w:tc>
+          <w:tcPr>
+            <w:tcW w:w="4780" w:type="dxa"/>
+            <w:hideMark/>
+          </w:tcPr>
+          <w:p>
+            <w:r>
+              <w:t>Northwind has improved visibility of infrastructure health, operational events, capacity and performance.</w:t>
+            </w:r>
+          </w:p>
+        </w:tc>
+        <w:tc>
+          <w:tcPr>
+            <w:tcW w:w="4780" w:type="dxa"/>
+            <w:hideMark/>
+          </w:tcPr>
+          <w:p>
+            <w:r>
+              <w:t>Monitoring, logging and reporting capabilities are operational and validated.</w:t>
+            </w:r>
+          </w:p>
+        </w:tc>
+      </w:tr>
+      <w:tr>
+        <w:trPr>
+          <w:trHeight w:val="900"/>
+        </w:trPr>
+        <w:tc>
+          <w:tcPr>
+            <w:tcW w:w="760" w:type="dxa"/>
+            <w:hideMark/>
+          </w:tcPr>
+          <w:p>
+            <w:pPr>
+              <w:rPr>
+                <w:b/>
+                <w:bCs/>
+              </w:rPr>
+            </w:pPr>
+            <w:r>
+              <w:rPr>
+                <w:b/>
+                <w:bCs/>
+              </w:rPr>
+              <w:t>SC-007</w:t>
+            </w:r>
+          </w:p>
+        </w:tc>
+        <w:tc>
+          <w:tcPr>
+            <w:tcW w:w="4780" w:type="dxa"/>
+            <w:hideMark/>
+          </w:tcPr>
+          <w:p>
+            <w:r>
+              <w:t>The solution provides an appropriate security baseline for systems, users, data and administrative access.</w:t>
+            </w:r>
+          </w:p>
+        </w:tc>
+        <w:tc>
+          <w:tcPr>
+            <w:tcW w:w="4780" w:type="dxa"/>
+            <w:hideMark/>
+          </w:tcPr>
+          <w:p>
+            <w:r>
+              <w:t>Security controls are implemented, documented and validated against agreed requirements.</w:t>
+            </w:r>
+          </w:p>
+        </w:tc>
+      </w:tr>
+      <w:tr>
+        <w:trPr>
+          <w:trHeight w:val="900"/>
+        </w:trPr>
+        <w:tc>
+          <w:tcPr>
+            <w:tcW w:w="760" w:type="dxa"/>
+            <w:hideMark/>
+          </w:tcPr>
+          <w:p>
+            <w:pPr>
+              <w:rPr>
+                <w:b/>
+                <w:bCs/>
+              </w:rPr>
+            </w:pPr>
+            <w:r>
+              <w:rPr>
+                <w:b/>
+                <w:bCs/>
+              </w:rPr>
+              <w:t>SC-008</w:t>
+            </w:r>
+          </w:p>
+        </w:tc>
+        <w:tc>
+          <w:tcPr>
+            <w:tcW w:w="4780" w:type="dxa"/>
+            <w:hideMark/>
+          </w:tcPr>
+          <w:p>
+            <w:r>
+              <w:t>Infrastructure and operational processes are sufficiently standardised to support consistent administration and troubleshooting.</w:t>
+            </w:r>
+          </w:p>
+        </w:tc>
+        <w:tc>
+          <w:tcPr>
+            <w:tcW w:w="4780" w:type="dxa"/>
+            <w:hideMark/>
+          </w:tcPr>
+          <w:p>
+            <w:r>
+              <w:t>Approved standards, SOPs, runbooks and operational procedures are available and in use.</w:t>
+            </w:r>
+          </w:p>
+        </w:tc>
+      </w:tr>
+      <w:tr>
+        <w:trPr>
+          <w:trHeight w:val="900"/>
+        </w:trPr>
+        <w:tc>
+          <w:tcPr>
+            <w:tcW w:w="760" w:type="dxa"/>
+            <w:hideMark/>
+          </w:tcPr>
+          <w:p>
+            <w:pPr>
+              <w:rPr>
+                <w:b/>
+                <w:bCs/>
+              </w:rPr>
+            </w:pPr>
+            <w:r>
+              <w:rPr>
+                <w:b/>
+                <w:bCs/>
+              </w:rPr>
+              <w:t>SC-009</w:t>
+            </w:r>
+          </w:p>
+        </w:tc>
+        <w:tc>
+          <w:tcPr>
+            <w:tcW w:w="4780" w:type="dxa"/>
+            <w:hideMark/>
+          </w:tcPr>
+          <w:p>
+            <w:r>
+              <w:t>Northwind has an accurate and maintainable IT asset inventory and defined asset ownership model.</w:t>
+            </w:r>
+          </w:p>
+        </w:tc>
+        <w:tc>
+          <w:tcPr>
+            <w:tcW w:w="4780" w:type="dxa"/>
+            <w:hideMark/>
+          </w:tcPr>
+          <w:p>
+            <w:r>
+              <w:t>Approved asset inventory and ownership model are available to authorised stakeholders.</w:t>
+            </w:r>
+          </w:p>
+        </w:tc>
+      </w:tr>
+      <w:tr>
+        <w:trPr>
+          <w:trHeight w:val="1200"/>
+        </w:trPr>
+        <w:tc>
+          <w:tcPr>
+            <w:tcW w:w="760" w:type="dxa"/>
+            <w:hideMark/>
+          </w:tcPr>
+          <w:p>
+            <w:pPr>
+              <w:rPr>
+                <w:b/>
+                <w:bCs/>
+              </w:rPr>
+            </w:pPr>
+            <w:r>
+              <w:rPr>
+                <w:b/>
+                <w:bCs/>
+              </w:rPr>
+              <w:t>SC-010</w:t>
+            </w:r>
+          </w:p>
+        </w:tc>
+        <w:tc>
+          <w:tcPr>
+            <w:tcW w:w="4780" w:type="dxa"/>
+            <w:hideMark/>
+          </w:tcPr>
+          <w:p>
+            <w:r>
+              <w:t>Software and system maintenance can be performed through a controlled process that includes appropriate testing before production deployment.</w:t>
+            </w:r>
+          </w:p>
+        </w:tc>
+        <w:tc>
+          <w:tcPr>
+            <w:tcW w:w="4780" w:type="dxa"/>
+            <w:hideMark/>
+          </w:tcPr>
+          <w:p>
+            <w:r>
+              <w:t>Documented update process and evidence of controlled testing.</w:t>
+            </w:r>
+          </w:p>
+        </w:tc>
+      </w:tr>
+      <w:tr>
+        <w:trPr>
+          <w:trHeight w:val="1200"/>
+        </w:trPr>
+        <w:tc>
+          <w:tcPr>
+            <w:tcW w:w="760" w:type="dxa"/>
+            <w:hideMark/>
+          </w:tcPr>
+          <w:p>
+            <w:pPr>
+              <w:rPr>
+                <w:b/>
+                <w:bCs/>
+              </w:rPr>
+            </w:pPr>
+            <w:r>
+              <w:rPr>
+                <w:b/>
+                <w:bCs/>
+              </w:rPr>
+              <w:t>SC-011</w:t>
+            </w:r>
+          </w:p>
+        </w:tc>
+        <w:tc>
+          <w:tcPr>
+            <w:tcW w:w="4780" w:type="dxa"/>
+            <w:hideMark/>
+          </w:tcPr>
+          <w:p>
+            <w:r>
+              <w:t>The resulting infrastructure can support Northwind's anticipated growth without disproportionate redesign or administrative effort.</w:t>
+            </w:r>
+          </w:p>
+        </w:tc>
+        <w:tc>
+          <w:tcPr>
+            <w:tcW w:w="4780" w:type="dxa"/>
+            <w:hideMark/>
+          </w:tcPr>
+          <w:p>
+            <w:r>
+              <w:t>Capacity and scalability assessment demonstrates alignment with current and anticipated requirements.</w:t>
+            </w:r>
+          </w:p>
+        </w:tc>
+      </w:tr>
+      <w:tr>
+        <w:trPr>
+          <w:trHeight w:val="1200"/>
+        </w:trPr>
+        <w:tc>
+          <w:tcPr>
+            <w:tcW w:w="760" w:type="dxa"/>
+            <w:hideMark/>
+          </w:tcPr>
+          <w:p>
+            <w:pPr>
+              <w:rPr>
+                <w:b/>
+                <w:bCs/>
+              </w:rPr>
+            </w:pPr>
+            <w:r>
+              <w:rPr>
+                <w:b/>
+                <w:bCs/>
+              </w:rPr>
+              <w:t>SC-012</w:t>
+            </w:r>
+          </w:p>
+        </w:tc>
+        <w:tc>
+          <w:tcPr>
+            <w:tcW w:w="4780" w:type="dxa"/>
+            <w:hideMark/>
+          </w:tcPr>
+          <w:p>
+            <w:r>
+              <w:t>Northwind personnel have sufficient knowledge and documentation to operate, maintain, troubleshoot and recover the resulting environment.</w:t>
+            </w:r>
+          </w:p>
+        </w:tc>
+        <w:tc>
+          <w:tcPr>
+            <w:tcW w:w="4780" w:type="dxa"/>
+            <w:hideMark/>
+          </w:tcPr>
+          <w:p>
+            <w:r>
+              <w:t>Completed knowledge-transfer activities, SOPs, runbooks, recovery procedures and operational handover records.</w:t>
+            </w:r>
+          </w:p>
+        </w:tc>
+      </w:tr>
+      <w:tr>
+        <w:trPr>
+          <w:trHeight w:val="900"/>
+        </w:trPr>
+        <w:tc>
+          <w:tcPr>
+            <w:tcW w:w="760" w:type="dxa"/>
+            <w:hideMark/>
+          </w:tcPr>
+          <w:p>
+            <w:pPr>
+              <w:rPr>
+                <w:b/>
+                <w:bCs/>
+              </w:rPr>
+            </w:pPr>
+            <w:r>
+              <w:rPr>
+                <w:b/>
+                <w:bCs/>
+              </w:rPr>
+              <w:t>SC-013</w:t>
+            </w:r>
+          </w:p>
+        </w:tc>
+        <w:tc>
+          <w:tcPr>
+            <w:tcW w:w="4780" w:type="dxa"/>
+            <w:hideMark/>
+          </w:tcPr>
+          <w:p>
+            <w:r>
+              <w:t>The delivered solution satisfies the approved functional and non-functional requirements.</w:t>
+            </w:r>
+          </w:p>
+        </w:tc>
+        <w:tc>
+          <w:tcPr>
+            <w:tcW w:w="4780" w:type="dxa"/>
+            <w:hideMark/>
+          </w:tcPr>
+          <w:p>
+            <w:r>
+              <w:t>Requirements Traceability Matrix demonstrates requirement coverage and associated test or acceptance evidence.</w:t>
+            </w:r>
+          </w:p>
+        </w:tc>
+      </w:tr>
+      <w:tr>
+        <w:trPr>
+          <w:trHeight w:val="900"/>
+        </w:trPr>
+        <w:tc>
+          <w:tcPr>
+            <w:tcW w:w="760" w:type="dxa"/>
+            <w:hideMark/>
+          </w:tcPr>
+          <w:p>
+            <w:pPr>
+              <w:rPr>
+                <w:b/>
+                <w:bCs/>
+              </w:rPr>
+            </w:pPr>
+            <w:r>
+              <w:rPr>
+                <w:b/>
+                <w:bCs/>
+              </w:rPr>
+              <w:t>SC-014</w:t>
+            </w:r>
+          </w:p>
+        </w:tc>
+        <w:tc>
+          <w:tcPr>
+            <w:tcW w:w="4780" w:type="dxa"/>
+            <w:hideMark/>
+          </w:tcPr>
+          <w:p>
+            <w:r>
+              <w:t>Northwind formally accepts the delivered capabilities and transitions them into operational ownership.</w:t>
+            </w:r>
+          </w:p>
+        </w:tc>
+        <w:tc>
+          <w:tcPr>
+            <w:tcW w:w="4780" w:type="dxa"/>
+            <w:hideMark/>
+          </w:tcPr>
+          <w:p>
+            <w:r>
+              <w:t>Documented acceptance and operational handover approval.</w:t>
             </w:r>
           </w:p>
         </w:tc>
       </w:tr>
     </w:tbl>
+    <w:p/>
+    <w:p/>
+    <w:p/>
+    <w:p/>
+    <w:p/>
+    <w:p/>
+    <w:p/>
+    <w:p/>
     <w:p/>
     <w:p>
       <w:pPr>
@@ -15439,141 +17054,53 @@
           <w:numId w:val="14"/>
         </w:numPr>
       </w:pPr>
-      <w:bookmarkStart w:id="27" w:name="_Toc236778382"/>
-      <w:r>
-        <w:t>Success Criteria</w:t>
-      </w:r>
-      <w:bookmarkEnd w:id="27"/>
-    </w:p>
-    <w:p>
-      <w:pPr>
-        <w:pStyle w:val="ListParagraph"/>
-        <w:numPr>
-          <w:ilvl w:val="0"/>
-          <w:numId w:val="4"/>
-        </w:numPr>
-      </w:pPr>
-      <w:r>
-        <w:t>The Business Requirements Document is formally approved.</w:t>
-      </w:r>
-    </w:p>
-    <w:p>
-      <w:pPr>
-        <w:pStyle w:val="ListParagraph"/>
-        <w:numPr>
-          <w:ilvl w:val="0"/>
-          <w:numId w:val="4"/>
-        </w:numPr>
-      </w:pPr>
-      <w:r>
-        <w:t>All agreed business requirements are successfully implemented.</w:t>
-      </w:r>
-    </w:p>
-    <w:p>
-      <w:pPr>
-        <w:pStyle w:val="ListParagraph"/>
-        <w:numPr>
-          <w:ilvl w:val="0"/>
-          <w:numId w:val="4"/>
-        </w:numPr>
-      </w:pPr>
-      <w:r>
-        <w:t>Existing business functionality is maintained throughout the project.</w:t>
-      </w:r>
-    </w:p>
-    <w:p>
-      <w:pPr>
-        <w:pStyle w:val="ListParagraph"/>
-        <w:numPr>
-          <w:ilvl w:val="0"/>
-          <w:numId w:val="4"/>
-        </w:numPr>
-      </w:pPr>
-      <w:r>
-        <w:t>Core infrastructure supports projected business growth.</w:t>
-      </w:r>
-    </w:p>
-    <w:p>
-      <w:pPr>
-        <w:pStyle w:val="ListParagraph"/>
-        <w:numPr>
-          <w:ilvl w:val="0"/>
-          <w:numId w:val="4"/>
-        </w:numPr>
-      </w:pPr>
-      <w:r>
-        <w:t>Securi</w:t>
-      </w:r>
-      <w:r>
-        <w:t>t</w:t>
-      </w:r>
-      <w:r>
-        <w:t>y and resilience are demonstrably improved.</w:t>
-      </w:r>
-    </w:p>
-    <w:p>
-      <w:pPr>
-        <w:pStyle w:val="ListParagraph"/>
-        <w:numPr>
-          <w:ilvl w:val="0"/>
-          <w:numId w:val="4"/>
-        </w:numPr>
-      </w:pPr>
-      <w:r>
-        <w:t>Requi</w:t>
-      </w:r>
-      <w:r>
-        <w:t>re</w:t>
-      </w:r>
-      <w:r>
-        <w:t>d documentation is completed and accepted.</w:t>
-      </w:r>
-    </w:p>
-    <w:p>
-      <w:pPr>
-        <w:pStyle w:val="ListParagraph"/>
-        <w:numPr>
-          <w:ilvl w:val="0"/>
-          <w:numId w:val="4"/>
-        </w:numPr>
-      </w:pPr>
-      <w:r>
-        <w:t>Customer acceptance testing is successfully completed.</w:t>
-      </w:r>
-    </w:p>
-    <w:p>
-      <w:pPr>
-        <w:pStyle w:val="ListParagraph"/>
-        <w:numPr>
-          <w:ilvl w:val="0"/>
-          <w:numId w:val="4"/>
-        </w:numPr>
-      </w:pPr>
-      <w:r>
-        <w:t>Operational handover is completed and accepted by Northwind.</w:t>
-      </w:r>
-    </w:p>
-    <w:p>
-      <w:pPr>
-        <w:pStyle w:val="ListParagraph"/>
-        <w:numPr>
-          <w:ilvl w:val="0"/>
-          <w:numId w:val="4"/>
-        </w:numPr>
-      </w:pPr>
-      <w:r>
-        <w:t>Project objectives are achieved within agreed scope and Statements of Work.</w:t>
-      </w:r>
-    </w:p>
-    <w:p>
-      <w:pPr>
-        <w:pStyle w:val="Heading2"/>
-      </w:pPr>
       <w:bookmarkStart w:id="28" w:name="_Toc236778383"/>
       <w:r>
-        <w:t>14. Approval</w:t>
+        <w:lastRenderedPageBreak/>
+        <w:t>Approval</w:t>
       </w:r>
       <w:bookmarkEnd w:id="28"/>
+    </w:p>
+    <w:p>
+      <w:r>
+        <w:t>This Business Requirements Document represents the agreed business requirements and scope for the Northwind Outdoor Ltd. infrastructure modernisation project.</w:t>
+      </w:r>
+    </w:p>
+    <w:p>
+      <w:r>
+        <w:t>Approval of this document confirms that Northwind Outdoor Ltd. has reviewed and accepted the documented</w:t>
+      </w:r>
+      <w:r>
+        <w:t>.</w:t>
+      </w:r>
+    </w:p>
+    <w:p>
+      <w:r>
+        <w:t xml:space="preserve">Following approval, the BRD will become the </w:t>
+      </w:r>
+      <w:r>
+        <w:rPr>
+          <w:b/>
+          <w:bCs/>
+        </w:rPr>
+        <w:t>baseline for the subsequent design phase</w:t>
+      </w:r>
+      <w:r>
+        <w:t>.</w:t>
+      </w:r>
+    </w:p>
+    <w:p>
+      <w:r>
+        <w:t>Any changes to the approved requirements or scope will be managed through the project's agreed change-control process.</w:t>
+      </w:r>
+    </w:p>
+    <w:p>
+      <w:pPr>
+        <w:pStyle w:val="Heading3"/>
+      </w:pPr>
+      <w:r>
+        <w:t>Approval Sign-Off</w:t>
+      </w:r>
     </w:p>
     <w:tbl>
       <w:tblPr>
@@ -15865,6 +17392,73 @@
     <w:p/>
     <w:p>
       <w:pPr>
+        <w:pStyle w:val="Heading3"/>
+      </w:pPr>
+      <w:r>
+        <w:t>B</w:t>
+      </w:r>
+      <w:r>
+        <w:t>aseline</w:t>
+      </w:r>
+    </w:p>
+    <w:p>
+      <w:r>
+        <w:rPr>
+          <w:b/>
+          <w:bCs/>
+        </w:rPr>
+        <w:t>Document:</w:t>
+      </w:r>
+      <w:r>
+        <w:t xml:space="preserve"> Northwind Outdoor Ltd. – Business Requirements Document</w:t>
+      </w:r>
+      <w:r>
+        <w:br/>
+      </w:r>
+      <w:r>
+        <w:rPr>
+          <w:b/>
+          <w:bCs/>
+        </w:rPr>
+        <w:t>Version:</w:t>
+      </w:r>
+      <w:r>
+        <w:t xml:space="preserve"> 1.0</w:t>
+      </w:r>
+      <w:r>
+        <w:br/>
+      </w:r>
+      <w:r>
+        <w:rPr>
+          <w:b/>
+          <w:bCs/>
+        </w:rPr>
+        <w:t>Status:</w:t>
+      </w:r>
+      <w:r>
+        <w:t xml:space="preserve"> Pending Approval</w:t>
+      </w:r>
+      <w:r>
+        <w:br/>
+      </w:r>
+      <w:r>
+        <w:rPr>
+          <w:b/>
+          <w:bCs/>
+        </w:rPr>
+        <w:t>Baseline Date:</w:t>
+      </w:r>
+      <w:r>
+        <w:t xml:space="preserve"> Upon formal approval</w:t>
+      </w:r>
+    </w:p>
+    <w:p>
+      <w:r>
+        <w:t>Once approved, the BRD v1.0 will provide the baseline against which the High-Level Design, subsequent Statements of Work, implementation activities, testing, acceptance and future change requests will be assessed.</w:t>
+      </w:r>
+    </w:p>
+    <w:p>
+      <w:pPr>
         <w:pStyle w:val="Heading2"/>
       </w:pPr>
       <w:bookmarkStart w:id="29" w:name="_Toc236778384"/>
@@ -15878,65 +17472,38 @@
     </w:p>
     <w:tbl>
       <w:tblPr>
+        <w:tblStyle w:val="TableGrid"/>
         <w:tblW w:w="0" w:type="auto"/>
-        <w:tblCellSpacing w:w="15" w:type="dxa"/>
-        <w:tblCellMar>
-          <w:top w:w="15" w:type="dxa"/>
-          <w:left w:w="15" w:type="dxa"/>
-          <w:bottom w:w="15" w:type="dxa"/>
-          <w:right w:w="15" w:type="dxa"/>
-        </w:tblCellMar>
         <w:tblLook w:val="04A0" w:firstRow="1" w:lastRow="0" w:firstColumn="1" w:lastColumn="0" w:noHBand="0" w:noVBand="1"/>
       </w:tblPr>
       <w:tblGrid>
-        <w:gridCol w:w="965"/>
-        <w:gridCol w:w="4850"/>
+        <w:gridCol w:w="1106"/>
+        <w:gridCol w:w="5268"/>
       </w:tblGrid>
       <w:tr>
         <w:trPr>
-          <w:tblHeader/>
-          <w:tblCellSpacing w:w="15" w:type="dxa"/>
+          <w:trHeight w:val="300"/>
         </w:trPr>
         <w:tc>
           <w:tcPr>
-            <w:tcW w:w="0" w:type="auto"/>
-            <w:vAlign w:val="center"/>
-            <w:hideMark/>
-          </w:tcPr>
-          <w:p>
-            <w:pPr>
-              <w:rPr>
-                <w:b/>
-                <w:bCs/>
-              </w:rPr>
-            </w:pPr>
-            <w:r>
-              <w:rPr>
-                <w:b/>
-                <w:bCs/>
-              </w:rPr>
+            <w:tcW w:w="1106" w:type="dxa"/>
+            <w:noWrap/>
+            <w:hideMark/>
+          </w:tcPr>
+          <w:p>
+            <w:r>
               <w:t>Term</w:t>
             </w:r>
           </w:p>
         </w:tc>
         <w:tc>
           <w:tcPr>
-            <w:tcW w:w="0" w:type="auto"/>
-            <w:vAlign w:val="center"/>
-            <w:hideMark/>
-          </w:tcPr>
-          <w:p>
-            <w:pPr>
-              <w:rPr>
-                <w:b/>
-                <w:bCs/>
-              </w:rPr>
-            </w:pPr>
-            <w:r>
-              <w:rPr>
-                <w:b/>
-                <w:bCs/>
-              </w:rPr>
+            <w:tcW w:w="5268" w:type="dxa"/>
+            <w:noWrap/>
+            <w:hideMark/>
+          </w:tcPr>
+          <w:p>
+            <w:r>
               <w:t>Definition</w:t>
             </w:r>
           </w:p>
@@ -15944,12 +17511,12 @@
       </w:tr>
       <w:tr>
         <w:trPr>
-          <w:tblCellSpacing w:w="15" w:type="dxa"/>
+          <w:trHeight w:val="300"/>
         </w:trPr>
         <w:tc>
           <w:tcPr>
-            <w:tcW w:w="0" w:type="auto"/>
-            <w:vAlign w:val="center"/>
+            <w:tcW w:w="1106" w:type="dxa"/>
+            <w:noWrap/>
             <w:hideMark/>
           </w:tcPr>
           <w:p>
@@ -15960,8 +17527,8 @@
         </w:tc>
         <w:tc>
           <w:tcPr>
-            <w:tcW w:w="0" w:type="auto"/>
-            <w:vAlign w:val="center"/>
+            <w:tcW w:w="5268" w:type="dxa"/>
+            <w:noWrap/>
             <w:hideMark/>
           </w:tcPr>
           <w:p>
@@ -15973,12 +17540,12 @@
       </w:tr>
       <w:tr>
         <w:trPr>
-          <w:tblCellSpacing w:w="15" w:type="dxa"/>
+          <w:trHeight w:val="300"/>
         </w:trPr>
         <w:tc>
           <w:tcPr>
-            <w:tcW w:w="0" w:type="auto"/>
-            <w:vAlign w:val="center"/>
+            <w:tcW w:w="1106" w:type="dxa"/>
+            <w:noWrap/>
             <w:hideMark/>
           </w:tcPr>
           <w:p>
@@ -15989,8 +17556,8 @@
         </w:tc>
         <w:tc>
           <w:tcPr>
-            <w:tcW w:w="0" w:type="auto"/>
-            <w:vAlign w:val="center"/>
+            <w:tcW w:w="5268" w:type="dxa"/>
+            <w:noWrap/>
             <w:hideMark/>
           </w:tcPr>
           <w:p>
@@ -16002,12 +17569,12 @@
       </w:tr>
       <w:tr>
         <w:trPr>
-          <w:tblCellSpacing w:w="15" w:type="dxa"/>
+          <w:trHeight w:val="300"/>
         </w:trPr>
         <w:tc>
           <w:tcPr>
-            <w:tcW w:w="0" w:type="auto"/>
-            <w:vAlign w:val="center"/>
+            <w:tcW w:w="1106" w:type="dxa"/>
+            <w:noWrap/>
             <w:hideMark/>
           </w:tcPr>
           <w:p>
@@ -16018,8 +17585,8 @@
         </w:tc>
         <w:tc>
           <w:tcPr>
-            <w:tcW w:w="0" w:type="auto"/>
-            <w:vAlign w:val="center"/>
+            <w:tcW w:w="5268" w:type="dxa"/>
+            <w:noWrap/>
             <w:hideMark/>
           </w:tcPr>
           <w:p>
@@ -16031,12 +17598,12 @@
       </w:tr>
       <w:tr>
         <w:trPr>
-          <w:tblCellSpacing w:w="15" w:type="dxa"/>
+          <w:trHeight w:val="300"/>
         </w:trPr>
         <w:tc>
           <w:tcPr>
-            <w:tcW w:w="0" w:type="auto"/>
-            <w:vAlign w:val="center"/>
+            <w:tcW w:w="1106" w:type="dxa"/>
+            <w:noWrap/>
             <w:hideMark/>
           </w:tcPr>
           <w:p>
@@ -16047,8 +17614,8 @@
         </w:tc>
         <w:tc>
           <w:tcPr>
-            <w:tcW w:w="0" w:type="auto"/>
-            <w:vAlign w:val="center"/>
+            <w:tcW w:w="5268" w:type="dxa"/>
+            <w:noWrap/>
             <w:hideMark/>
           </w:tcPr>
           <w:p>
@@ -16060,25 +17627,24 @@
       </w:tr>
       <w:tr>
         <w:trPr>
-          <w:tblCellSpacing w:w="15" w:type="dxa"/>
+          <w:trHeight w:val="300"/>
         </w:trPr>
         <w:tc>
           <w:tcPr>
-            <w:tcW w:w="0" w:type="auto"/>
-            <w:vAlign w:val="center"/>
-            <w:hideMark/>
-          </w:tcPr>
-          <w:p>
-            <w:r>
-              <w:lastRenderedPageBreak/>
+            <w:tcW w:w="1106" w:type="dxa"/>
+            <w:noWrap/>
+            <w:hideMark/>
+          </w:tcPr>
+          <w:p>
+            <w:r>
               <w:t>SoW</w:t>
             </w:r>
           </w:p>
         </w:tc>
         <w:tc>
           <w:tcPr>
-            <w:tcW w:w="0" w:type="auto"/>
-            <w:vAlign w:val="center"/>
+            <w:tcW w:w="5268" w:type="dxa"/>
+            <w:noWrap/>
             <w:hideMark/>
           </w:tcPr>
           <w:p>
@@ -16090,12 +17656,12 @@
       </w:tr>
       <w:tr>
         <w:trPr>
-          <w:tblCellSpacing w:w="15" w:type="dxa"/>
+          <w:trHeight w:val="300"/>
         </w:trPr>
         <w:tc>
           <w:tcPr>
-            <w:tcW w:w="0" w:type="auto"/>
-            <w:vAlign w:val="center"/>
+            <w:tcW w:w="1106" w:type="dxa"/>
+            <w:noWrap/>
             <w:hideMark/>
           </w:tcPr>
           <w:p>
@@ -16106,8 +17672,8 @@
         </w:tc>
         <w:tc>
           <w:tcPr>
-            <w:tcW w:w="0" w:type="auto"/>
-            <w:vAlign w:val="center"/>
+            <w:tcW w:w="5268" w:type="dxa"/>
+            <w:noWrap/>
             <w:hideMark/>
           </w:tcPr>
           <w:p>
@@ -16119,12 +17685,12 @@
       </w:tr>
       <w:tr>
         <w:trPr>
-          <w:tblCellSpacing w:w="15" w:type="dxa"/>
+          <w:trHeight w:val="300"/>
         </w:trPr>
         <w:tc>
           <w:tcPr>
-            <w:tcW w:w="0" w:type="auto"/>
-            <w:vAlign w:val="center"/>
+            <w:tcW w:w="1106" w:type="dxa"/>
+            <w:noWrap/>
             <w:hideMark/>
           </w:tcPr>
           <w:p>
@@ -16135,8 +17701,8 @@
         </w:tc>
         <w:tc>
           <w:tcPr>
-            <w:tcW w:w="0" w:type="auto"/>
-            <w:vAlign w:val="center"/>
+            <w:tcW w:w="5268" w:type="dxa"/>
+            <w:noWrap/>
             <w:hideMark/>
           </w:tcPr>
           <w:p>
@@ -16148,12 +17714,12 @@
       </w:tr>
       <w:tr>
         <w:trPr>
-          <w:tblCellSpacing w:w="15" w:type="dxa"/>
+          <w:trHeight w:val="300"/>
         </w:trPr>
         <w:tc>
           <w:tcPr>
-            <w:tcW w:w="0" w:type="auto"/>
-            <w:vAlign w:val="center"/>
+            <w:tcW w:w="1106" w:type="dxa"/>
+            <w:noWrap/>
             <w:hideMark/>
           </w:tcPr>
           <w:p>
@@ -16164,8 +17730,8 @@
         </w:tc>
         <w:tc>
           <w:tcPr>
-            <w:tcW w:w="0" w:type="auto"/>
-            <w:vAlign w:val="center"/>
+            <w:tcW w:w="5268" w:type="dxa"/>
+            <w:noWrap/>
             <w:hideMark/>
           </w:tcPr>
           <w:p>
@@ -16177,12 +17743,12 @@
       </w:tr>
       <w:tr>
         <w:trPr>
-          <w:tblCellSpacing w:w="15" w:type="dxa"/>
+          <w:trHeight w:val="300"/>
         </w:trPr>
         <w:tc>
           <w:tcPr>
-            <w:tcW w:w="0" w:type="auto"/>
-            <w:vAlign w:val="center"/>
+            <w:tcW w:w="1106" w:type="dxa"/>
+            <w:noWrap/>
             <w:hideMark/>
           </w:tcPr>
           <w:p>
@@ -16195,8 +17761,8 @@
         </w:tc>
         <w:tc>
           <w:tcPr>
-            <w:tcW w:w="0" w:type="auto"/>
-            <w:vAlign w:val="center"/>
+            <w:tcW w:w="5268" w:type="dxa"/>
+            <w:noWrap/>
             <w:hideMark/>
           </w:tcPr>
           <w:p>
@@ -16208,12 +17774,14 @@
       </w:tr>
     </w:tbl>
     <w:p/>
+    <w:p/>
     <w:p>
       <w:pPr>
         <w:pStyle w:val="Heading2"/>
       </w:pPr>
       <w:bookmarkStart w:id="30" w:name="_Toc236778385"/>
       <w:r>
+        <w:lastRenderedPageBreak/>
         <w:t xml:space="preserve">Appendix 2 - </w:t>
       </w:r>
       <w:r>
@@ -19092,7 +20660,7 @@
       <w:lvlText w:val="%1."/>
       <w:lvlJc w:val="left"/>
       <w:pPr>
-        <w:ind w:left="720" w:hanging="360"/>
+        <w:ind w:left="360" w:hanging="360"/>
       </w:pPr>
       <w:rPr>
         <w:rFonts w:hint="default"/>

</xml_diff>